<commit_message>
Apply Fable's remaining Hogan locks: Chan 2013 as [22], Model 3 daily-mean primary.
Cite rainfall to Chan, Goggins et al. 2013 rather than Goggins and Chan 2017.
Keep Model 3 as day-of-year daily-mean counts, with max/min as sensitivities.
Add the paste-only cover line Hogan asked for on the Word/PDF review file.

Co-authored-by: Shen Ruililin <bobshenruililin@users.noreply.github.com>
</commit_message>
<xml_diff>
--- a/manuscript/live_collaborative/Heat_CVD_Manuscript_20260824_hogan.docx
+++ b/manuscript/live_collaborative/Heat_CVD_Manuscript_20260824_hogan.docx
@@ -2,6 +2,23 @@
 <file path=word/document.xml><?xml version="1.0" encoding="utf-8"?>
 <w:document xmlns:wpc="http://schemas.microsoft.com/office/word/2010/wordprocessingCanvas" xmlns:mo="http://schemas.microsoft.com/office/mac/office/2008/main" xmlns:mc="http://schemas.openxmlformats.org/markup-compatibility/2006" xmlns:mv="urn:schemas-microsoft-com:mac:vml" xmlns:o="urn:schemas-microsoft-com:office:office" xmlns:r="http://schemas.openxmlformats.org/officeDocument/2006/relationships" xmlns:m="http://schemas.openxmlformats.org/officeDocument/2006/math" xmlns:v="urn:schemas-microsoft-com:vml" xmlns:wp14="http://schemas.microsoft.com/office/word/2010/wordprocessingDrawing" xmlns:wp="http://schemas.openxmlformats.org/drawingml/2006/wordprocessingDrawing" xmlns:w10="urn:schemas-microsoft-com:office:word" xmlns:w="http://schemas.openxmlformats.org/wordprocessingml/2006/main" xmlns:w14="http://schemas.microsoft.com/office/word/2010/wordml" xmlns:wpg="http://schemas.microsoft.com/office/word/2010/wordprocessingGroup" xmlns:wpi="http://schemas.microsoft.com/office/word/2010/wordprocessingInk" xmlns:wne="http://schemas.microsoft.com/office/word/2006/wordml" xmlns:wps="http://schemas.microsoft.com/office/word/2010/wordprocessingShape" mc:Ignorable="w14 wp14">
   <w:body>
+    <w:p>
+      <w:pPr>
+        <w:spacing w:after="200" w:before="0" w:line="240" w:lineRule="auto"/>
+        <w:ind w:firstLine="0"/>
+        <w:jc w:val="left"/>
+      </w:pPr>
+      <w:r>
+        <w:rPr>
+          <w:rFonts w:ascii="Times New Roman" w:hAnsi="Times New Roman" w:eastAsia="Times New Roman"/>
+          <w:b w:val="0"/>
+          <w:i/>
+          <w:color w:val="663300"/>
+          <w:sz w:val="20"/>
+        </w:rPr>
+        <w:t>Paste into the shared live document; do not circulate this file as a separate version.</w:t>
+      </w:r>
+    </w:p>
     <w:p>
       <w:pPr>
         <w:spacing w:after="120" w:before="0" w:line="240" w:lineRule="auto"/>
@@ -234,7 +251,7 @@
           <w:i w:val="0"/>
           <w:sz w:val="24"/>
         </w:rPr>
-        <w:t>We analysed 132 territory-months (2013–2023) of monthly counts of first hospitalisation after a first diagnosis of coronary heart disease (CHD; 156,156 events) or heart failure (HF; 29,681 events) among people with type 2 diabetes and/or hypertension. Admission cause was not recorded. Model 1 is a separate negative-binomial model for each of three continuous temperature measures and the official counts of hot nights, very hot days, and cold days, with calendar-month indicators, a 4-df time spline, and an offset for the number of days in the month. Model 2 adds monthly total rainfall and mean relative humidity. Model 3 replaces official extreme-day counts with days warmer or cooler than the historical same-calendar-day mean. Intervals used model-based, HC1, and Newey–West lag-3 and lag-6 constructions. Benjamini–Hochberg q-values covered the twelve Model 1 fits. Table 2 reports Model 1.</w:t>
+        <w:t>We analysed 132 territory-months (2013–2023) of monthly counts of first hospitalisation after a first diagnosis of coronary heart disease (CHD; 156,156 events) or heart failure (HF; 29,681 events) among people with type 2 diabetes and/or hypertension. Admission cause was not recorded. Each temperature measure entered a separate negative-binomial model (Model 1), with calendar-month indicators, a 4-df time spline, and an offset for the number of days in the month. Model 2 added relative humidity and rainfall. Model 3 used counts of days warmer or cooler than the day-of-year historical average. Reported estimates are from Model 1. Intervals used model-based, HC1, and Newey–West lag-3 and lag-6 constructions. Benjamini–Hochberg q-values covered the twelve Model 1 fits.</w:t>
       </w:r>
       <w:commentRangeEnd w:id="1"/>
       <w:r>
@@ -1022,7 +1039,7 @@
           <w:i w:val="0"/>
           <w:sz w:val="24"/>
         </w:rPr>
-        <w:t>Model 2 adds monthly total rainfall and monthly mean relative humidity to Model 1. Goggins and Chan included humidity among meteorological predictors of daily heart-failure admissions in Hong Kong [21]. Rainfall is entered because it is in the monthly weather list.</w:t>
+        <w:t>Model 2 additionally included monthly mean relative humidity [21] and monthly total rainfall [22], both previously used as meteorological predictors of hospital admissions in Hong Kong. Humidity was associated with daily heart-failure admissions [21]. Chan et al. entered daily rainfall on the hypothesis that heavy rain deters hospital attendance [22].</w:t>
       </w:r>
     </w:p>
     <w:p>
@@ -1038,7 +1055,7 @@
           <w:i w:val="0"/>
           <w:sz w:val="24"/>
         </w:rPr>
-        <w:t>Model 3 uses the same structure as Model 1, but replaces official hot-night, very-hot-day, and cold-day counts with monthly counts of days warmer or cooler than the historical average for that same calendar date. For each month-day (for example 15 January), the historical average of daily mean, maximum, and minimum temperature was the leave-one-year-out mean of that month-day across Hong Kong Observatory daily records for 2012–2023. Each day in 2013–2023 was then classified as above or below that average. Equal values were counted as neither. Those six monthly counts were computed for each calendar month. Model 3 is specified and is not reported in Table 2.</w:t>
+        <w:t>Model 3 counted, for each month, the days whose daily mean temperature was above or below the historical average for that day of the year. For each month-day (for example 15 January), that historical average was the leave-one-year-out mean of daily mean temperature across Hong Kong Observatory daily records for 2012–2023. Equal values were counted as neither. The same counts based on daily maximum and minimum temperature were examined in sensitivity analyses. Model 3 is specified and is not reported in Table 2.</w:t>
       </w:r>
     </w:p>
     <w:p>
@@ -1144,7 +1161,7 @@
           <w:i w:val="0"/>
           <w:sz w:val="24"/>
         </w:rPr>
-        <w:t>. Those are the same coefficient on a different scale, not a new model.</w:t>
+        <w:t>. Those are the same coefficient on a different scale, not a new model. The maximum- and minimum-temperature versions of the Model 3 day counts are sensitivities; they do not replace the daily-mean counts in Model 3.</w:t>
       </w:r>
     </w:p>
     <w:p>
@@ -4260,7 +4277,7 @@
           <w:i w:val="0"/>
           <w:sz w:val="24"/>
         </w:rPr>
-        <w:t>Admission cause was not recorded, so an event is a first hospitalisation after a first diagnosis and not a cardiac-caused admission. Monthly counts of people still at risk of a first event were unavailable, so the estimates are count ratios rather than incidence-rate ratios [14]. The design is ecological and monthly, so individual-level and daily-triggering interpretations are not identified [14]. Age, sex, and disease-subtype strata were not delivered. Residual serial correlation remains material for CHD, with lag-1 Pearson autocorrelation of 0.508 in the hot-night model. Official cold days are concentrated in December–February, and only 29 of 132 months carry any official cold day, so the HF cold-day estimate rests on differences between winters. The CHD hot-night estimate is not stable across analysis windows, and is compatible with 1 before 2020. Official hot-night counts are not hourly nighttime excess heat [17]. All exposures were measured at a single Observatory station and applied territory-wide. Influenza is missing for January–October 2013. Confounding by pollution, humidity, rainfall, and influenza is unresolved in Model 1. A stroke series was not available, and no stroke result is reported.</w:t>
+        <w:t>Admission cause was not recorded, so an event is a first hospitalisation after a first diagnosis and not a cardiac-caused admission. Monthly counts of people still at risk of a first event were unavailable, so the estimates are count ratios rather than incidence-rate ratios [14]. The design is ecological and monthly, so individual-level and daily-triggering interpretations are not identified [14]. Age, sex, and disease-subtype strata were not delivered. Residual serial correlation remains material for CHD, with lag-1 Pearson autocorrelation of 0.508 in the hot-night model. Official cold days are concentrated in December–February, and only 29 of 132 months carry any official cold day, so the HF cold-day estimate rests on differences between winters. The CHD hot-night estimate is not stable across analysis windows, and is compatible with 1 before 2020. Official hot-night counts are not hourly nighttime excess heat [17]. All exposures were measured at a single Observatory station and applied territory-wide. Influenza is missing for January–October 2013. Confounding by pollution, humidity, rainfall, and influenza is unresolved in Model 1. A corresponding stroke series was not available for this analysis.</w:t>
       </w:r>
     </w:p>
     <w:p>
@@ -4743,6 +4760,22 @@
         <w:t>21. Goggins WB, Chan EYY. A study of the short-term associations between hospital admissions and mortality from heart failure and meteorological variables in Hong Kong. Int J Cardiol. 2017;228:537-542. doi:10.1016/j.ijcard.2016.11.106</w:t>
       </w:r>
     </w:p>
+    <w:p>
+      <w:pPr>
+        <w:spacing w:after="80" w:before="0" w:line="240" w:lineRule="auto"/>
+        <w:ind w:left="425" w:hanging="425"/>
+        <w:jc w:val="left"/>
+      </w:pPr>
+      <w:r>
+        <w:rPr>
+          <w:rFonts w:ascii="Times New Roman" w:hAnsi="Times New Roman" w:eastAsia="Times New Roman"/>
+          <w:b w:val="0"/>
+          <w:i w:val="0"/>
+          <w:sz w:val="22"/>
+        </w:rPr>
+        <w:t>22. Chan EYY, Goggins WB, Yue JSK, Lee P. Hospital admissions as a function of temperature, other weather phenomena and pollution levels in an urban setting in China. Bull World Health Organ. 2013;91(8):576-584. doi:10.2471/BLT.12.113035</w:t>
+      </w:r>
+    </w:p>
     <w:sectPr>
       <w:headerReference w:type="default" r:id="rId9"/>
       <w:pgSz w:w="12240" w:h="15840"/>
@@ -4756,7 +4789,7 @@
 
 <file path=word/comments.xml><?xml version="1.0" encoding="utf-8"?>
 <w:comments xmlns:a="http://schemas.openxmlformats.org/drawingml/2006/main" xmlns:pic="http://schemas.openxmlformats.org/drawingml/2006/picture" xmlns:r="http://schemas.openxmlformats.org/officeDocument/2006/relationships" xmlns:w="http://schemas.openxmlformats.org/wordprocessingml/2006/main" xmlns:wp="http://schemas.openxmlformats.org/drawingml/2006/wordprocessingDrawing" xmlns:mc="http://schemas.openxmlformats.org/markup-compatibility/2006" xmlns:a14="http://schemas.microsoft.com/office/drawing/2010/main" xmlns:w14="http://schemas.microsoft.com/office/word/2010/wordml" xmlns:wpc="http://schemas.microsoft.com/office/word/2010/wordprocessingCanvas">
-  <w:comment w:id="0" w:author="Bob Shen" w:initials="BS" w:date="2026-08-24T16:04:27Z">
+  <w:comment w:id="0" w:author="Bob Shen" w:initials="BS" w:date="2026-08-24T16:09:12Z">
     <w:p>
       <w:pPr>
         <w:pStyle w:val="CommentText"/>
@@ -4772,7 +4805,7 @@
       </w:r>
     </w:p>
   </w:comment>
-  <w:comment w:id="1" w:author="Bob Shen" w:initials="BS" w:date="2026-08-24T16:04:27Z">
+  <w:comment w:id="1" w:author="Bob Shen" w:initials="BS" w:date="2026-08-24T16:09:12Z">
     <w:p>
       <w:pPr>
         <w:pStyle w:val="CommentText"/>
@@ -4788,7 +4821,7 @@
       </w:r>
     </w:p>
   </w:comment>
-  <w:comment w:id="2" w:author="Bob Shen" w:initials="BS" w:date="2026-08-24T16:04:27Z">
+  <w:comment w:id="2" w:author="Bob Shen" w:initials="BS" w:date="2026-08-24T16:09:12Z">
     <w:p>
       <w:pPr>
         <w:pStyle w:val="CommentText"/>
@@ -4804,7 +4837,7 @@
       </w:r>
     </w:p>
   </w:comment>
-  <w:comment w:id="3" w:author="Bob Shen" w:initials="BS" w:date="2026-08-24T16:04:27Z">
+  <w:comment w:id="3" w:author="Bob Shen" w:initials="BS" w:date="2026-08-24T16:09:12Z">
     <w:p>
       <w:pPr>
         <w:pStyle w:val="CommentText"/>
@@ -4820,7 +4853,7 @@
       </w:r>
     </w:p>
   </w:comment>
-  <w:comment w:id="4" w:author="Bob Shen" w:initials="BS" w:date="2026-08-24T16:04:27Z">
+  <w:comment w:id="4" w:author="Bob Shen" w:initials="BS" w:date="2026-08-24T16:09:12Z">
     <w:p>
       <w:pPr>
         <w:pStyle w:val="CommentText"/>
@@ -4836,7 +4869,7 @@
       </w:r>
     </w:p>
   </w:comment>
-  <w:comment w:id="5" w:author="Bob Shen" w:initials="BS" w:date="2026-08-24T16:04:27Z">
+  <w:comment w:id="5" w:author="Bob Shen" w:initials="BS" w:date="2026-08-24T16:09:12Z">
     <w:p>
       <w:pPr>
         <w:pStyle w:val="CommentText"/>

</xml_diff>

<commit_message>
Remove circulation banner and paginate Hogan PDF for Bishai print.
Drop the "do not circulate" line from the 24 Aug live manuscript so the PDF can be handed to Bishai. Keep each table on one page, start figures and major sections on new pages, and leave Model 1 numbers and Hogan's HKO sentences unchanged.

Co-authored-by: Shen Ruililin <bobshenruililin@users.noreply.github.com>
</commit_message>
<xml_diff>
--- a/manuscript/live_collaborative/Heat_CVD_Manuscript_20260824_hogan.docx
+++ b/manuscript/live_collaborative/Heat_CVD_Manuscript_20260824_hogan.docx
@@ -2,23 +2,6 @@
 <file path=word/document.xml><?xml version="1.0" encoding="utf-8"?>
 <w:document xmlns:wpc="http://schemas.microsoft.com/office/word/2010/wordprocessingCanvas" xmlns:mo="http://schemas.microsoft.com/office/mac/office/2008/main" xmlns:mc="http://schemas.openxmlformats.org/markup-compatibility/2006" xmlns:mv="urn:schemas-microsoft-com:mac:vml" xmlns:o="urn:schemas-microsoft-com:office:office" xmlns:r="http://schemas.openxmlformats.org/officeDocument/2006/relationships" xmlns:m="http://schemas.openxmlformats.org/officeDocument/2006/math" xmlns:v="urn:schemas-microsoft-com:vml" xmlns:wp14="http://schemas.microsoft.com/office/word/2010/wordprocessingDrawing" xmlns:wp="http://schemas.openxmlformats.org/drawingml/2006/wordprocessingDrawing" xmlns:w10="urn:schemas-microsoft-com:office:word" xmlns:w="http://schemas.openxmlformats.org/wordprocessingml/2006/main" xmlns:w14="http://schemas.microsoft.com/office/word/2010/wordml" xmlns:wpg="http://schemas.microsoft.com/office/word/2010/wordprocessingGroup" xmlns:wpi="http://schemas.microsoft.com/office/word/2010/wordprocessingInk" xmlns:wne="http://schemas.microsoft.com/office/word/2006/wordml" xmlns:wps="http://schemas.microsoft.com/office/word/2010/wordprocessingShape" mc:Ignorable="w14 wp14">
   <w:body>
-    <w:p>
-      <w:pPr>
-        <w:spacing w:after="200" w:before="0" w:line="240" w:lineRule="auto"/>
-        <w:ind w:firstLine="0"/>
-        <w:jc w:val="left"/>
-      </w:pPr>
-      <w:r>
-        <w:rPr>
-          <w:rFonts w:ascii="Times New Roman" w:hAnsi="Times New Roman" w:eastAsia="Times New Roman"/>
-          <w:b w:val="0"/>
-          <w:i/>
-          <w:color w:val="663300"/>
-          <w:sz w:val="20"/>
-        </w:rPr>
-        <w:t>Paste into the shared live document; do not circulate this file as a separate version.</w:t>
-      </w:r>
-    </w:p>
     <w:p>
       <w:pPr>
         <w:spacing w:after="120" w:before="0" w:line="240" w:lineRule="auto"/>
@@ -338,7 +321,8 @@
     </w:p>
     <w:p>
       <w:pPr>
-        <w:spacing w:after="120" w:before="240" w:line="240" w:lineRule="auto"/>
+        <w:pageBreakBefore/>
+        <w:spacing w:after="120" w:before="0" w:line="240" w:lineRule="auto"/>
         <w:ind w:firstLine="0"/>
         <w:jc w:val="left"/>
       </w:pPr>
@@ -1270,7 +1254,8 @@
     </w:p>
     <w:p>
       <w:pPr>
-        <w:spacing w:after="120" w:before="240" w:line="240" w:lineRule="auto"/>
+        <w:pageBreakBefore/>
+        <w:spacing w:after="120" w:before="0" w:line="240" w:lineRule="auto"/>
         <w:ind w:firstLine="0"/>
         <w:jc w:val="left"/>
       </w:pPr>
@@ -1318,7 +1303,10 @@
     </w:p>
     <w:p>
       <w:pPr>
-        <w:spacing w:after="200" w:before="120" w:line="240" w:lineRule="auto"/>
+        <w:keepNext/>
+        <w:keepLines/>
+        <w:pageBreakBefore/>
+        <w:spacing w:after="200" w:before="0" w:line="240" w:lineRule="auto"/>
         <w:ind w:firstLine="0"/>
         <w:jc w:val="left"/>
       </w:pPr>
@@ -1335,25 +1323,39 @@
     <w:tbl>
       <w:tblPr>
         <w:tblStyle w:val="TableGrid"/>
-        <w:tblW w:type="auto" w:w="0"/>
+        <w:tblLayout w:type="fixed"/>
         <w:tblLook w:firstColumn="1" w:firstRow="1" w:lastColumn="0" w:lastRow="0" w:noHBand="0" w:noVBand="1" w:val="04A0"/>
+        <w:tblW w:w="5000" w:type="pct"/>
+        <w:tblLayout w:type="fixed"/>
       </w:tblPr>
       <w:tblGrid>
-        <w:gridCol w:w="1560"/>
-        <w:gridCol w:w="1560"/>
-        <w:gridCol w:w="1560"/>
-        <w:gridCol w:w="1560"/>
-        <w:gridCol w:w="1560"/>
-        <w:gridCol w:w="1560"/>
+        <w:gridCol w:w="2088"/>
+        <w:gridCol w:w="1123"/>
+        <w:gridCol w:w="792"/>
+        <w:gridCol w:w="1224"/>
+        <w:gridCol w:w="1368"/>
+        <w:gridCol w:w="2419"/>
       </w:tblGrid>
       <w:tr>
+        <w:trPr>
+          <w:cantSplit/>
+          <w:tblHeader/>
+        </w:trPr>
         <w:tc>
           <w:tcPr>
-            <w:tcW w:type="dxa" w:w="1560"/>
+            <w:tcW w:type="dxa" w:w="2088"/>
+            <w:tcMar>
+              <w:top w:w="40" w:type="dxa"/>
+              <w:left w:w="60" w:type="dxa"/>
+              <w:bottom w:w="40" w:type="dxa"/>
+              <w:right w:w="60" w:type="dxa"/>
+            </w:tcMar>
           </w:tcPr>
           <w:p>
             <w:pPr>
-              <w:spacing w:after="40" w:before="40" w:line="240" w:lineRule="auto"/>
+              <w:keepNext/>
+              <w:keepLines/>
+              <w:spacing w:after="20" w:before="20" w:line="240" w:lineRule="auto"/>
               <w:ind w:firstLine="0"/>
               <w:jc w:val="left"/>
             </w:pPr>
@@ -1363,7 +1365,7 @@
                 <w:rFonts w:ascii="Times New Roman" w:hAnsi="Times New Roman" w:eastAsia="Times New Roman"/>
                 <w:b/>
                 <w:i w:val="0"/>
-                <w:sz w:val="20"/>
+                <w:sz w:val="18"/>
               </w:rPr>
               <w:t>Outcome</w:t>
             </w:r>
@@ -1371,11 +1373,19 @@
         </w:tc>
         <w:tc>
           <w:tcPr>
-            <w:tcW w:type="dxa" w:w="1560"/>
+            <w:tcW w:type="dxa" w:w="1123"/>
+            <w:tcMar>
+              <w:top w:w="40" w:type="dxa"/>
+              <w:left w:w="60" w:type="dxa"/>
+              <w:bottom w:w="40" w:type="dxa"/>
+              <w:right w:w="60" w:type="dxa"/>
+            </w:tcMar>
           </w:tcPr>
           <w:p>
             <w:pPr>
-              <w:spacing w:after="40" w:before="40" w:line="240" w:lineRule="auto"/>
+              <w:keepNext/>
+              <w:keepLines/>
+              <w:spacing w:after="20" w:before="20" w:line="240" w:lineRule="auto"/>
               <w:ind w:firstLine="0"/>
               <w:jc w:val="left"/>
             </w:pPr>
@@ -1385,7 +1395,7 @@
                 <w:rFonts w:ascii="Times New Roman" w:hAnsi="Times New Roman" w:eastAsia="Times New Roman"/>
                 <w:b/>
                 <w:i w:val="0"/>
-                <w:sz w:val="20"/>
+                <w:sz w:val="18"/>
               </w:rPr>
               <w:t>Period</w:t>
             </w:r>
@@ -1393,11 +1403,19 @@
         </w:tc>
         <w:tc>
           <w:tcPr>
-            <w:tcW w:type="dxa" w:w="1560"/>
+            <w:tcW w:type="dxa" w:w="792"/>
+            <w:tcMar>
+              <w:top w:w="40" w:type="dxa"/>
+              <w:left w:w="60" w:type="dxa"/>
+              <w:bottom w:w="40" w:type="dxa"/>
+              <w:right w:w="60" w:type="dxa"/>
+            </w:tcMar>
           </w:tcPr>
           <w:p>
             <w:pPr>
-              <w:spacing w:after="40" w:before="40" w:line="240" w:lineRule="auto"/>
+              <w:keepNext/>
+              <w:keepLines/>
+              <w:spacing w:after="20" w:before="20" w:line="240" w:lineRule="auto"/>
               <w:ind w:firstLine="0"/>
               <w:jc w:val="left"/>
             </w:pPr>
@@ -1407,7 +1425,7 @@
                 <w:rFonts w:ascii="Times New Roman" w:hAnsi="Times New Roman" w:eastAsia="Times New Roman"/>
                 <w:b/>
                 <w:i w:val="0"/>
-                <w:sz w:val="20"/>
+                <w:sz w:val="18"/>
               </w:rPr>
               <w:t>Months</w:t>
             </w:r>
@@ -1415,11 +1433,19 @@
         </w:tc>
         <w:tc>
           <w:tcPr>
-            <w:tcW w:type="dxa" w:w="1560"/>
+            <w:tcW w:type="dxa" w:w="1224"/>
+            <w:tcMar>
+              <w:top w:w="40" w:type="dxa"/>
+              <w:left w:w="60" w:type="dxa"/>
+              <w:bottom w:w="40" w:type="dxa"/>
+              <w:right w:w="60" w:type="dxa"/>
+            </w:tcMar>
           </w:tcPr>
           <w:p>
             <w:pPr>
-              <w:spacing w:after="40" w:before="40" w:line="240" w:lineRule="auto"/>
+              <w:keepNext/>
+              <w:keepLines/>
+              <w:spacing w:after="20" w:before="20" w:line="240" w:lineRule="auto"/>
               <w:ind w:firstLine="0"/>
               <w:jc w:val="left"/>
             </w:pPr>
@@ -1429,7 +1455,7 @@
                 <w:rFonts w:ascii="Times New Roman" w:hAnsi="Times New Roman" w:eastAsia="Times New Roman"/>
                 <w:b/>
                 <w:i w:val="0"/>
-                <w:sz w:val="20"/>
+                <w:sz w:val="18"/>
               </w:rPr>
               <w:t>Total events</w:t>
             </w:r>
@@ -1437,11 +1463,19 @@
         </w:tc>
         <w:tc>
           <w:tcPr>
-            <w:tcW w:type="dxa" w:w="1560"/>
+            <w:tcW w:type="dxa" w:w="1368"/>
+            <w:tcMar>
+              <w:top w:w="40" w:type="dxa"/>
+              <w:left w:w="60" w:type="dxa"/>
+              <w:bottom w:w="40" w:type="dxa"/>
+              <w:right w:w="60" w:type="dxa"/>
+            </w:tcMar>
           </w:tcPr>
           <w:p>
             <w:pPr>
-              <w:spacing w:after="40" w:before="40" w:line="240" w:lineRule="auto"/>
+              <w:keepNext/>
+              <w:keepLines/>
+              <w:spacing w:after="20" w:before="20" w:line="240" w:lineRule="auto"/>
               <w:ind w:firstLine="0"/>
               <w:jc w:val="left"/>
             </w:pPr>
@@ -1451,7 +1485,7 @@
                 <w:rFonts w:ascii="Times New Roman" w:hAnsi="Times New Roman" w:eastAsia="Times New Roman"/>
                 <w:b/>
                 <w:i w:val="0"/>
-                <w:sz w:val="20"/>
+                <w:sz w:val="18"/>
               </w:rPr>
               <w:t>Mean per month</w:t>
             </w:r>
@@ -1459,11 +1493,19 @@
         </w:tc>
         <w:tc>
           <w:tcPr>
-            <w:tcW w:type="dxa" w:w="1560"/>
+            <w:tcW w:type="dxa" w:w="2419"/>
+            <w:tcMar>
+              <w:top w:w="40" w:type="dxa"/>
+              <w:left w:w="60" w:type="dxa"/>
+              <w:bottom w:w="40" w:type="dxa"/>
+              <w:right w:w="60" w:type="dxa"/>
+            </w:tcMar>
           </w:tcPr>
           <w:p>
             <w:pPr>
-              <w:spacing w:after="40" w:before="40" w:line="240" w:lineRule="auto"/>
+              <w:keepNext/>
+              <w:keepLines/>
+              <w:spacing w:after="20" w:before="20" w:line="240" w:lineRule="auto"/>
               <w:ind w:firstLine="0"/>
               <w:jc w:val="left"/>
             </w:pPr>
@@ -1473,7 +1515,7 @@
                 <w:rFonts w:ascii="Times New Roman" w:hAnsi="Times New Roman" w:eastAsia="Times New Roman"/>
                 <w:b/>
                 <w:i w:val="0"/>
-                <w:sz w:val="20"/>
+                <w:sz w:val="18"/>
               </w:rPr>
               <w:t>Event construction</w:t>
             </w:r>
@@ -1481,12 +1523,23 @@
         </w:tc>
       </w:tr>
       <w:tr>
+        <w:trPr>
+          <w:cantSplit/>
+        </w:trPr>
         <w:tc>
           <w:tcPr>
-            <w:tcW w:type="dxa" w:w="1560"/>
+            <w:tcW w:type="dxa" w:w="2088"/>
+            <w:tcMar>
+              <w:top w:w="40" w:type="dxa"/>
+              <w:left w:w="60" w:type="dxa"/>
+              <w:bottom w:w="40" w:type="dxa"/>
+              <w:right w:w="60" w:type="dxa"/>
+            </w:tcMar>
           </w:tcPr>
           <w:p>
             <w:pPr>
+              <w:keepNext/>
+              <w:keepLines/>
               <w:spacing w:after="20" w:before="20" w:line="240" w:lineRule="auto"/>
               <w:ind w:firstLine="0"/>
               <w:jc w:val="left"/>
@@ -1497,7 +1550,7 @@
                 <w:rFonts w:ascii="Times New Roman" w:hAnsi="Times New Roman" w:eastAsia="Times New Roman"/>
                 <w:b w:val="0"/>
                 <w:i w:val="0"/>
-                <w:sz w:val="20"/>
+                <w:sz w:val="18"/>
               </w:rPr>
               <w:t>Coronary heart disease</w:t>
             </w:r>
@@ -1505,10 +1558,18 @@
         </w:tc>
         <w:tc>
           <w:tcPr>
-            <w:tcW w:type="dxa" w:w="1560"/>
+            <w:tcW w:type="dxa" w:w="1123"/>
+            <w:tcMar>
+              <w:top w:w="40" w:type="dxa"/>
+              <w:left w:w="60" w:type="dxa"/>
+              <w:bottom w:w="40" w:type="dxa"/>
+              <w:right w:w="60" w:type="dxa"/>
+            </w:tcMar>
           </w:tcPr>
           <w:p>
             <w:pPr>
+              <w:keepNext/>
+              <w:keepLines/>
               <w:spacing w:after="20" w:before="20" w:line="240" w:lineRule="auto"/>
               <w:ind w:firstLine="0"/>
               <w:jc w:val="left"/>
@@ -1519,7 +1580,7 @@
                 <w:rFonts w:ascii="Times New Roman" w:hAnsi="Times New Roman" w:eastAsia="Times New Roman"/>
                 <w:b w:val="0"/>
                 <w:i w:val="0"/>
-                <w:sz w:val="20"/>
+                <w:sz w:val="18"/>
               </w:rPr>
               <w:t>2013–2023</w:t>
             </w:r>
@@ -1527,10 +1588,18 @@
         </w:tc>
         <w:tc>
           <w:tcPr>
-            <w:tcW w:type="dxa" w:w="1560"/>
+            <w:tcW w:type="dxa" w:w="792"/>
+            <w:tcMar>
+              <w:top w:w="40" w:type="dxa"/>
+              <w:left w:w="60" w:type="dxa"/>
+              <w:bottom w:w="40" w:type="dxa"/>
+              <w:right w:w="60" w:type="dxa"/>
+            </w:tcMar>
           </w:tcPr>
           <w:p>
             <w:pPr>
+              <w:keepNext/>
+              <w:keepLines/>
               <w:spacing w:after="20" w:before="20" w:line="240" w:lineRule="auto"/>
               <w:ind w:firstLine="0"/>
               <w:jc w:val="left"/>
@@ -1541,7 +1610,7 @@
                 <w:rFonts w:ascii="Times New Roman" w:hAnsi="Times New Roman" w:eastAsia="Times New Roman"/>
                 <w:b w:val="0"/>
                 <w:i w:val="0"/>
-                <w:sz w:val="20"/>
+                <w:sz w:val="18"/>
               </w:rPr>
               <w:t>132</w:t>
             </w:r>
@@ -1549,10 +1618,18 @@
         </w:tc>
         <w:tc>
           <w:tcPr>
-            <w:tcW w:type="dxa" w:w="1560"/>
+            <w:tcW w:type="dxa" w:w="1224"/>
+            <w:tcMar>
+              <w:top w:w="40" w:type="dxa"/>
+              <w:left w:w="60" w:type="dxa"/>
+              <w:bottom w:w="40" w:type="dxa"/>
+              <w:right w:w="60" w:type="dxa"/>
+            </w:tcMar>
           </w:tcPr>
           <w:p>
             <w:pPr>
+              <w:keepNext/>
+              <w:keepLines/>
               <w:spacing w:after="20" w:before="20" w:line="240" w:lineRule="auto"/>
               <w:ind w:firstLine="0"/>
               <w:jc w:val="left"/>
@@ -1563,7 +1640,7 @@
                 <w:rFonts w:ascii="Times New Roman" w:hAnsi="Times New Roman" w:eastAsia="Times New Roman"/>
                 <w:b w:val="0"/>
                 <w:i w:val="0"/>
-                <w:sz w:val="20"/>
+                <w:sz w:val="18"/>
               </w:rPr>
               <w:t>156,156</w:t>
             </w:r>
@@ -1571,10 +1648,18 @@
         </w:tc>
         <w:tc>
           <w:tcPr>
-            <w:tcW w:type="dxa" w:w="1560"/>
+            <w:tcW w:type="dxa" w:w="1368"/>
+            <w:tcMar>
+              <w:top w:w="40" w:type="dxa"/>
+              <w:left w:w="60" w:type="dxa"/>
+              <w:bottom w:w="40" w:type="dxa"/>
+              <w:right w:w="60" w:type="dxa"/>
+            </w:tcMar>
           </w:tcPr>
           <w:p>
             <w:pPr>
+              <w:keepNext/>
+              <w:keepLines/>
               <w:spacing w:after="20" w:before="20" w:line="240" w:lineRule="auto"/>
               <w:ind w:firstLine="0"/>
               <w:jc w:val="left"/>
@@ -1585,7 +1670,7 @@
                 <w:rFonts w:ascii="Times New Roman" w:hAnsi="Times New Roman" w:eastAsia="Times New Roman"/>
                 <w:b w:val="0"/>
                 <w:i w:val="0"/>
-                <w:sz w:val="20"/>
+                <w:sz w:val="18"/>
               </w:rPr>
               <w:t>1,183.0</w:t>
             </w:r>
@@ -1593,10 +1678,18 @@
         </w:tc>
         <w:tc>
           <w:tcPr>
-            <w:tcW w:type="dxa" w:w="1560"/>
+            <w:tcW w:type="dxa" w:w="2419"/>
+            <w:tcMar>
+              <w:top w:w="40" w:type="dxa"/>
+              <w:left w:w="60" w:type="dxa"/>
+              <w:bottom w:w="40" w:type="dxa"/>
+              <w:right w:w="60" w:type="dxa"/>
+            </w:tcMar>
           </w:tcPr>
           <w:p>
             <w:pPr>
+              <w:keepNext/>
+              <w:keepLines/>
               <w:spacing w:after="20" w:before="20" w:line="240" w:lineRule="auto"/>
               <w:ind w:firstLine="0"/>
               <w:jc w:val="left"/>
@@ -1607,7 +1700,7 @@
                 <w:rFonts w:ascii="Times New Roman" w:hAnsi="Times New Roman" w:eastAsia="Times New Roman"/>
                 <w:b w:val="0"/>
                 <w:i w:val="0"/>
-                <w:sz w:val="20"/>
+                <w:sz w:val="18"/>
               </w:rPr>
               <w:t>First recorded hospitalisation after first CHD diagnosis</w:t>
             </w:r>
@@ -1615,12 +1708,22 @@
         </w:tc>
       </w:tr>
       <w:tr>
+        <w:trPr>
+          <w:cantSplit/>
+        </w:trPr>
         <w:tc>
           <w:tcPr>
-            <w:tcW w:type="dxa" w:w="1560"/>
+            <w:tcW w:type="dxa" w:w="2088"/>
+            <w:tcMar>
+              <w:top w:w="40" w:type="dxa"/>
+              <w:left w:w="60" w:type="dxa"/>
+              <w:bottom w:w="40" w:type="dxa"/>
+              <w:right w:w="60" w:type="dxa"/>
+            </w:tcMar>
           </w:tcPr>
           <w:p>
             <w:pPr>
+              <w:keepLines/>
               <w:spacing w:after="20" w:before="20" w:line="240" w:lineRule="auto"/>
               <w:ind w:firstLine="0"/>
               <w:jc w:val="left"/>
@@ -1631,7 +1734,7 @@
                 <w:rFonts w:ascii="Times New Roman" w:hAnsi="Times New Roman" w:eastAsia="Times New Roman"/>
                 <w:b w:val="0"/>
                 <w:i w:val="0"/>
-                <w:sz w:val="20"/>
+                <w:sz w:val="18"/>
               </w:rPr>
               <w:t>Heart failure</w:t>
             </w:r>
@@ -1639,10 +1742,17 @@
         </w:tc>
         <w:tc>
           <w:tcPr>
-            <w:tcW w:type="dxa" w:w="1560"/>
+            <w:tcW w:type="dxa" w:w="1123"/>
+            <w:tcMar>
+              <w:top w:w="40" w:type="dxa"/>
+              <w:left w:w="60" w:type="dxa"/>
+              <w:bottom w:w="40" w:type="dxa"/>
+              <w:right w:w="60" w:type="dxa"/>
+            </w:tcMar>
           </w:tcPr>
           <w:p>
             <w:pPr>
+              <w:keepLines/>
               <w:spacing w:after="20" w:before="20" w:line="240" w:lineRule="auto"/>
               <w:ind w:firstLine="0"/>
               <w:jc w:val="left"/>
@@ -1653,7 +1763,7 @@
                 <w:rFonts w:ascii="Times New Roman" w:hAnsi="Times New Roman" w:eastAsia="Times New Roman"/>
                 <w:b w:val="0"/>
                 <w:i w:val="0"/>
-                <w:sz w:val="20"/>
+                <w:sz w:val="18"/>
               </w:rPr>
               <w:t>2013–2023</w:t>
             </w:r>
@@ -1661,10 +1771,17 @@
         </w:tc>
         <w:tc>
           <w:tcPr>
-            <w:tcW w:type="dxa" w:w="1560"/>
+            <w:tcW w:type="dxa" w:w="792"/>
+            <w:tcMar>
+              <w:top w:w="40" w:type="dxa"/>
+              <w:left w:w="60" w:type="dxa"/>
+              <w:bottom w:w="40" w:type="dxa"/>
+              <w:right w:w="60" w:type="dxa"/>
+            </w:tcMar>
           </w:tcPr>
           <w:p>
             <w:pPr>
+              <w:keepLines/>
               <w:spacing w:after="20" w:before="20" w:line="240" w:lineRule="auto"/>
               <w:ind w:firstLine="0"/>
               <w:jc w:val="left"/>
@@ -1675,7 +1792,7 @@
                 <w:rFonts w:ascii="Times New Roman" w:hAnsi="Times New Roman" w:eastAsia="Times New Roman"/>
                 <w:b w:val="0"/>
                 <w:i w:val="0"/>
-                <w:sz w:val="20"/>
+                <w:sz w:val="18"/>
               </w:rPr>
               <w:t>132</w:t>
             </w:r>
@@ -1683,10 +1800,17 @@
         </w:tc>
         <w:tc>
           <w:tcPr>
-            <w:tcW w:type="dxa" w:w="1560"/>
+            <w:tcW w:type="dxa" w:w="1224"/>
+            <w:tcMar>
+              <w:top w:w="40" w:type="dxa"/>
+              <w:left w:w="60" w:type="dxa"/>
+              <w:bottom w:w="40" w:type="dxa"/>
+              <w:right w:w="60" w:type="dxa"/>
+            </w:tcMar>
           </w:tcPr>
           <w:p>
             <w:pPr>
+              <w:keepLines/>
               <w:spacing w:after="20" w:before="20" w:line="240" w:lineRule="auto"/>
               <w:ind w:firstLine="0"/>
               <w:jc w:val="left"/>
@@ -1697,7 +1821,7 @@
                 <w:rFonts w:ascii="Times New Roman" w:hAnsi="Times New Roman" w:eastAsia="Times New Roman"/>
                 <w:b w:val="0"/>
                 <w:i w:val="0"/>
-                <w:sz w:val="20"/>
+                <w:sz w:val="18"/>
               </w:rPr>
               <w:t>29,681</w:t>
             </w:r>
@@ -1705,10 +1829,17 @@
         </w:tc>
         <w:tc>
           <w:tcPr>
-            <w:tcW w:type="dxa" w:w="1560"/>
+            <w:tcW w:type="dxa" w:w="1368"/>
+            <w:tcMar>
+              <w:top w:w="40" w:type="dxa"/>
+              <w:left w:w="60" w:type="dxa"/>
+              <w:bottom w:w="40" w:type="dxa"/>
+              <w:right w:w="60" w:type="dxa"/>
+            </w:tcMar>
           </w:tcPr>
           <w:p>
             <w:pPr>
+              <w:keepLines/>
               <w:spacing w:after="20" w:before="20" w:line="240" w:lineRule="auto"/>
               <w:ind w:firstLine="0"/>
               <w:jc w:val="left"/>
@@ -1719,7 +1850,7 @@
                 <w:rFonts w:ascii="Times New Roman" w:hAnsi="Times New Roman" w:eastAsia="Times New Roman"/>
                 <w:b w:val="0"/>
                 <w:i w:val="0"/>
-                <w:sz w:val="20"/>
+                <w:sz w:val="18"/>
               </w:rPr>
               <w:t>224.9</w:t>
             </w:r>
@@ -1727,10 +1858,17 @@
         </w:tc>
         <w:tc>
           <w:tcPr>
-            <w:tcW w:type="dxa" w:w="1560"/>
+            <w:tcW w:type="dxa" w:w="2419"/>
+            <w:tcMar>
+              <w:top w:w="40" w:type="dxa"/>
+              <w:left w:w="60" w:type="dxa"/>
+              <w:bottom w:w="40" w:type="dxa"/>
+              <w:right w:w="60" w:type="dxa"/>
+            </w:tcMar>
           </w:tcPr>
           <w:p>
             <w:pPr>
+              <w:keepLines/>
               <w:spacing w:after="20" w:before="20" w:line="240" w:lineRule="auto"/>
               <w:ind w:firstLine="0"/>
               <w:jc w:val="left"/>
@@ -1741,7 +1879,7 @@
                 <w:rFonts w:ascii="Times New Roman" w:hAnsi="Times New Roman" w:eastAsia="Times New Roman"/>
                 <w:b w:val="0"/>
                 <w:i w:val="0"/>
-                <w:sz w:val="20"/>
+                <w:sz w:val="18"/>
               </w:rPr>
               <w:t>First recorded hospitalisation after first HF diagnosis</w:t>
             </w:r>
@@ -1749,9 +1887,18 @@
         </w:tc>
       </w:tr>
     </w:tbl>
-    <w:p/>
     <w:p>
       <w:pPr>
+        <w:spacing w:after="120" w:before="0" w:line="240" w:lineRule="auto"/>
+        <w:ind w:firstLine="0"/>
+        <w:jc w:val="left"/>
+      </w:pPr>
+    </w:p>
+    <w:p>
+      <w:pPr>
+        <w:keepNext/>
+        <w:keepLines/>
+        <w:pageBreakBefore/>
         <w:spacing w:after="80" w:before="0" w:line="240" w:lineRule="auto"/>
         <w:ind w:firstLine="0"/>
         <w:jc w:val="center"/>
@@ -1793,6 +1940,8 @@
     </w:p>
     <w:p>
       <w:pPr>
+        <w:keepNext w:val="0"/>
+        <w:keepLines/>
         <w:spacing w:after="200" w:before="120" w:line="240" w:lineRule="auto"/>
         <w:ind w:firstLine="0"/>
         <w:jc w:val="left"/>
@@ -1809,7 +1958,8 @@
     </w:p>
     <w:p>
       <w:pPr>
-        <w:spacing w:after="120" w:before="160" w:line="240" w:lineRule="auto"/>
+        <w:pageBreakBefore/>
+        <w:spacing w:after="120" w:before="0" w:line="240" w:lineRule="auto"/>
         <w:ind w:firstLine="0"/>
         <w:jc w:val="left"/>
       </w:pPr>
@@ -1841,6 +1991,9 @@
     </w:p>
     <w:p>
       <w:pPr>
+        <w:keepNext/>
+        <w:keepLines/>
+        <w:pageBreakBefore/>
         <w:spacing w:after="80" w:before="0" w:line="240" w:lineRule="auto"/>
         <w:ind w:firstLine="0"/>
         <w:jc w:val="center"/>
@@ -1882,6 +2035,8 @@
     </w:p>
     <w:p>
       <w:pPr>
+        <w:keepNext w:val="0"/>
+        <w:keepLines/>
         <w:spacing w:after="200" w:before="120" w:line="240" w:lineRule="auto"/>
         <w:ind w:firstLine="0"/>
         <w:jc w:val="left"/>
@@ -1898,7 +2053,9 @@
     </w:p>
     <w:p>
       <w:pPr>
-        <w:spacing w:after="120" w:before="160" w:line="240" w:lineRule="auto"/>
+        <w:keepNext/>
+        <w:pageBreakBefore/>
+        <w:spacing w:after="120" w:before="0" w:line="240" w:lineRule="auto"/>
         <w:ind w:firstLine="0"/>
         <w:jc w:val="left"/>
       </w:pPr>
@@ -1914,6 +2071,7 @@
     </w:p>
     <w:p>
       <w:pPr>
+        <w:keepNext/>
         <w:spacing w:after="160" w:before="0" w:line="240" w:lineRule="auto"/>
         <w:ind w:firstLine="720"/>
         <w:jc w:val="both"/>
@@ -1930,6 +2088,8 @@
     </w:p>
     <w:p>
       <w:pPr>
+        <w:keepNext/>
+        <w:keepLines/>
         <w:spacing w:after="200" w:before="120" w:line="240" w:lineRule="auto"/>
         <w:ind w:firstLine="0"/>
         <w:jc w:val="left"/>
@@ -1955,24 +2115,38 @@
     <w:tbl>
       <w:tblPr>
         <w:tblStyle w:val="TableGrid"/>
-        <w:tblW w:type="auto" w:w="0"/>
+        <w:tblLayout w:type="fixed"/>
         <w:tblLook w:firstColumn="1" w:firstRow="1" w:lastColumn="0" w:lastRow="0" w:noHBand="0" w:noVBand="1" w:val="04A0"/>
+        <w:tblW w:w="5000" w:type="pct"/>
+        <w:tblLayout w:type="fixed"/>
       </w:tblPr>
       <w:tblGrid>
-        <w:gridCol w:w="1872"/>
-        <w:gridCol w:w="1872"/>
-        <w:gridCol w:w="1872"/>
-        <w:gridCol w:w="1872"/>
-        <w:gridCol w:w="1872"/>
+        <w:gridCol w:w="1123"/>
+        <w:gridCol w:w="2951"/>
+        <w:gridCol w:w="2995"/>
+        <w:gridCol w:w="792"/>
+        <w:gridCol w:w="1152"/>
       </w:tblGrid>
       <w:tr>
+        <w:trPr>
+          <w:cantSplit/>
+          <w:tblHeader/>
+        </w:trPr>
         <w:tc>
           <w:tcPr>
-            <w:tcW w:type="dxa" w:w="1872"/>
+            <w:tcW w:type="dxa" w:w="1123"/>
+            <w:tcMar>
+              <w:top w:w="40" w:type="dxa"/>
+              <w:left w:w="60" w:type="dxa"/>
+              <w:bottom w:w="40" w:type="dxa"/>
+              <w:right w:w="60" w:type="dxa"/>
+            </w:tcMar>
           </w:tcPr>
           <w:p>
             <w:pPr>
-              <w:spacing w:after="40" w:before="40" w:line="240" w:lineRule="auto"/>
+              <w:keepNext/>
+              <w:keepLines/>
+              <w:spacing w:after="20" w:before="20" w:line="240" w:lineRule="auto"/>
               <w:ind w:firstLine="0"/>
               <w:jc w:val="left"/>
             </w:pPr>
@@ -1990,11 +2164,19 @@
         </w:tc>
         <w:tc>
           <w:tcPr>
-            <w:tcW w:type="dxa" w:w="1872"/>
+            <w:tcW w:type="dxa" w:w="2952"/>
+            <w:tcMar>
+              <w:top w:w="40" w:type="dxa"/>
+              <w:left w:w="60" w:type="dxa"/>
+              <w:bottom w:w="40" w:type="dxa"/>
+              <w:right w:w="60" w:type="dxa"/>
+            </w:tcMar>
           </w:tcPr>
           <w:p>
             <w:pPr>
-              <w:spacing w:after="40" w:before="40" w:line="240" w:lineRule="auto"/>
+              <w:keepNext/>
+              <w:keepLines/>
+              <w:spacing w:after="20" w:before="20" w:line="240" w:lineRule="auto"/>
               <w:ind w:firstLine="0"/>
               <w:jc w:val="left"/>
             </w:pPr>
@@ -2012,11 +2194,19 @@
         </w:tc>
         <w:tc>
           <w:tcPr>
-            <w:tcW w:type="dxa" w:w="1872"/>
+            <w:tcW w:type="dxa" w:w="2995"/>
+            <w:tcMar>
+              <w:top w:w="40" w:type="dxa"/>
+              <w:left w:w="60" w:type="dxa"/>
+              <w:bottom w:w="40" w:type="dxa"/>
+              <w:right w:w="60" w:type="dxa"/>
+            </w:tcMar>
           </w:tcPr>
           <w:p>
             <w:pPr>
-              <w:spacing w:after="40" w:before="40" w:line="240" w:lineRule="auto"/>
+              <w:keepNext/>
+              <w:keepLines/>
+              <w:spacing w:after="20" w:before="20" w:line="240" w:lineRule="auto"/>
               <w:ind w:firstLine="0"/>
               <w:jc w:val="left"/>
             </w:pPr>
@@ -2034,11 +2224,19 @@
         </w:tc>
         <w:tc>
           <w:tcPr>
-            <w:tcW w:type="dxa" w:w="1872"/>
+            <w:tcW w:type="dxa" w:w="792"/>
+            <w:tcMar>
+              <w:top w:w="40" w:type="dxa"/>
+              <w:left w:w="60" w:type="dxa"/>
+              <w:bottom w:w="40" w:type="dxa"/>
+              <w:right w:w="60" w:type="dxa"/>
+            </w:tcMar>
           </w:tcPr>
           <w:p>
             <w:pPr>
-              <w:spacing w:after="40" w:before="40" w:line="240" w:lineRule="auto"/>
+              <w:keepNext/>
+              <w:keepLines/>
+              <w:spacing w:after="20" w:before="20" w:line="240" w:lineRule="auto"/>
               <w:ind w:firstLine="0"/>
               <w:jc w:val="left"/>
             </w:pPr>
@@ -2056,11 +2254,19 @@
         </w:tc>
         <w:tc>
           <w:tcPr>
-            <w:tcW w:type="dxa" w:w="1872"/>
+            <w:tcW w:type="dxa" w:w="1152"/>
+            <w:tcMar>
+              <w:top w:w="40" w:type="dxa"/>
+              <w:left w:w="60" w:type="dxa"/>
+              <w:bottom w:w="40" w:type="dxa"/>
+              <w:right w:w="60" w:type="dxa"/>
+            </w:tcMar>
           </w:tcPr>
           <w:p>
             <w:pPr>
-              <w:spacing w:after="40" w:before="40" w:line="240" w:lineRule="auto"/>
+              <w:keepNext/>
+              <w:keepLines/>
+              <w:spacing w:after="20" w:before="20" w:line="240" w:lineRule="auto"/>
               <w:ind w:firstLine="0"/>
               <w:jc w:val="left"/>
             </w:pPr>
@@ -2078,12 +2284,23 @@
         </w:tc>
       </w:tr>
       <w:tr>
+        <w:trPr>
+          <w:cantSplit/>
+        </w:trPr>
         <w:tc>
           <w:tcPr>
-            <w:tcW w:type="dxa" w:w="1872"/>
+            <w:tcW w:type="dxa" w:w="1123"/>
+            <w:tcMar>
+              <w:top w:w="40" w:type="dxa"/>
+              <w:left w:w="60" w:type="dxa"/>
+              <w:bottom w:w="40" w:type="dxa"/>
+              <w:right w:w="60" w:type="dxa"/>
+            </w:tcMar>
           </w:tcPr>
           <w:p>
             <w:pPr>
+              <w:keepNext/>
+              <w:keepLines/>
               <w:spacing w:after="20" w:before="20" w:line="240" w:lineRule="auto"/>
               <w:ind w:firstLine="0"/>
               <w:jc w:val="left"/>
@@ -2102,10 +2319,18 @@
         </w:tc>
         <w:tc>
           <w:tcPr>
-            <w:tcW w:type="dxa" w:w="1872"/>
+            <w:tcW w:type="dxa" w:w="2952"/>
+            <w:tcMar>
+              <w:top w:w="40" w:type="dxa"/>
+              <w:left w:w="60" w:type="dxa"/>
+              <w:bottom w:w="40" w:type="dxa"/>
+              <w:right w:w="60" w:type="dxa"/>
+            </w:tcMar>
           </w:tcPr>
           <w:p>
             <w:pPr>
+              <w:keepNext/>
+              <w:keepLines/>
               <w:spacing w:after="20" w:before="20" w:line="240" w:lineRule="auto"/>
               <w:ind w:firstLine="0"/>
               <w:jc w:val="left"/>
@@ -2124,10 +2349,18 @@
         </w:tc>
         <w:tc>
           <w:tcPr>
-            <w:tcW w:type="dxa" w:w="1872"/>
+            <w:tcW w:type="dxa" w:w="2995"/>
+            <w:tcMar>
+              <w:top w:w="40" w:type="dxa"/>
+              <w:left w:w="60" w:type="dxa"/>
+              <w:bottom w:w="40" w:type="dxa"/>
+              <w:right w:w="60" w:type="dxa"/>
+            </w:tcMar>
           </w:tcPr>
           <w:p>
             <w:pPr>
+              <w:keepNext/>
+              <w:keepLines/>
               <w:spacing w:after="20" w:before="20" w:line="240" w:lineRule="auto"/>
               <w:ind w:firstLine="0"/>
               <w:jc w:val="left"/>
@@ -2146,10 +2379,18 @@
         </w:tc>
         <w:tc>
           <w:tcPr>
-            <w:tcW w:type="dxa" w:w="1872"/>
+            <w:tcW w:type="dxa" w:w="792"/>
+            <w:tcMar>
+              <w:top w:w="40" w:type="dxa"/>
+              <w:left w:w="60" w:type="dxa"/>
+              <w:bottom w:w="40" w:type="dxa"/>
+              <w:right w:w="60" w:type="dxa"/>
+            </w:tcMar>
           </w:tcPr>
           <w:p>
             <w:pPr>
+              <w:keepNext/>
+              <w:keepLines/>
               <w:spacing w:after="20" w:before="20" w:line="240" w:lineRule="auto"/>
               <w:ind w:firstLine="0"/>
               <w:jc w:val="left"/>
@@ -2168,10 +2409,18 @@
         </w:tc>
         <w:tc>
           <w:tcPr>
-            <w:tcW w:type="dxa" w:w="1872"/>
+            <w:tcW w:type="dxa" w:w="1152"/>
+            <w:tcMar>
+              <w:top w:w="40" w:type="dxa"/>
+              <w:left w:w="60" w:type="dxa"/>
+              <w:bottom w:w="40" w:type="dxa"/>
+              <w:right w:w="60" w:type="dxa"/>
+            </w:tcMar>
           </w:tcPr>
           <w:p>
             <w:pPr>
+              <w:keepNext/>
+              <w:keepLines/>
               <w:spacing w:after="20" w:before="20" w:line="240" w:lineRule="auto"/>
               <w:ind w:firstLine="0"/>
               <w:jc w:val="left"/>
@@ -2190,12 +2439,23 @@
         </w:tc>
       </w:tr>
       <w:tr>
+        <w:trPr>
+          <w:cantSplit/>
+        </w:trPr>
         <w:tc>
           <w:tcPr>
-            <w:tcW w:type="dxa" w:w="1872"/>
+            <w:tcW w:type="dxa" w:w="1123"/>
+            <w:tcMar>
+              <w:top w:w="40" w:type="dxa"/>
+              <w:left w:w="60" w:type="dxa"/>
+              <w:bottom w:w="40" w:type="dxa"/>
+              <w:right w:w="60" w:type="dxa"/>
+            </w:tcMar>
           </w:tcPr>
           <w:p>
             <w:pPr>
+              <w:keepNext/>
+              <w:keepLines/>
               <w:spacing w:after="20" w:before="20" w:line="240" w:lineRule="auto"/>
               <w:ind w:firstLine="0"/>
               <w:jc w:val="left"/>
@@ -2214,10 +2474,18 @@
         </w:tc>
         <w:tc>
           <w:tcPr>
-            <w:tcW w:type="dxa" w:w="1872"/>
+            <w:tcW w:type="dxa" w:w="2952"/>
+            <w:tcMar>
+              <w:top w:w="40" w:type="dxa"/>
+              <w:left w:w="60" w:type="dxa"/>
+              <w:bottom w:w="40" w:type="dxa"/>
+              <w:right w:w="60" w:type="dxa"/>
+            </w:tcMar>
           </w:tcPr>
           <w:p>
             <w:pPr>
+              <w:keepNext/>
+              <w:keepLines/>
               <w:spacing w:after="20" w:before="20" w:line="240" w:lineRule="auto"/>
               <w:ind w:firstLine="0"/>
               <w:jc w:val="left"/>
@@ -2236,10 +2504,18 @@
         </w:tc>
         <w:tc>
           <w:tcPr>
-            <w:tcW w:type="dxa" w:w="1872"/>
+            <w:tcW w:type="dxa" w:w="2995"/>
+            <w:tcMar>
+              <w:top w:w="40" w:type="dxa"/>
+              <w:left w:w="60" w:type="dxa"/>
+              <w:bottom w:w="40" w:type="dxa"/>
+              <w:right w:w="60" w:type="dxa"/>
+            </w:tcMar>
           </w:tcPr>
           <w:p>
             <w:pPr>
+              <w:keepNext/>
+              <w:keepLines/>
               <w:spacing w:after="20" w:before="20" w:line="240" w:lineRule="auto"/>
               <w:ind w:firstLine="0"/>
               <w:jc w:val="left"/>
@@ -2258,10 +2534,18 @@
         </w:tc>
         <w:tc>
           <w:tcPr>
-            <w:tcW w:type="dxa" w:w="1872"/>
+            <w:tcW w:type="dxa" w:w="792"/>
+            <w:tcMar>
+              <w:top w:w="40" w:type="dxa"/>
+              <w:left w:w="60" w:type="dxa"/>
+              <w:bottom w:w="40" w:type="dxa"/>
+              <w:right w:w="60" w:type="dxa"/>
+            </w:tcMar>
           </w:tcPr>
           <w:p>
             <w:pPr>
+              <w:keepNext/>
+              <w:keepLines/>
               <w:spacing w:after="20" w:before="20" w:line="240" w:lineRule="auto"/>
               <w:ind w:firstLine="0"/>
               <w:jc w:val="left"/>
@@ -2280,10 +2564,18 @@
         </w:tc>
         <w:tc>
           <w:tcPr>
-            <w:tcW w:type="dxa" w:w="1872"/>
+            <w:tcW w:type="dxa" w:w="1152"/>
+            <w:tcMar>
+              <w:top w:w="40" w:type="dxa"/>
+              <w:left w:w="60" w:type="dxa"/>
+              <w:bottom w:w="40" w:type="dxa"/>
+              <w:right w:w="60" w:type="dxa"/>
+            </w:tcMar>
           </w:tcPr>
           <w:p>
             <w:pPr>
+              <w:keepNext/>
+              <w:keepLines/>
               <w:spacing w:after="20" w:before="20" w:line="240" w:lineRule="auto"/>
               <w:ind w:firstLine="0"/>
               <w:jc w:val="left"/>
@@ -2302,12 +2594,23 @@
         </w:tc>
       </w:tr>
       <w:tr>
+        <w:trPr>
+          <w:cantSplit/>
+        </w:trPr>
         <w:tc>
           <w:tcPr>
-            <w:tcW w:type="dxa" w:w="1872"/>
+            <w:tcW w:type="dxa" w:w="1123"/>
+            <w:tcMar>
+              <w:top w:w="40" w:type="dxa"/>
+              <w:left w:w="60" w:type="dxa"/>
+              <w:bottom w:w="40" w:type="dxa"/>
+              <w:right w:w="60" w:type="dxa"/>
+            </w:tcMar>
           </w:tcPr>
           <w:p>
             <w:pPr>
+              <w:keepNext/>
+              <w:keepLines/>
               <w:spacing w:after="20" w:before="20" w:line="240" w:lineRule="auto"/>
               <w:ind w:firstLine="0"/>
               <w:jc w:val="left"/>
@@ -2326,10 +2629,18 @@
         </w:tc>
         <w:tc>
           <w:tcPr>
-            <w:tcW w:type="dxa" w:w="1872"/>
+            <w:tcW w:type="dxa" w:w="2952"/>
+            <w:tcMar>
+              <w:top w:w="40" w:type="dxa"/>
+              <w:left w:w="60" w:type="dxa"/>
+              <w:bottom w:w="40" w:type="dxa"/>
+              <w:right w:w="60" w:type="dxa"/>
+            </w:tcMar>
           </w:tcPr>
           <w:p>
             <w:pPr>
+              <w:keepNext/>
+              <w:keepLines/>
               <w:spacing w:after="20" w:before="20" w:line="240" w:lineRule="auto"/>
               <w:ind w:firstLine="0"/>
               <w:jc w:val="left"/>
@@ -2348,10 +2659,18 @@
         </w:tc>
         <w:tc>
           <w:tcPr>
-            <w:tcW w:type="dxa" w:w="1872"/>
+            <w:tcW w:type="dxa" w:w="2995"/>
+            <w:tcMar>
+              <w:top w:w="40" w:type="dxa"/>
+              <w:left w:w="60" w:type="dxa"/>
+              <w:bottom w:w="40" w:type="dxa"/>
+              <w:right w:w="60" w:type="dxa"/>
+            </w:tcMar>
           </w:tcPr>
           <w:p>
             <w:pPr>
+              <w:keepNext/>
+              <w:keepLines/>
               <w:spacing w:after="20" w:before="20" w:line="240" w:lineRule="auto"/>
               <w:ind w:firstLine="0"/>
               <w:jc w:val="left"/>
@@ -2370,10 +2689,18 @@
         </w:tc>
         <w:tc>
           <w:tcPr>
-            <w:tcW w:type="dxa" w:w="1872"/>
+            <w:tcW w:type="dxa" w:w="792"/>
+            <w:tcMar>
+              <w:top w:w="40" w:type="dxa"/>
+              <w:left w:w="60" w:type="dxa"/>
+              <w:bottom w:w="40" w:type="dxa"/>
+              <w:right w:w="60" w:type="dxa"/>
+            </w:tcMar>
           </w:tcPr>
           <w:p>
             <w:pPr>
+              <w:keepNext/>
+              <w:keepLines/>
               <w:spacing w:after="20" w:before="20" w:line="240" w:lineRule="auto"/>
               <w:ind w:firstLine="0"/>
               <w:jc w:val="left"/>
@@ -2392,10 +2719,18 @@
         </w:tc>
         <w:tc>
           <w:tcPr>
-            <w:tcW w:type="dxa" w:w="1872"/>
+            <w:tcW w:type="dxa" w:w="1152"/>
+            <w:tcMar>
+              <w:top w:w="40" w:type="dxa"/>
+              <w:left w:w="60" w:type="dxa"/>
+              <w:bottom w:w="40" w:type="dxa"/>
+              <w:right w:w="60" w:type="dxa"/>
+            </w:tcMar>
           </w:tcPr>
           <w:p>
             <w:pPr>
+              <w:keepNext/>
+              <w:keepLines/>
               <w:spacing w:after="20" w:before="20" w:line="240" w:lineRule="auto"/>
               <w:ind w:firstLine="0"/>
               <w:jc w:val="left"/>
@@ -2414,12 +2749,23 @@
         </w:tc>
       </w:tr>
       <w:tr>
+        <w:trPr>
+          <w:cantSplit/>
+        </w:trPr>
         <w:tc>
           <w:tcPr>
-            <w:tcW w:type="dxa" w:w="1872"/>
+            <w:tcW w:type="dxa" w:w="1123"/>
+            <w:tcMar>
+              <w:top w:w="40" w:type="dxa"/>
+              <w:left w:w="60" w:type="dxa"/>
+              <w:bottom w:w="40" w:type="dxa"/>
+              <w:right w:w="60" w:type="dxa"/>
+            </w:tcMar>
           </w:tcPr>
           <w:p>
             <w:pPr>
+              <w:keepNext/>
+              <w:keepLines/>
               <w:spacing w:after="20" w:before="20" w:line="240" w:lineRule="auto"/>
               <w:ind w:firstLine="0"/>
               <w:jc w:val="left"/>
@@ -2438,10 +2784,18 @@
         </w:tc>
         <w:tc>
           <w:tcPr>
-            <w:tcW w:type="dxa" w:w="1872"/>
+            <w:tcW w:type="dxa" w:w="2952"/>
+            <w:tcMar>
+              <w:top w:w="40" w:type="dxa"/>
+              <w:left w:w="60" w:type="dxa"/>
+              <w:bottom w:w="40" w:type="dxa"/>
+              <w:right w:w="60" w:type="dxa"/>
+            </w:tcMar>
           </w:tcPr>
           <w:p>
             <w:pPr>
+              <w:keepNext/>
+              <w:keepLines/>
               <w:spacing w:after="20" w:before="20" w:line="240" w:lineRule="auto"/>
               <w:ind w:firstLine="0"/>
               <w:jc w:val="left"/>
@@ -2460,10 +2814,18 @@
         </w:tc>
         <w:tc>
           <w:tcPr>
-            <w:tcW w:type="dxa" w:w="1872"/>
+            <w:tcW w:type="dxa" w:w="2995"/>
+            <w:tcMar>
+              <w:top w:w="40" w:type="dxa"/>
+              <w:left w:w="60" w:type="dxa"/>
+              <w:bottom w:w="40" w:type="dxa"/>
+              <w:right w:w="60" w:type="dxa"/>
+            </w:tcMar>
           </w:tcPr>
           <w:p>
             <w:pPr>
+              <w:keepNext/>
+              <w:keepLines/>
               <w:spacing w:after="20" w:before="20" w:line="240" w:lineRule="auto"/>
               <w:ind w:firstLine="0"/>
               <w:jc w:val="left"/>
@@ -2482,10 +2844,18 @@
         </w:tc>
         <w:tc>
           <w:tcPr>
-            <w:tcW w:type="dxa" w:w="1872"/>
+            <w:tcW w:type="dxa" w:w="792"/>
+            <w:tcMar>
+              <w:top w:w="40" w:type="dxa"/>
+              <w:left w:w="60" w:type="dxa"/>
+              <w:bottom w:w="40" w:type="dxa"/>
+              <w:right w:w="60" w:type="dxa"/>
+            </w:tcMar>
           </w:tcPr>
           <w:p>
             <w:pPr>
+              <w:keepNext/>
+              <w:keepLines/>
               <w:spacing w:after="20" w:before="20" w:line="240" w:lineRule="auto"/>
               <w:ind w:firstLine="0"/>
               <w:jc w:val="left"/>
@@ -2504,10 +2874,18 @@
         </w:tc>
         <w:tc>
           <w:tcPr>
-            <w:tcW w:type="dxa" w:w="1872"/>
+            <w:tcW w:type="dxa" w:w="1152"/>
+            <w:tcMar>
+              <w:top w:w="40" w:type="dxa"/>
+              <w:left w:w="60" w:type="dxa"/>
+              <w:bottom w:w="40" w:type="dxa"/>
+              <w:right w:w="60" w:type="dxa"/>
+            </w:tcMar>
           </w:tcPr>
           <w:p>
             <w:pPr>
+              <w:keepNext/>
+              <w:keepLines/>
               <w:spacing w:after="20" w:before="20" w:line="240" w:lineRule="auto"/>
               <w:ind w:firstLine="0"/>
               <w:jc w:val="left"/>
@@ -2526,12 +2904,23 @@
         </w:tc>
       </w:tr>
       <w:tr>
+        <w:trPr>
+          <w:cantSplit/>
+        </w:trPr>
         <w:tc>
           <w:tcPr>
-            <w:tcW w:type="dxa" w:w="1872"/>
+            <w:tcW w:type="dxa" w:w="1123"/>
+            <w:tcMar>
+              <w:top w:w="40" w:type="dxa"/>
+              <w:left w:w="60" w:type="dxa"/>
+              <w:bottom w:w="40" w:type="dxa"/>
+              <w:right w:w="60" w:type="dxa"/>
+            </w:tcMar>
           </w:tcPr>
           <w:p>
             <w:pPr>
+              <w:keepNext/>
+              <w:keepLines/>
               <w:spacing w:after="20" w:before="20" w:line="240" w:lineRule="auto"/>
               <w:ind w:firstLine="0"/>
               <w:jc w:val="left"/>
@@ -2550,10 +2939,18 @@
         </w:tc>
         <w:tc>
           <w:tcPr>
-            <w:tcW w:type="dxa" w:w="1872"/>
+            <w:tcW w:type="dxa" w:w="2952"/>
+            <w:tcMar>
+              <w:top w:w="40" w:type="dxa"/>
+              <w:left w:w="60" w:type="dxa"/>
+              <w:bottom w:w="40" w:type="dxa"/>
+              <w:right w:w="60" w:type="dxa"/>
+            </w:tcMar>
           </w:tcPr>
           <w:p>
             <w:pPr>
+              <w:keepNext/>
+              <w:keepLines/>
               <w:spacing w:after="20" w:before="20" w:line="240" w:lineRule="auto"/>
               <w:ind w:firstLine="0"/>
               <w:jc w:val="left"/>
@@ -2572,10 +2969,18 @@
         </w:tc>
         <w:tc>
           <w:tcPr>
-            <w:tcW w:type="dxa" w:w="1872"/>
+            <w:tcW w:type="dxa" w:w="2995"/>
+            <w:tcMar>
+              <w:top w:w="40" w:type="dxa"/>
+              <w:left w:w="60" w:type="dxa"/>
+              <w:bottom w:w="40" w:type="dxa"/>
+              <w:right w:w="60" w:type="dxa"/>
+            </w:tcMar>
           </w:tcPr>
           <w:p>
             <w:pPr>
+              <w:keepNext/>
+              <w:keepLines/>
               <w:spacing w:after="20" w:before="20" w:line="240" w:lineRule="auto"/>
               <w:ind w:firstLine="0"/>
               <w:jc w:val="left"/>
@@ -2594,10 +2999,18 @@
         </w:tc>
         <w:tc>
           <w:tcPr>
-            <w:tcW w:type="dxa" w:w="1872"/>
+            <w:tcW w:type="dxa" w:w="792"/>
+            <w:tcMar>
+              <w:top w:w="40" w:type="dxa"/>
+              <w:left w:w="60" w:type="dxa"/>
+              <w:bottom w:w="40" w:type="dxa"/>
+              <w:right w:w="60" w:type="dxa"/>
+            </w:tcMar>
           </w:tcPr>
           <w:p>
             <w:pPr>
+              <w:keepNext/>
+              <w:keepLines/>
               <w:spacing w:after="20" w:before="20" w:line="240" w:lineRule="auto"/>
               <w:ind w:firstLine="0"/>
               <w:jc w:val="left"/>
@@ -2616,10 +3029,18 @@
         </w:tc>
         <w:tc>
           <w:tcPr>
-            <w:tcW w:type="dxa" w:w="1872"/>
+            <w:tcW w:type="dxa" w:w="1152"/>
+            <w:tcMar>
+              <w:top w:w="40" w:type="dxa"/>
+              <w:left w:w="60" w:type="dxa"/>
+              <w:bottom w:w="40" w:type="dxa"/>
+              <w:right w:w="60" w:type="dxa"/>
+            </w:tcMar>
           </w:tcPr>
           <w:p>
             <w:pPr>
+              <w:keepNext/>
+              <w:keepLines/>
               <w:spacing w:after="20" w:before="20" w:line="240" w:lineRule="auto"/>
               <w:ind w:firstLine="0"/>
               <w:jc w:val="left"/>
@@ -2638,12 +3059,23 @@
         </w:tc>
       </w:tr>
       <w:tr>
+        <w:trPr>
+          <w:cantSplit/>
+        </w:trPr>
         <w:tc>
           <w:tcPr>
-            <w:tcW w:type="dxa" w:w="1872"/>
+            <w:tcW w:type="dxa" w:w="1123"/>
+            <w:tcMar>
+              <w:top w:w="40" w:type="dxa"/>
+              <w:left w:w="60" w:type="dxa"/>
+              <w:bottom w:w="40" w:type="dxa"/>
+              <w:right w:w="60" w:type="dxa"/>
+            </w:tcMar>
           </w:tcPr>
           <w:p>
             <w:pPr>
+              <w:keepNext/>
+              <w:keepLines/>
               <w:spacing w:after="20" w:before="20" w:line="240" w:lineRule="auto"/>
               <w:ind w:firstLine="0"/>
               <w:jc w:val="left"/>
@@ -2662,10 +3094,18 @@
         </w:tc>
         <w:tc>
           <w:tcPr>
-            <w:tcW w:type="dxa" w:w="1872"/>
+            <w:tcW w:type="dxa" w:w="2952"/>
+            <w:tcMar>
+              <w:top w:w="40" w:type="dxa"/>
+              <w:left w:w="60" w:type="dxa"/>
+              <w:bottom w:w="40" w:type="dxa"/>
+              <w:right w:w="60" w:type="dxa"/>
+            </w:tcMar>
           </w:tcPr>
           <w:p>
             <w:pPr>
+              <w:keepNext/>
+              <w:keepLines/>
               <w:spacing w:after="20" w:before="20" w:line="240" w:lineRule="auto"/>
               <w:ind w:firstLine="0"/>
               <w:jc w:val="left"/>
@@ -2684,10 +3124,18 @@
         </w:tc>
         <w:tc>
           <w:tcPr>
-            <w:tcW w:type="dxa" w:w="1872"/>
+            <w:tcW w:type="dxa" w:w="2995"/>
+            <w:tcMar>
+              <w:top w:w="40" w:type="dxa"/>
+              <w:left w:w="60" w:type="dxa"/>
+              <w:bottom w:w="40" w:type="dxa"/>
+              <w:right w:w="60" w:type="dxa"/>
+            </w:tcMar>
           </w:tcPr>
           <w:p>
             <w:pPr>
+              <w:keepNext/>
+              <w:keepLines/>
               <w:spacing w:after="20" w:before="20" w:line="240" w:lineRule="auto"/>
               <w:ind w:firstLine="0"/>
               <w:jc w:val="left"/>
@@ -2706,10 +3154,18 @@
         </w:tc>
         <w:tc>
           <w:tcPr>
-            <w:tcW w:type="dxa" w:w="1872"/>
+            <w:tcW w:type="dxa" w:w="792"/>
+            <w:tcMar>
+              <w:top w:w="40" w:type="dxa"/>
+              <w:left w:w="60" w:type="dxa"/>
+              <w:bottom w:w="40" w:type="dxa"/>
+              <w:right w:w="60" w:type="dxa"/>
+            </w:tcMar>
           </w:tcPr>
           <w:p>
             <w:pPr>
+              <w:keepNext/>
+              <w:keepLines/>
               <w:spacing w:after="20" w:before="20" w:line="240" w:lineRule="auto"/>
               <w:ind w:firstLine="0"/>
               <w:jc w:val="left"/>
@@ -2728,10 +3184,18 @@
         </w:tc>
         <w:tc>
           <w:tcPr>
-            <w:tcW w:type="dxa" w:w="1872"/>
+            <w:tcW w:type="dxa" w:w="1152"/>
+            <w:tcMar>
+              <w:top w:w="40" w:type="dxa"/>
+              <w:left w:w="60" w:type="dxa"/>
+              <w:bottom w:w="40" w:type="dxa"/>
+              <w:right w:w="60" w:type="dxa"/>
+            </w:tcMar>
           </w:tcPr>
           <w:p>
             <w:pPr>
+              <w:keepNext/>
+              <w:keepLines/>
               <w:spacing w:after="20" w:before="20" w:line="240" w:lineRule="auto"/>
               <w:ind w:firstLine="0"/>
               <w:jc w:val="left"/>
@@ -2750,12 +3214,23 @@
         </w:tc>
       </w:tr>
       <w:tr>
+        <w:trPr>
+          <w:cantSplit/>
+        </w:trPr>
         <w:tc>
           <w:tcPr>
-            <w:tcW w:type="dxa" w:w="1872"/>
+            <w:tcW w:type="dxa" w:w="1123"/>
+            <w:tcMar>
+              <w:top w:w="40" w:type="dxa"/>
+              <w:left w:w="60" w:type="dxa"/>
+              <w:bottom w:w="40" w:type="dxa"/>
+              <w:right w:w="60" w:type="dxa"/>
+            </w:tcMar>
           </w:tcPr>
           <w:p>
             <w:pPr>
+              <w:keepNext/>
+              <w:keepLines/>
               <w:spacing w:after="20" w:before="20" w:line="240" w:lineRule="auto"/>
               <w:ind w:firstLine="0"/>
               <w:jc w:val="left"/>
@@ -2774,10 +3249,18 @@
         </w:tc>
         <w:tc>
           <w:tcPr>
-            <w:tcW w:type="dxa" w:w="1872"/>
+            <w:tcW w:type="dxa" w:w="2952"/>
+            <w:tcMar>
+              <w:top w:w="40" w:type="dxa"/>
+              <w:left w:w="60" w:type="dxa"/>
+              <w:bottom w:w="40" w:type="dxa"/>
+              <w:right w:w="60" w:type="dxa"/>
+            </w:tcMar>
           </w:tcPr>
           <w:p>
             <w:pPr>
+              <w:keepNext/>
+              <w:keepLines/>
               <w:spacing w:after="20" w:before="20" w:line="240" w:lineRule="auto"/>
               <w:ind w:firstLine="0"/>
               <w:jc w:val="left"/>
@@ -2796,10 +3279,18 @@
         </w:tc>
         <w:tc>
           <w:tcPr>
-            <w:tcW w:type="dxa" w:w="1872"/>
+            <w:tcW w:type="dxa" w:w="2995"/>
+            <w:tcMar>
+              <w:top w:w="40" w:type="dxa"/>
+              <w:left w:w="60" w:type="dxa"/>
+              <w:bottom w:w="40" w:type="dxa"/>
+              <w:right w:w="60" w:type="dxa"/>
+            </w:tcMar>
           </w:tcPr>
           <w:p>
             <w:pPr>
+              <w:keepNext/>
+              <w:keepLines/>
               <w:spacing w:after="20" w:before="20" w:line="240" w:lineRule="auto"/>
               <w:ind w:firstLine="0"/>
               <w:jc w:val="left"/>
@@ -2818,10 +3309,18 @@
         </w:tc>
         <w:tc>
           <w:tcPr>
-            <w:tcW w:type="dxa" w:w="1872"/>
+            <w:tcW w:type="dxa" w:w="792"/>
+            <w:tcMar>
+              <w:top w:w="40" w:type="dxa"/>
+              <w:left w:w="60" w:type="dxa"/>
+              <w:bottom w:w="40" w:type="dxa"/>
+              <w:right w:w="60" w:type="dxa"/>
+            </w:tcMar>
           </w:tcPr>
           <w:p>
             <w:pPr>
+              <w:keepNext/>
+              <w:keepLines/>
               <w:spacing w:after="20" w:before="20" w:line="240" w:lineRule="auto"/>
               <w:ind w:firstLine="0"/>
               <w:jc w:val="left"/>
@@ -2840,10 +3339,18 @@
         </w:tc>
         <w:tc>
           <w:tcPr>
-            <w:tcW w:type="dxa" w:w="1872"/>
+            <w:tcW w:type="dxa" w:w="1152"/>
+            <w:tcMar>
+              <w:top w:w="40" w:type="dxa"/>
+              <w:left w:w="60" w:type="dxa"/>
+              <w:bottom w:w="40" w:type="dxa"/>
+              <w:right w:w="60" w:type="dxa"/>
+            </w:tcMar>
           </w:tcPr>
           <w:p>
             <w:pPr>
+              <w:keepNext/>
+              <w:keepLines/>
               <w:spacing w:after="20" w:before="20" w:line="240" w:lineRule="auto"/>
               <w:ind w:firstLine="0"/>
               <w:jc w:val="left"/>
@@ -2862,12 +3369,23 @@
         </w:tc>
       </w:tr>
       <w:tr>
+        <w:trPr>
+          <w:cantSplit/>
+        </w:trPr>
         <w:tc>
           <w:tcPr>
-            <w:tcW w:type="dxa" w:w="1872"/>
+            <w:tcW w:type="dxa" w:w="1123"/>
+            <w:tcMar>
+              <w:top w:w="40" w:type="dxa"/>
+              <w:left w:w="60" w:type="dxa"/>
+              <w:bottom w:w="40" w:type="dxa"/>
+              <w:right w:w="60" w:type="dxa"/>
+            </w:tcMar>
           </w:tcPr>
           <w:p>
             <w:pPr>
+              <w:keepNext/>
+              <w:keepLines/>
               <w:spacing w:after="20" w:before="20" w:line="240" w:lineRule="auto"/>
               <w:ind w:firstLine="0"/>
               <w:jc w:val="left"/>
@@ -2886,10 +3404,18 @@
         </w:tc>
         <w:tc>
           <w:tcPr>
-            <w:tcW w:type="dxa" w:w="1872"/>
+            <w:tcW w:type="dxa" w:w="2952"/>
+            <w:tcMar>
+              <w:top w:w="40" w:type="dxa"/>
+              <w:left w:w="60" w:type="dxa"/>
+              <w:bottom w:w="40" w:type="dxa"/>
+              <w:right w:w="60" w:type="dxa"/>
+            </w:tcMar>
           </w:tcPr>
           <w:p>
             <w:pPr>
+              <w:keepNext/>
+              <w:keepLines/>
               <w:spacing w:after="20" w:before="20" w:line="240" w:lineRule="auto"/>
               <w:ind w:firstLine="0"/>
               <w:jc w:val="left"/>
@@ -2908,10 +3434,18 @@
         </w:tc>
         <w:tc>
           <w:tcPr>
-            <w:tcW w:type="dxa" w:w="1872"/>
+            <w:tcW w:type="dxa" w:w="2995"/>
+            <w:tcMar>
+              <w:top w:w="40" w:type="dxa"/>
+              <w:left w:w="60" w:type="dxa"/>
+              <w:bottom w:w="40" w:type="dxa"/>
+              <w:right w:w="60" w:type="dxa"/>
+            </w:tcMar>
           </w:tcPr>
           <w:p>
             <w:pPr>
+              <w:keepNext/>
+              <w:keepLines/>
               <w:spacing w:after="20" w:before="20" w:line="240" w:lineRule="auto"/>
               <w:ind w:firstLine="0"/>
               <w:jc w:val="left"/>
@@ -2930,10 +3464,18 @@
         </w:tc>
         <w:tc>
           <w:tcPr>
-            <w:tcW w:type="dxa" w:w="1872"/>
+            <w:tcW w:type="dxa" w:w="792"/>
+            <w:tcMar>
+              <w:top w:w="40" w:type="dxa"/>
+              <w:left w:w="60" w:type="dxa"/>
+              <w:bottom w:w="40" w:type="dxa"/>
+              <w:right w:w="60" w:type="dxa"/>
+            </w:tcMar>
           </w:tcPr>
           <w:p>
             <w:pPr>
+              <w:keepNext/>
+              <w:keepLines/>
               <w:spacing w:after="20" w:before="20" w:line="240" w:lineRule="auto"/>
               <w:ind w:firstLine="0"/>
               <w:jc w:val="left"/>
@@ -2952,10 +3494,18 @@
         </w:tc>
         <w:tc>
           <w:tcPr>
-            <w:tcW w:type="dxa" w:w="1872"/>
+            <w:tcW w:type="dxa" w:w="1152"/>
+            <w:tcMar>
+              <w:top w:w="40" w:type="dxa"/>
+              <w:left w:w="60" w:type="dxa"/>
+              <w:bottom w:w="40" w:type="dxa"/>
+              <w:right w:w="60" w:type="dxa"/>
+            </w:tcMar>
           </w:tcPr>
           <w:p>
             <w:pPr>
+              <w:keepNext/>
+              <w:keepLines/>
               <w:spacing w:after="20" w:before="20" w:line="240" w:lineRule="auto"/>
               <w:ind w:firstLine="0"/>
               <w:jc w:val="left"/>
@@ -2974,12 +3524,23 @@
         </w:tc>
       </w:tr>
       <w:tr>
+        <w:trPr>
+          <w:cantSplit/>
+        </w:trPr>
         <w:tc>
           <w:tcPr>
-            <w:tcW w:type="dxa" w:w="1872"/>
+            <w:tcW w:type="dxa" w:w="1123"/>
+            <w:tcMar>
+              <w:top w:w="40" w:type="dxa"/>
+              <w:left w:w="60" w:type="dxa"/>
+              <w:bottom w:w="40" w:type="dxa"/>
+              <w:right w:w="60" w:type="dxa"/>
+            </w:tcMar>
           </w:tcPr>
           <w:p>
             <w:pPr>
+              <w:keepNext/>
+              <w:keepLines/>
               <w:spacing w:after="20" w:before="20" w:line="240" w:lineRule="auto"/>
               <w:ind w:firstLine="0"/>
               <w:jc w:val="left"/>
@@ -2998,10 +3559,18 @@
         </w:tc>
         <w:tc>
           <w:tcPr>
-            <w:tcW w:type="dxa" w:w="1872"/>
+            <w:tcW w:type="dxa" w:w="2952"/>
+            <w:tcMar>
+              <w:top w:w="40" w:type="dxa"/>
+              <w:left w:w="60" w:type="dxa"/>
+              <w:bottom w:w="40" w:type="dxa"/>
+              <w:right w:w="60" w:type="dxa"/>
+            </w:tcMar>
           </w:tcPr>
           <w:p>
             <w:pPr>
+              <w:keepNext/>
+              <w:keepLines/>
               <w:spacing w:after="20" w:before="20" w:line="240" w:lineRule="auto"/>
               <w:ind w:firstLine="0"/>
               <w:jc w:val="left"/>
@@ -3020,10 +3589,18 @@
         </w:tc>
         <w:tc>
           <w:tcPr>
-            <w:tcW w:type="dxa" w:w="1872"/>
+            <w:tcW w:type="dxa" w:w="2995"/>
+            <w:tcMar>
+              <w:top w:w="40" w:type="dxa"/>
+              <w:left w:w="60" w:type="dxa"/>
+              <w:bottom w:w="40" w:type="dxa"/>
+              <w:right w:w="60" w:type="dxa"/>
+            </w:tcMar>
           </w:tcPr>
           <w:p>
             <w:pPr>
+              <w:keepNext/>
+              <w:keepLines/>
               <w:spacing w:after="20" w:before="20" w:line="240" w:lineRule="auto"/>
               <w:ind w:firstLine="0"/>
               <w:jc w:val="left"/>
@@ -3042,10 +3619,18 @@
         </w:tc>
         <w:tc>
           <w:tcPr>
-            <w:tcW w:type="dxa" w:w="1872"/>
+            <w:tcW w:type="dxa" w:w="792"/>
+            <w:tcMar>
+              <w:top w:w="40" w:type="dxa"/>
+              <w:left w:w="60" w:type="dxa"/>
+              <w:bottom w:w="40" w:type="dxa"/>
+              <w:right w:w="60" w:type="dxa"/>
+            </w:tcMar>
           </w:tcPr>
           <w:p>
             <w:pPr>
+              <w:keepNext/>
+              <w:keepLines/>
               <w:spacing w:after="20" w:before="20" w:line="240" w:lineRule="auto"/>
               <w:ind w:firstLine="0"/>
               <w:jc w:val="left"/>
@@ -3064,10 +3649,18 @@
         </w:tc>
         <w:tc>
           <w:tcPr>
-            <w:tcW w:type="dxa" w:w="1872"/>
+            <w:tcW w:type="dxa" w:w="1152"/>
+            <w:tcMar>
+              <w:top w:w="40" w:type="dxa"/>
+              <w:left w:w="60" w:type="dxa"/>
+              <w:bottom w:w="40" w:type="dxa"/>
+              <w:right w:w="60" w:type="dxa"/>
+            </w:tcMar>
           </w:tcPr>
           <w:p>
             <w:pPr>
+              <w:keepNext/>
+              <w:keepLines/>
               <w:spacing w:after="20" w:before="20" w:line="240" w:lineRule="auto"/>
               <w:ind w:firstLine="0"/>
               <w:jc w:val="left"/>
@@ -3086,12 +3679,23 @@
         </w:tc>
       </w:tr>
       <w:tr>
+        <w:trPr>
+          <w:cantSplit/>
+        </w:trPr>
         <w:tc>
           <w:tcPr>
-            <w:tcW w:type="dxa" w:w="1872"/>
+            <w:tcW w:type="dxa" w:w="1123"/>
+            <w:tcMar>
+              <w:top w:w="40" w:type="dxa"/>
+              <w:left w:w="60" w:type="dxa"/>
+              <w:bottom w:w="40" w:type="dxa"/>
+              <w:right w:w="60" w:type="dxa"/>
+            </w:tcMar>
           </w:tcPr>
           <w:p>
             <w:pPr>
+              <w:keepNext/>
+              <w:keepLines/>
               <w:spacing w:after="20" w:before="20" w:line="240" w:lineRule="auto"/>
               <w:ind w:firstLine="0"/>
               <w:jc w:val="left"/>
@@ -3110,10 +3714,18 @@
         </w:tc>
         <w:tc>
           <w:tcPr>
-            <w:tcW w:type="dxa" w:w="1872"/>
+            <w:tcW w:type="dxa" w:w="2952"/>
+            <w:tcMar>
+              <w:top w:w="40" w:type="dxa"/>
+              <w:left w:w="60" w:type="dxa"/>
+              <w:bottom w:w="40" w:type="dxa"/>
+              <w:right w:w="60" w:type="dxa"/>
+            </w:tcMar>
           </w:tcPr>
           <w:p>
             <w:pPr>
+              <w:keepNext/>
+              <w:keepLines/>
               <w:spacing w:after="20" w:before="20" w:line="240" w:lineRule="auto"/>
               <w:ind w:firstLine="0"/>
               <w:jc w:val="left"/>
@@ -3132,10 +3744,18 @@
         </w:tc>
         <w:tc>
           <w:tcPr>
-            <w:tcW w:type="dxa" w:w="1872"/>
+            <w:tcW w:type="dxa" w:w="2995"/>
+            <w:tcMar>
+              <w:top w:w="40" w:type="dxa"/>
+              <w:left w:w="60" w:type="dxa"/>
+              <w:bottom w:w="40" w:type="dxa"/>
+              <w:right w:w="60" w:type="dxa"/>
+            </w:tcMar>
           </w:tcPr>
           <w:p>
             <w:pPr>
+              <w:keepNext/>
+              <w:keepLines/>
               <w:spacing w:after="20" w:before="20" w:line="240" w:lineRule="auto"/>
               <w:ind w:firstLine="0"/>
               <w:jc w:val="left"/>
@@ -3154,10 +3774,18 @@
         </w:tc>
         <w:tc>
           <w:tcPr>
-            <w:tcW w:type="dxa" w:w="1872"/>
+            <w:tcW w:type="dxa" w:w="792"/>
+            <w:tcMar>
+              <w:top w:w="40" w:type="dxa"/>
+              <w:left w:w="60" w:type="dxa"/>
+              <w:bottom w:w="40" w:type="dxa"/>
+              <w:right w:w="60" w:type="dxa"/>
+            </w:tcMar>
           </w:tcPr>
           <w:p>
             <w:pPr>
+              <w:keepNext/>
+              <w:keepLines/>
               <w:spacing w:after="20" w:before="20" w:line="240" w:lineRule="auto"/>
               <w:ind w:firstLine="0"/>
               <w:jc w:val="left"/>
@@ -3176,10 +3804,18 @@
         </w:tc>
         <w:tc>
           <w:tcPr>
-            <w:tcW w:type="dxa" w:w="1872"/>
+            <w:tcW w:type="dxa" w:w="1152"/>
+            <w:tcMar>
+              <w:top w:w="40" w:type="dxa"/>
+              <w:left w:w="60" w:type="dxa"/>
+              <w:bottom w:w="40" w:type="dxa"/>
+              <w:right w:w="60" w:type="dxa"/>
+            </w:tcMar>
           </w:tcPr>
           <w:p>
             <w:pPr>
+              <w:keepNext/>
+              <w:keepLines/>
               <w:spacing w:after="20" w:before="20" w:line="240" w:lineRule="auto"/>
               <w:ind w:firstLine="0"/>
               <w:jc w:val="left"/>
@@ -3198,12 +3834,23 @@
         </w:tc>
       </w:tr>
       <w:tr>
+        <w:trPr>
+          <w:cantSplit/>
+        </w:trPr>
         <w:tc>
           <w:tcPr>
-            <w:tcW w:type="dxa" w:w="1872"/>
+            <w:tcW w:type="dxa" w:w="1123"/>
+            <w:tcMar>
+              <w:top w:w="40" w:type="dxa"/>
+              <w:left w:w="60" w:type="dxa"/>
+              <w:bottom w:w="40" w:type="dxa"/>
+              <w:right w:w="60" w:type="dxa"/>
+            </w:tcMar>
           </w:tcPr>
           <w:p>
             <w:pPr>
+              <w:keepNext/>
+              <w:keepLines/>
               <w:spacing w:after="20" w:before="20" w:line="240" w:lineRule="auto"/>
               <w:ind w:firstLine="0"/>
               <w:jc w:val="left"/>
@@ -3222,10 +3869,18 @@
         </w:tc>
         <w:tc>
           <w:tcPr>
-            <w:tcW w:type="dxa" w:w="1872"/>
+            <w:tcW w:type="dxa" w:w="2952"/>
+            <w:tcMar>
+              <w:top w:w="40" w:type="dxa"/>
+              <w:left w:w="60" w:type="dxa"/>
+              <w:bottom w:w="40" w:type="dxa"/>
+              <w:right w:w="60" w:type="dxa"/>
+            </w:tcMar>
           </w:tcPr>
           <w:p>
             <w:pPr>
+              <w:keepNext/>
+              <w:keepLines/>
               <w:spacing w:after="20" w:before="20" w:line="240" w:lineRule="auto"/>
               <w:ind w:firstLine="0"/>
               <w:jc w:val="left"/>
@@ -3244,10 +3899,18 @@
         </w:tc>
         <w:tc>
           <w:tcPr>
-            <w:tcW w:type="dxa" w:w="1872"/>
+            <w:tcW w:type="dxa" w:w="2995"/>
+            <w:tcMar>
+              <w:top w:w="40" w:type="dxa"/>
+              <w:left w:w="60" w:type="dxa"/>
+              <w:bottom w:w="40" w:type="dxa"/>
+              <w:right w:w="60" w:type="dxa"/>
+            </w:tcMar>
           </w:tcPr>
           <w:p>
             <w:pPr>
+              <w:keepNext/>
+              <w:keepLines/>
               <w:spacing w:after="20" w:before="20" w:line="240" w:lineRule="auto"/>
               <w:ind w:firstLine="0"/>
               <w:jc w:val="left"/>
@@ -3266,10 +3929,18 @@
         </w:tc>
         <w:tc>
           <w:tcPr>
-            <w:tcW w:type="dxa" w:w="1872"/>
+            <w:tcW w:type="dxa" w:w="792"/>
+            <w:tcMar>
+              <w:top w:w="40" w:type="dxa"/>
+              <w:left w:w="60" w:type="dxa"/>
+              <w:bottom w:w="40" w:type="dxa"/>
+              <w:right w:w="60" w:type="dxa"/>
+            </w:tcMar>
           </w:tcPr>
           <w:p>
             <w:pPr>
+              <w:keepNext/>
+              <w:keepLines/>
               <w:spacing w:after="20" w:before="20" w:line="240" w:lineRule="auto"/>
               <w:ind w:firstLine="0"/>
               <w:jc w:val="left"/>
@@ -3288,10 +3959,18 @@
         </w:tc>
         <w:tc>
           <w:tcPr>
-            <w:tcW w:type="dxa" w:w="1872"/>
+            <w:tcW w:type="dxa" w:w="1152"/>
+            <w:tcMar>
+              <w:top w:w="40" w:type="dxa"/>
+              <w:left w:w="60" w:type="dxa"/>
+              <w:bottom w:w="40" w:type="dxa"/>
+              <w:right w:w="60" w:type="dxa"/>
+            </w:tcMar>
           </w:tcPr>
           <w:p>
             <w:pPr>
+              <w:keepNext/>
+              <w:keepLines/>
               <w:spacing w:after="20" w:before="20" w:line="240" w:lineRule="auto"/>
               <w:ind w:firstLine="0"/>
               <w:jc w:val="left"/>
@@ -3310,12 +3989,22 @@
         </w:tc>
       </w:tr>
       <w:tr>
+        <w:trPr>
+          <w:cantSplit/>
+        </w:trPr>
         <w:tc>
           <w:tcPr>
-            <w:tcW w:type="dxa" w:w="1872"/>
+            <w:tcW w:type="dxa" w:w="1123"/>
+            <w:tcMar>
+              <w:top w:w="40" w:type="dxa"/>
+              <w:left w:w="60" w:type="dxa"/>
+              <w:bottom w:w="40" w:type="dxa"/>
+              <w:right w:w="60" w:type="dxa"/>
+            </w:tcMar>
           </w:tcPr>
           <w:p>
             <w:pPr>
+              <w:keepLines/>
               <w:spacing w:after="20" w:before="20" w:line="240" w:lineRule="auto"/>
               <w:ind w:firstLine="0"/>
               <w:jc w:val="left"/>
@@ -3334,10 +4023,17 @@
         </w:tc>
         <w:tc>
           <w:tcPr>
-            <w:tcW w:type="dxa" w:w="1872"/>
+            <w:tcW w:type="dxa" w:w="2952"/>
+            <w:tcMar>
+              <w:top w:w="40" w:type="dxa"/>
+              <w:left w:w="60" w:type="dxa"/>
+              <w:bottom w:w="40" w:type="dxa"/>
+              <w:right w:w="60" w:type="dxa"/>
+            </w:tcMar>
           </w:tcPr>
           <w:p>
             <w:pPr>
+              <w:keepLines/>
               <w:spacing w:after="20" w:before="20" w:line="240" w:lineRule="auto"/>
               <w:ind w:firstLine="0"/>
               <w:jc w:val="left"/>
@@ -3356,10 +4052,17 @@
         </w:tc>
         <w:tc>
           <w:tcPr>
-            <w:tcW w:type="dxa" w:w="1872"/>
+            <w:tcW w:type="dxa" w:w="2995"/>
+            <w:tcMar>
+              <w:top w:w="40" w:type="dxa"/>
+              <w:left w:w="60" w:type="dxa"/>
+              <w:bottom w:w="40" w:type="dxa"/>
+              <w:right w:w="60" w:type="dxa"/>
+            </w:tcMar>
           </w:tcPr>
           <w:p>
             <w:pPr>
+              <w:keepLines/>
               <w:spacing w:after="20" w:before="20" w:line="240" w:lineRule="auto"/>
               <w:ind w:firstLine="0"/>
               <w:jc w:val="left"/>
@@ -3378,10 +4081,17 @@
         </w:tc>
         <w:tc>
           <w:tcPr>
-            <w:tcW w:type="dxa" w:w="1872"/>
+            <w:tcW w:type="dxa" w:w="792"/>
+            <w:tcMar>
+              <w:top w:w="40" w:type="dxa"/>
+              <w:left w:w="60" w:type="dxa"/>
+              <w:bottom w:w="40" w:type="dxa"/>
+              <w:right w:w="60" w:type="dxa"/>
+            </w:tcMar>
           </w:tcPr>
           <w:p>
             <w:pPr>
+              <w:keepLines/>
               <w:spacing w:after="20" w:before="20" w:line="240" w:lineRule="auto"/>
               <w:ind w:firstLine="0"/>
               <w:jc w:val="left"/>
@@ -3400,10 +4110,17 @@
         </w:tc>
         <w:tc>
           <w:tcPr>
-            <w:tcW w:type="dxa" w:w="1872"/>
+            <w:tcW w:type="dxa" w:w="1152"/>
+            <w:tcMar>
+              <w:top w:w="40" w:type="dxa"/>
+              <w:left w:w="60" w:type="dxa"/>
+              <w:bottom w:w="40" w:type="dxa"/>
+              <w:right w:w="60" w:type="dxa"/>
+            </w:tcMar>
           </w:tcPr>
           <w:p>
             <w:pPr>
+              <w:keepLines/>
               <w:spacing w:after="20" w:before="20" w:line="240" w:lineRule="auto"/>
               <w:ind w:firstLine="0"/>
               <w:jc w:val="left"/>
@@ -3422,9 +4139,16 @@
         </w:tc>
       </w:tr>
     </w:tbl>
-    <w:p/>
     <w:p>
       <w:pPr>
+        <w:spacing w:after="120" w:before="0" w:line="240" w:lineRule="auto"/>
+        <w:ind w:firstLine="0"/>
+        <w:jc w:val="left"/>
+      </w:pPr>
+    </w:p>
+    <w:p>
+      <w:pPr>
+        <w:pageBreakBefore/>
         <w:spacing w:after="160" w:before="0" w:line="240" w:lineRule="auto"/>
         <w:ind w:firstLine="720"/>
         <w:jc w:val="both"/>
@@ -3457,7 +4181,9 @@
     </w:p>
     <w:p>
       <w:pPr>
-        <w:spacing w:after="120" w:before="160" w:line="240" w:lineRule="auto"/>
+        <w:keepNext/>
+        <w:pageBreakBefore/>
+        <w:spacing w:after="120" w:before="0" w:line="240" w:lineRule="auto"/>
         <w:ind w:firstLine="0"/>
         <w:jc w:val="left"/>
       </w:pPr>
@@ -3473,6 +4199,8 @@
     </w:p>
     <w:p>
       <w:pPr>
+        <w:keepNext/>
+        <w:keepLines/>
         <w:spacing w:after="200" w:before="120" w:line="240" w:lineRule="auto"/>
         <w:ind w:firstLine="0"/>
         <w:jc w:val="left"/>
@@ -3490,24 +4218,38 @@
     <w:tbl>
       <w:tblPr>
         <w:tblStyle w:val="TableGrid"/>
-        <w:tblW w:type="auto" w:w="0"/>
+        <w:tblLayout w:type="fixed"/>
         <w:tblLook w:firstColumn="1" w:firstRow="1" w:lastColumn="0" w:lastRow="0" w:noHBand="0" w:noVBand="1" w:val="04A0"/>
+        <w:tblW w:w="5000" w:type="pct"/>
+        <w:tblLayout w:type="fixed"/>
       </w:tblPr>
       <w:tblGrid>
-        <w:gridCol w:w="1872"/>
-        <w:gridCol w:w="1872"/>
-        <w:gridCol w:w="1872"/>
-        <w:gridCol w:w="1872"/>
-        <w:gridCol w:w="1872"/>
+        <w:gridCol w:w="2160"/>
+        <w:gridCol w:w="1713"/>
+        <w:gridCol w:w="1713"/>
+        <w:gridCol w:w="1713"/>
+        <w:gridCol w:w="1713"/>
       </w:tblGrid>
       <w:tr>
+        <w:trPr>
+          <w:cantSplit/>
+          <w:tblHeader/>
+        </w:trPr>
         <w:tc>
           <w:tcPr>
-            <w:tcW w:type="dxa" w:w="1872"/>
+            <w:tcW w:type="dxa" w:w="2160"/>
+            <w:tcMar>
+              <w:top w:w="40" w:type="dxa"/>
+              <w:left w:w="60" w:type="dxa"/>
+              <w:bottom w:w="40" w:type="dxa"/>
+              <w:right w:w="60" w:type="dxa"/>
+            </w:tcMar>
           </w:tcPr>
           <w:p>
             <w:pPr>
-              <w:spacing w:after="40" w:before="40" w:line="240" w:lineRule="auto"/>
+              <w:keepNext/>
+              <w:keepLines/>
+              <w:spacing w:after="20" w:before="20" w:line="240" w:lineRule="auto"/>
               <w:ind w:firstLine="0"/>
               <w:jc w:val="left"/>
             </w:pPr>
@@ -3517,7 +4259,7 @@
                 <w:rFonts w:ascii="Times New Roman" w:hAnsi="Times New Roman" w:eastAsia="Times New Roman"/>
                 <w:b/>
                 <w:i w:val="0"/>
-                <w:sz w:val="20"/>
+                <w:sz w:val="18"/>
               </w:rPr>
               <w:t>Outcome and exposure</w:t>
             </w:r>
@@ -3525,11 +4267,19 @@
         </w:tc>
         <w:tc>
           <w:tcPr>
-            <w:tcW w:type="dxa" w:w="1872"/>
+            <w:tcW w:type="dxa" w:w="1714"/>
+            <w:tcMar>
+              <w:top w:w="40" w:type="dxa"/>
+              <w:left w:w="60" w:type="dxa"/>
+              <w:bottom w:w="40" w:type="dxa"/>
+              <w:right w:w="60" w:type="dxa"/>
+            </w:tcMar>
           </w:tcPr>
           <w:p>
             <w:pPr>
-              <w:spacing w:after="40" w:before="40" w:line="240" w:lineRule="auto"/>
+              <w:keepNext/>
+              <w:keepLines/>
+              <w:spacing w:after="20" w:before="20" w:line="240" w:lineRule="auto"/>
               <w:ind w:firstLine="0"/>
               <w:jc w:val="left"/>
             </w:pPr>
@@ -3539,7 +4289,7 @@
                 <w:rFonts w:ascii="Times New Roman" w:hAnsi="Times New Roman" w:eastAsia="Times New Roman"/>
                 <w:b/>
                 <w:i w:val="0"/>
-                <w:sz w:val="20"/>
+                <w:sz w:val="18"/>
               </w:rPr>
               <w:t>Model</w:t>
             </w:r>
@@ -3547,11 +4297,19 @@
         </w:tc>
         <w:tc>
           <w:tcPr>
-            <w:tcW w:type="dxa" w:w="1872"/>
+            <w:tcW w:type="dxa" w:w="1714"/>
+            <w:tcMar>
+              <w:top w:w="40" w:type="dxa"/>
+              <w:left w:w="60" w:type="dxa"/>
+              <w:bottom w:w="40" w:type="dxa"/>
+              <w:right w:w="60" w:type="dxa"/>
+            </w:tcMar>
           </w:tcPr>
           <w:p>
             <w:pPr>
-              <w:spacing w:after="40" w:before="40" w:line="240" w:lineRule="auto"/>
+              <w:keepNext/>
+              <w:keepLines/>
+              <w:spacing w:after="20" w:before="20" w:line="240" w:lineRule="auto"/>
               <w:ind w:firstLine="0"/>
               <w:jc w:val="left"/>
             </w:pPr>
@@ -3561,7 +4319,7 @@
                 <w:rFonts w:ascii="Times New Roman" w:hAnsi="Times New Roman" w:eastAsia="Times New Roman"/>
                 <w:b/>
                 <w:i w:val="0"/>
-                <w:sz w:val="20"/>
+                <w:sz w:val="18"/>
               </w:rPr>
               <w:t>HC1</w:t>
             </w:r>
@@ -3569,11 +4327,19 @@
         </w:tc>
         <w:tc>
           <w:tcPr>
-            <w:tcW w:type="dxa" w:w="1872"/>
+            <w:tcW w:type="dxa" w:w="1714"/>
+            <w:tcMar>
+              <w:top w:w="40" w:type="dxa"/>
+              <w:left w:w="60" w:type="dxa"/>
+              <w:bottom w:w="40" w:type="dxa"/>
+              <w:right w:w="60" w:type="dxa"/>
+            </w:tcMar>
           </w:tcPr>
           <w:p>
             <w:pPr>
-              <w:spacing w:after="40" w:before="40" w:line="240" w:lineRule="auto"/>
+              <w:keepNext/>
+              <w:keepLines/>
+              <w:spacing w:after="20" w:before="20" w:line="240" w:lineRule="auto"/>
               <w:ind w:firstLine="0"/>
               <w:jc w:val="left"/>
             </w:pPr>
@@ -3583,7 +4349,7 @@
                 <w:rFonts w:ascii="Times New Roman" w:hAnsi="Times New Roman" w:eastAsia="Times New Roman"/>
                 <w:b/>
                 <w:i w:val="0"/>
-                <w:sz w:val="20"/>
+                <w:sz w:val="18"/>
               </w:rPr>
               <w:t>NW3</w:t>
             </w:r>
@@ -3591,11 +4357,19 @@
         </w:tc>
         <w:tc>
           <w:tcPr>
-            <w:tcW w:type="dxa" w:w="1872"/>
+            <w:tcW w:type="dxa" w:w="1714"/>
+            <w:tcMar>
+              <w:top w:w="40" w:type="dxa"/>
+              <w:left w:w="60" w:type="dxa"/>
+              <w:bottom w:w="40" w:type="dxa"/>
+              <w:right w:w="60" w:type="dxa"/>
+            </w:tcMar>
           </w:tcPr>
           <w:p>
             <w:pPr>
-              <w:spacing w:after="40" w:before="40" w:line="240" w:lineRule="auto"/>
+              <w:keepNext/>
+              <w:keepLines/>
+              <w:spacing w:after="20" w:before="20" w:line="240" w:lineRule="auto"/>
               <w:ind w:firstLine="0"/>
               <w:jc w:val="left"/>
             </w:pPr>
@@ -3605,7 +4379,7 @@
                 <w:rFonts w:ascii="Times New Roman" w:hAnsi="Times New Roman" w:eastAsia="Times New Roman"/>
                 <w:b/>
                 <w:i w:val="0"/>
-                <w:sz w:val="20"/>
+                <w:sz w:val="18"/>
               </w:rPr>
               <w:t>NW6</w:t>
             </w:r>
@@ -3613,12 +4387,23 @@
         </w:tc>
       </w:tr>
       <w:tr>
+        <w:trPr>
+          <w:cantSplit/>
+        </w:trPr>
         <w:tc>
           <w:tcPr>
-            <w:tcW w:type="dxa" w:w="1872"/>
+            <w:tcW w:type="dxa" w:w="2160"/>
+            <w:tcMar>
+              <w:top w:w="40" w:type="dxa"/>
+              <w:left w:w="60" w:type="dxa"/>
+              <w:bottom w:w="40" w:type="dxa"/>
+              <w:right w:w="60" w:type="dxa"/>
+            </w:tcMar>
           </w:tcPr>
           <w:p>
             <w:pPr>
+              <w:keepNext/>
+              <w:keepLines/>
               <w:spacing w:after="20" w:before="20" w:line="240" w:lineRule="auto"/>
               <w:ind w:firstLine="0"/>
               <w:jc w:val="left"/>
@@ -3629,7 +4414,7 @@
                 <w:rFonts w:ascii="Times New Roman" w:hAnsi="Times New Roman" w:eastAsia="Times New Roman"/>
                 <w:b w:val="0"/>
                 <w:i w:val="0"/>
-                <w:sz w:val="20"/>
+                <w:sz w:val="18"/>
               </w:rPr>
               <w:t>CHD hot nights / 5 days</w:t>
             </w:r>
@@ -3637,10 +4422,18 @@
         </w:tc>
         <w:tc>
           <w:tcPr>
-            <w:tcW w:type="dxa" w:w="1872"/>
+            <w:tcW w:type="dxa" w:w="1714"/>
+            <w:tcMar>
+              <w:top w:w="40" w:type="dxa"/>
+              <w:left w:w="60" w:type="dxa"/>
+              <w:bottom w:w="40" w:type="dxa"/>
+              <w:right w:w="60" w:type="dxa"/>
+            </w:tcMar>
           </w:tcPr>
           <w:p>
             <w:pPr>
+              <w:keepNext/>
+              <w:keepLines/>
               <w:spacing w:after="20" w:before="20" w:line="240" w:lineRule="auto"/>
               <w:ind w:firstLine="0"/>
               <w:jc w:val="left"/>
@@ -3651,7 +4444,7 @@
                 <w:rFonts w:ascii="Times New Roman" w:hAnsi="Times New Roman" w:eastAsia="Times New Roman"/>
                 <w:b w:val="0"/>
                 <w:i w:val="0"/>
-                <w:sz w:val="20"/>
+                <w:sz w:val="18"/>
               </w:rPr>
               <w:t>1.022 (0.995–1.049)</w:t>
             </w:r>
@@ -3659,10 +4452,18 @@
         </w:tc>
         <w:tc>
           <w:tcPr>
-            <w:tcW w:type="dxa" w:w="1872"/>
+            <w:tcW w:type="dxa" w:w="1714"/>
+            <w:tcMar>
+              <w:top w:w="40" w:type="dxa"/>
+              <w:left w:w="60" w:type="dxa"/>
+              <w:bottom w:w="40" w:type="dxa"/>
+              <w:right w:w="60" w:type="dxa"/>
+            </w:tcMar>
           </w:tcPr>
           <w:p>
             <w:pPr>
+              <w:keepNext/>
+              <w:keepLines/>
               <w:spacing w:after="20" w:before="20" w:line="240" w:lineRule="auto"/>
               <w:ind w:firstLine="0"/>
               <w:jc w:val="left"/>
@@ -3673,7 +4474,7 @@
                 <w:rFonts w:ascii="Times New Roman" w:hAnsi="Times New Roman" w:eastAsia="Times New Roman"/>
                 <w:b w:val="0"/>
                 <w:i w:val="0"/>
-                <w:sz w:val="20"/>
+                <w:sz w:val="18"/>
               </w:rPr>
               <w:t>1.022 (0.997–1.047)</w:t>
             </w:r>
@@ -3681,10 +4482,18 @@
         </w:tc>
         <w:tc>
           <w:tcPr>
-            <w:tcW w:type="dxa" w:w="1872"/>
+            <w:tcW w:type="dxa" w:w="1714"/>
+            <w:tcMar>
+              <w:top w:w="40" w:type="dxa"/>
+              <w:left w:w="60" w:type="dxa"/>
+              <w:bottom w:w="40" w:type="dxa"/>
+              <w:right w:w="60" w:type="dxa"/>
+            </w:tcMar>
           </w:tcPr>
           <w:p>
             <w:pPr>
+              <w:keepNext/>
+              <w:keepLines/>
               <w:spacing w:after="20" w:before="20" w:line="240" w:lineRule="auto"/>
               <w:ind w:firstLine="0"/>
               <w:jc w:val="left"/>
@@ -3695,7 +4504,7 @@
                 <w:rFonts w:ascii="Times New Roman" w:hAnsi="Times New Roman" w:eastAsia="Times New Roman"/>
                 <w:b w:val="0"/>
                 <w:i w:val="0"/>
-                <w:sz w:val="20"/>
+                <w:sz w:val="18"/>
               </w:rPr>
               <w:t>1.022 (1.0003–1.0439)</w:t>
             </w:r>
@@ -3703,10 +4512,18 @@
         </w:tc>
         <w:tc>
           <w:tcPr>
-            <w:tcW w:type="dxa" w:w="1872"/>
+            <w:tcW w:type="dxa" w:w="1714"/>
+            <w:tcMar>
+              <w:top w:w="40" w:type="dxa"/>
+              <w:left w:w="60" w:type="dxa"/>
+              <w:bottom w:w="40" w:type="dxa"/>
+              <w:right w:w="60" w:type="dxa"/>
+            </w:tcMar>
           </w:tcPr>
           <w:p>
             <w:pPr>
+              <w:keepNext/>
+              <w:keepLines/>
               <w:spacing w:after="20" w:before="20" w:line="240" w:lineRule="auto"/>
               <w:ind w:firstLine="0"/>
               <w:jc w:val="left"/>
@@ -3717,7 +4534,7 @@
                 <w:rFonts w:ascii="Times New Roman" w:hAnsi="Times New Roman" w:eastAsia="Times New Roman"/>
                 <w:b w:val="0"/>
                 <w:i w:val="0"/>
-                <w:sz w:val="20"/>
+                <w:sz w:val="18"/>
               </w:rPr>
               <w:t>1.022 (1.002–1.042)</w:t>
             </w:r>
@@ -3725,12 +4542,22 @@
         </w:tc>
       </w:tr>
       <w:tr>
+        <w:trPr>
+          <w:cantSplit/>
+        </w:trPr>
         <w:tc>
           <w:tcPr>
-            <w:tcW w:type="dxa" w:w="1872"/>
+            <w:tcW w:type="dxa" w:w="2160"/>
+            <w:tcMar>
+              <w:top w:w="40" w:type="dxa"/>
+              <w:left w:w="60" w:type="dxa"/>
+              <w:bottom w:w="40" w:type="dxa"/>
+              <w:right w:w="60" w:type="dxa"/>
+            </w:tcMar>
           </w:tcPr>
           <w:p>
             <w:pPr>
+              <w:keepLines/>
               <w:spacing w:after="20" w:before="20" w:line="240" w:lineRule="auto"/>
               <w:ind w:firstLine="0"/>
               <w:jc w:val="left"/>
@@ -3741,7 +4568,7 @@
                 <w:rFonts w:ascii="Times New Roman" w:hAnsi="Times New Roman" w:eastAsia="Times New Roman"/>
                 <w:b w:val="0"/>
                 <w:i w:val="0"/>
-                <w:sz w:val="20"/>
+                <w:sz w:val="18"/>
               </w:rPr>
               <w:t>HF cold days / 5 days</w:t>
             </w:r>
@@ -3749,10 +4576,17 @@
         </w:tc>
         <w:tc>
           <w:tcPr>
-            <w:tcW w:type="dxa" w:w="1872"/>
+            <w:tcW w:type="dxa" w:w="1714"/>
+            <w:tcMar>
+              <w:top w:w="40" w:type="dxa"/>
+              <w:left w:w="60" w:type="dxa"/>
+              <w:bottom w:w="40" w:type="dxa"/>
+              <w:right w:w="60" w:type="dxa"/>
+            </w:tcMar>
           </w:tcPr>
           <w:p>
             <w:pPr>
+              <w:keepLines/>
               <w:spacing w:after="20" w:before="20" w:line="240" w:lineRule="auto"/>
               <w:ind w:firstLine="0"/>
               <w:jc w:val="left"/>
@@ -3763,7 +4597,7 @@
                 <w:rFonts w:ascii="Times New Roman" w:hAnsi="Times New Roman" w:eastAsia="Times New Roman"/>
                 <w:b w:val="0"/>
                 <w:i w:val="0"/>
-                <w:sz w:val="20"/>
+                <w:sz w:val="18"/>
               </w:rPr>
               <w:t>1.073 (1.023–1.125)</w:t>
             </w:r>
@@ -3771,10 +4605,17 @@
         </w:tc>
         <w:tc>
           <w:tcPr>
-            <w:tcW w:type="dxa" w:w="1872"/>
+            <w:tcW w:type="dxa" w:w="1714"/>
+            <w:tcMar>
+              <w:top w:w="40" w:type="dxa"/>
+              <w:left w:w="60" w:type="dxa"/>
+              <w:bottom w:w="40" w:type="dxa"/>
+              <w:right w:w="60" w:type="dxa"/>
+            </w:tcMar>
           </w:tcPr>
           <w:p>
             <w:pPr>
+              <w:keepLines/>
               <w:spacing w:after="20" w:before="20" w:line="240" w:lineRule="auto"/>
               <w:ind w:firstLine="0"/>
               <w:jc w:val="left"/>
@@ -3785,7 +4626,7 @@
                 <w:rFonts w:ascii="Times New Roman" w:hAnsi="Times New Roman" w:eastAsia="Times New Roman"/>
                 <w:b w:val="0"/>
                 <w:i w:val="0"/>
-                <w:sz w:val="20"/>
+                <w:sz w:val="18"/>
               </w:rPr>
               <w:t>1.073 (1.011–1.138)</w:t>
             </w:r>
@@ -3793,10 +4634,17 @@
         </w:tc>
         <w:tc>
           <w:tcPr>
-            <w:tcW w:type="dxa" w:w="1872"/>
+            <w:tcW w:type="dxa" w:w="1714"/>
+            <w:tcMar>
+              <w:top w:w="40" w:type="dxa"/>
+              <w:left w:w="60" w:type="dxa"/>
+              <w:bottom w:w="40" w:type="dxa"/>
+              <w:right w:w="60" w:type="dxa"/>
+            </w:tcMar>
           </w:tcPr>
           <w:p>
             <w:pPr>
+              <w:keepLines/>
               <w:spacing w:after="20" w:before="20" w:line="240" w:lineRule="auto"/>
               <w:ind w:firstLine="0"/>
               <w:jc w:val="left"/>
@@ -3807,7 +4655,7 @@
                 <w:rFonts w:ascii="Times New Roman" w:hAnsi="Times New Roman" w:eastAsia="Times New Roman"/>
                 <w:b w:val="0"/>
                 <w:i w:val="0"/>
-                <w:sz w:val="20"/>
+                <w:sz w:val="18"/>
               </w:rPr>
               <w:t>1.073 (1.007–1.143)</w:t>
             </w:r>
@@ -3815,10 +4663,17 @@
         </w:tc>
         <w:tc>
           <w:tcPr>
-            <w:tcW w:type="dxa" w:w="1872"/>
+            <w:tcW w:type="dxa" w:w="1714"/>
+            <w:tcMar>
+              <w:top w:w="40" w:type="dxa"/>
+              <w:left w:w="60" w:type="dxa"/>
+              <w:bottom w:w="40" w:type="dxa"/>
+              <w:right w:w="60" w:type="dxa"/>
+            </w:tcMar>
           </w:tcPr>
           <w:p>
             <w:pPr>
+              <w:keepLines/>
               <w:spacing w:after="20" w:before="20" w:line="240" w:lineRule="auto"/>
               <w:ind w:firstLine="0"/>
               <w:jc w:val="left"/>
@@ -3829,7 +4684,7 @@
                 <w:rFonts w:ascii="Times New Roman" w:hAnsi="Times New Roman" w:eastAsia="Times New Roman"/>
                 <w:b w:val="0"/>
                 <w:i w:val="0"/>
-                <w:sz w:val="20"/>
+                <w:sz w:val="18"/>
               </w:rPr>
               <w:t>1.073 (1.006–1.144)</w:t>
             </w:r>
@@ -3837,9 +4692,16 @@
         </w:tc>
       </w:tr>
     </w:tbl>
-    <w:p/>
     <w:p>
       <w:pPr>
+        <w:spacing w:after="120" w:before="0" w:line="240" w:lineRule="auto"/>
+        <w:ind w:firstLine="0"/>
+        <w:jc w:val="left"/>
+      </w:pPr>
+    </w:p>
+    <w:p>
+      <w:pPr>
+        <w:pageBreakBefore/>
         <w:spacing w:after="160" w:before="0" w:line="240" w:lineRule="auto"/>
         <w:ind w:firstLine="720"/>
         <w:jc w:val="both"/>
@@ -3991,6 +4853,9 @@
     </w:p>
     <w:p>
       <w:pPr>
+        <w:keepNext/>
+        <w:keepLines/>
+        <w:pageBreakBefore/>
         <w:spacing w:after="80" w:before="0" w:line="240" w:lineRule="auto"/>
         <w:ind w:firstLine="0"/>
         <w:jc w:val="center"/>
@@ -4032,6 +4897,8 @@
     </w:p>
     <w:p>
       <w:pPr>
+        <w:keepNext w:val="0"/>
+        <w:keepLines/>
         <w:spacing w:after="200" w:before="120" w:line="240" w:lineRule="auto"/>
         <w:ind w:firstLine="0"/>
         <w:jc w:val="left"/>
@@ -4064,7 +4931,8 @@
     </w:p>
     <w:p>
       <w:pPr>
-        <w:spacing w:after="120" w:before="240" w:line="240" w:lineRule="auto"/>
+        <w:pageBreakBefore/>
+        <w:spacing w:after="120" w:before="0" w:line="240" w:lineRule="auto"/>
         <w:ind w:firstLine="0"/>
         <w:jc w:val="left"/>
       </w:pPr>
@@ -4192,7 +5060,8 @@
     </w:p>
     <w:p>
       <w:pPr>
-        <w:spacing w:after="120" w:before="240" w:line="240" w:lineRule="auto"/>
+        <w:pageBreakBefore/>
+        <w:spacing w:after="120" w:before="0" w:line="240" w:lineRule="auto"/>
         <w:ind w:firstLine="0"/>
         <w:jc w:val="left"/>
       </w:pPr>
@@ -4224,7 +5093,8 @@
     </w:p>
     <w:p>
       <w:pPr>
-        <w:spacing w:after="120" w:before="240" w:line="240" w:lineRule="auto"/>
+        <w:pageBreakBefore/>
+        <w:spacing w:after="120" w:before="0" w:line="240" w:lineRule="auto"/>
         <w:ind w:firstLine="0"/>
         <w:jc w:val="left"/>
       </w:pPr>
@@ -4418,7 +5288,8 @@
     </w:p>
     <w:p>
       <w:pPr>
-        <w:spacing w:after="120" w:before="240" w:line="240" w:lineRule="auto"/>
+        <w:pageBreakBefore/>
+        <w:spacing w:after="120" w:before="0" w:line="240" w:lineRule="auto"/>
         <w:ind w:firstLine="0"/>
         <w:jc w:val="left"/>
       </w:pPr>
@@ -4786,8 +5657,8 @@
     </w:p>
     <w:sectPr>
       <w:headerReference w:type="default" r:id="rId9"/>
-      <w:pgSz w:w="12240" w:h="15840"/>
-      <w:pgMar w:top="1440" w:right="1440" w:bottom="1440" w:left="1440" w:header="720" w:footer="720" w:gutter="0"/>
+      <w:pgSz w:w="11906" w:h="16838"/>
+      <w:pgMar w:top="1440" w:right="1440" w:bottom="1440" w:left="1440" w:header="709" w:footer="709" w:gutter="0"/>
       <w:cols w:space="720"/>
       <w:docGrid w:linePitch="360"/>
     </w:sectPr>
@@ -4797,7 +5668,7 @@
 
 <file path=word/comments.xml><?xml version="1.0" encoding="utf-8"?>
 <w:comments xmlns:a="http://schemas.openxmlformats.org/drawingml/2006/main" xmlns:pic="http://schemas.openxmlformats.org/drawingml/2006/picture" xmlns:r="http://schemas.openxmlformats.org/officeDocument/2006/relationships" xmlns:w="http://schemas.openxmlformats.org/wordprocessingml/2006/main" xmlns:wp="http://schemas.openxmlformats.org/drawingml/2006/wordprocessingDrawing" xmlns:mc="http://schemas.openxmlformats.org/markup-compatibility/2006" xmlns:a14="http://schemas.microsoft.com/office/drawing/2010/main" xmlns:w14="http://schemas.microsoft.com/office/word/2010/wordml" xmlns:wpc="http://schemas.microsoft.com/office/word/2010/wordprocessingCanvas">
-  <w:comment w:id="0" w:author="Bob Shen" w:initials="BS" w:date="2026-08-24T17:06:16Z">
+  <w:comment w:id="0" w:author="Bob Shen" w:initials="BS" w:date="2026-08-27T05:24:48Z">
     <w:p>
       <w:pPr>
         <w:pStyle w:val="CommentText"/>
@@ -4813,7 +5684,7 @@
       </w:r>
     </w:p>
   </w:comment>
-  <w:comment w:id="1" w:author="Bob Shen" w:initials="BS" w:date="2026-08-24T17:06:16Z">
+  <w:comment w:id="1" w:author="Bob Shen" w:initials="BS" w:date="2026-08-27T05:24:48Z">
     <w:p>
       <w:pPr>
         <w:pStyle w:val="CommentText"/>
@@ -4829,7 +5700,7 @@
       </w:r>
     </w:p>
   </w:comment>
-  <w:comment w:id="2" w:author="Bob Shen" w:initials="BS" w:date="2026-08-24T17:06:16Z">
+  <w:comment w:id="2" w:author="Bob Shen" w:initials="BS" w:date="2026-08-27T05:24:48Z">
     <w:p>
       <w:pPr>
         <w:pStyle w:val="CommentText"/>
@@ -4845,7 +5716,7 @@
       </w:r>
     </w:p>
   </w:comment>
-  <w:comment w:id="3" w:author="Bob Shen" w:initials="BS" w:date="2026-08-24T17:06:16Z">
+  <w:comment w:id="3" w:author="Bob Shen" w:initials="BS" w:date="2026-08-27T05:24:48Z">
     <w:p>
       <w:pPr>
         <w:pStyle w:val="CommentText"/>
@@ -4861,7 +5732,7 @@
       </w:r>
     </w:p>
   </w:comment>
-  <w:comment w:id="4" w:author="Bob Shen" w:initials="BS" w:date="2026-08-24T17:06:16Z">
+  <w:comment w:id="4" w:author="Bob Shen" w:initials="BS" w:date="2026-08-27T05:24:49Z">
     <w:p>
       <w:pPr>
         <w:pStyle w:val="CommentText"/>
@@ -4877,7 +5748,7 @@
       </w:r>
     </w:p>
   </w:comment>
-  <w:comment w:id="5" w:author="Bob Shen" w:initials="BS" w:date="2026-08-24T17:06:16Z">
+  <w:comment w:id="5" w:author="Bob Shen" w:initials="BS" w:date="2026-08-27T05:24:49Z">
     <w:p>
       <w:pPr>
         <w:pStyle w:val="CommentText"/>
@@ -4893,7 +5764,7 @@
       </w:r>
     </w:p>
   </w:comment>
-  <w:comment w:id="6" w:author="Bob Shen" w:initials="BS" w:date="2026-08-24T17:06:16Z">
+  <w:comment w:id="6" w:author="Bob Shen" w:initials="BS" w:date="2026-08-27T05:24:49Z">
     <w:p>
       <w:pPr>
         <w:pStyle w:val="CommentText"/>

</xml_diff>

<commit_message>
Rebuild the Hogan PDF with the portrait Figure 3 forest.
Print SHA prefix fb01f23fe3d908c4 (22 A4 pages). Figure 3 caption names
the five-day reporting scale and spline df against consecutive days.
Contract test accepts the combined 6-df and 8-df display string.

Co-authored-by: Shen Ruililin <bobshenruililin@users.noreply.github.com>
</commit_message>
<xml_diff>
--- a/manuscript/live_collaborative/Heat_CVD_Manuscript_20260824_hogan.docx
+++ b/manuscript/live_collaborative/Heat_CVD_Manuscript_20260824_hogan.docx
@@ -991,7 +991,7 @@
           <w:i w:val="0"/>
           <w:sz w:val="24"/>
         </w:rPr>
-        <w:t>We fitted Model 1 twelve times: six weather variables × two diagnoses. The six weather variables are monthly mean temperature, monthly mean daily maximum temperature, monthly mean daily minimum temperature, hot nights, very hot days, and cold days. Extreme-day counts were divided by 5 so that each estimate is the change associated with five extra such days in that month, rather than with one extra day. Five days is a convenient scale, not a new weather threshold. The official count of extremely hot days (Tmax ≥ 35°C) was obtained with the other monthly weather variables and was not used as a temperature variable in Model 1. Each Model 1 fit contains one temperature variable. Temperature terms are not entered together in Model 1. We used a negative-binomial model because monthly counts can vary more than a Poisson model permits. A quasi-Poisson model is a sensitivity.</w:t>
+        <w:t>We fitted Model 1 twelve times: six weather variables × two diagnoses. The six weather variables are monthly mean temperature, monthly mean daily maximum temperature, monthly mean daily minimum temperature, hot nights, very hot days, and cold days. Extreme-day counts were divided by 5 so that each estimate is the change associated with five extra such days in that month, rather than with one extra day. Five days is a convenient scale, not a new weather threshold and not a consecutive-duration rule. The official count of extremely hot days (Tmax ≥ 35°C) was obtained with the other monthly weather variables and was not used as a temperature variable in Model 1. Each Model 1 fit contains one temperature variable. Temperature terms are not entered together in Model 1. We used a negative-binomial model because monthly counts can vary more than a Poisson model permits. A quasi-Poisson model is a sensitivity.</w:t>
       </w:r>
     </w:p>
     <w:p>
@@ -1169,7 +1169,7 @@
           <w:i w:val="0"/>
           <w:sz w:val="24"/>
         </w:rPr>
-        <w:t>Other checks were: the time trend (3, 6, or 8 degrees of freedom, or year indicators); the study window (dropping the first 12 or 24 months, or stopping at December 2019); COVID-period indicators; weather one or two months earlier; and dropping the most influential month. COVID periods were: through January 2020; February 2020–December 2021; January–April 2022; May–December 2022; and from January 2023. Cold-day models restricted to November–March are a labelled sensitivity.</w:t>
+        <w:t>Other checks were the time-trend spline (3, 6, or 8 degrees of freedom in place of the Model 1 4-df spline, or year indicators in place of that spline). Those checks change the control for slow calendar time, not the length of a heatwave. Further checks were the study window (dropping the first 12 or 24 months, or stopping at December 2019); COVID-period indicators; weather one or two months earlier; and dropping the most influential month. COVID periods were: through January 2020; February 2020–December 2021; January–April 2022; May–December 2022; and from January 2023. Cold-day models restricted to November–March are a labelled sensitivity.</w:t>
       </w:r>
     </w:p>
     <w:p>
@@ -4848,7 +4848,7 @@
           <w:i w:val="0"/>
           <w:sz w:val="24"/>
         </w:rPr>
-        <w:t>Offset choice changed the Model 1 count ratios only trivially. Across trend, window, and COVID-phase specifications, the CHD hot-night ratio ranged from 1.011 to 1.025, and the HF cold-day ratio from 1.043 to 1.113 (Figure 3). The HF cold-day association was strongest before 2020 (1.113, 1.053–1.176). The CHD hot-night association was weaker and compatible with 1 in the pre-2020 window (1.011, 0.991–1.032) and under COVID-phase adjustment (1.013, 0.994–1.033). The pre-2020 window moved more than those two contrasts: nine of the twelve Newey–West lag-6 intervals excluded 1 in that 84-month window, including inverse associations for all six continuous temperature contrasts (Figure 3; Supplementary Table S2). No multiplicity control was computed within that window, and no pre-2020 estimate is promoted beyond a sensitivity. The decline in first events and the rise in hot nights are both strong trends across this window, and the same 4-df spline absorbs both. Lag-1 month models attenuated the CHD hot-night association toward 1 (1.010, 0.979–1.042). The HF cold-day association remained elevated at lag 1 (1.073, 1.014–1.135) and was weaker at lag 2 (1.053, 0.985–1.127). Lag-one month is a labelled sensitivity, and it is not a daily lag curve. The months with largest Cook’s distance were February 2020 for CHD and February 2022 for HF cold days. Excluding the most influential month left both exploratory directions unchanged (CHD hot nights 1.021, 1.001–1.040; HF cold days 1.088, 1.034–1.144).</w:t>
+        <w:t>Offset choice changed the Model 1 count ratios only trivially. Across trend, window, and COVID-phase specifications, the CHD hot-night ratio ranged from 1.011 to 1.025, and the HF cold-day ratio from 1.043 to 1.113 (Figure 3). The HF cold-day association was strongest before 2020 (1.113, 1.053–1.176). The CHD hot-night association was weaker and compatible with 1 in the pre-2020 window (1.011, 0.991–1.032) and under COVID-phase adjustment (1.013, 0.994–1.033). Figure 3 shows the three official day counts for each outcome under nine trend, window, and COVID-period specifications. For CHD hot nights, the 6-df and 8-df intervals exclude 1 (1.024, 1.005–1.044; 1.023, 1.005–1.042). The 3-df interval includes 1 (1.011, 0.990–1.032). The year-indicator interval has the highest point estimate of the trend checks and includes 1 (1.025, 0.9998–1.050). No trend specification is preferred over the 4-df spline in Model 1. For HF cold days, the 8-df interval includes 1 (1.062, 0.994–1.135). The pre-2020 window moved more than those two contrasts: nine of the twelve Newey–West lag-6 intervals excluded 1 in that 84-month window, including inverse associations for all six continuous temperature contrasts (Supplementary Figure S6; Supplementary Table S2). No multiplicity control was computed within that window, and no pre-2020 estimate is promoted beyond a sensitivity. The decline in first events and the rise in hot nights are both strong trends across this window, and the same 4-df spline absorbs both. Lag-1 month models attenuated the CHD hot-night association toward 1 (1.010, 0.979–1.042). The HF cold-day association remained elevated at lag 1 (1.073, 1.014–1.135) and was weaker at lag 2 (1.053, 0.985–1.127). Lag-one month is a labelled sensitivity, and it is not a daily lag curve. The months with largest Cook’s distance were February 2020 for CHD and February 2022 for HF cold days. Excluding the most influential month left both exploratory directions unchanged (CHD hot nights 1.021, 1.001–1.040; HF cold days 1.088, 1.034–1.144).</w:t>
       </w:r>
     </w:p>
     <w:p>
@@ -4863,7 +4863,7 @@
       <w:r>
         <w:drawing>
           <wp:inline xmlns:a="http://schemas.openxmlformats.org/drawingml/2006/main" xmlns:pic="http://schemas.openxmlformats.org/drawingml/2006/picture">
-            <wp:extent cx="5669280" cy="3023616"/>
+            <wp:extent cx="5669280" cy="6720840"/>
             <wp:docPr id="3" name="Picture 3"/>
             <wp:cNvGraphicFramePr>
               <a:graphicFrameLocks noChangeAspect="1"/>
@@ -4884,7 +4884,7 @@
                   <pic:spPr>
                     <a:xfrm>
                       <a:off x="0" y="0"/>
-                      <a:ext cx="5669280" cy="3023616"/>
+                      <a:ext cx="5669280" cy="6720840"/>
                     </a:xfrm>
                     <a:prstGeom prst="rect"/>
                   </pic:spPr>
@@ -4910,7 +4910,7 @@
           <w:i/>
           <w:sz w:val="22"/>
         </w:rPr>
-        <w:t>Figure 3. Model 1 count ratios across trend, window, and COVID-period specifications (Newey–West lag-6 intervals). All twelve Model 1 fits are shown across nine specifications.</w:t>
+        <w:t>Figure 3. Model 1 count ratios for official day counts across time-trend, window, and COVID-period specifications (Newey–West lag-6 intervals). The exposure is the monthly official day count divided by five, so each estimate is the count ratio per five additional such days in that month. Rows labelled 3, 6, or 8 df replace the 4-df time-trend spline of Model 1. Neither the five-day scale nor the spline degrees of freedom refers to consecutive days. Pre-2020 is January 2013–December 2019 (84 months). Continuous-temperature fits for the same specifications are shown in Supplementary Figure S6.</w:t>
       </w:r>
     </w:p>
     <w:p>
@@ -5007,7 +5007,39 @@
           <w:i w:val="0"/>
           <w:sz w:val="24"/>
         </w:rPr>
+        <w:t>The two residual signals are sensitive to the time trend in opposite directions. The CHD hot-night interval includes 1 under a stiffer 3-df spline (1.011, 0.990–1.032). It excludes 1 under the 6-df and 8-df splines (1.024, 1.005–1.044; 1.023, 1.005–1.042). The year-indicator interval has the highest point estimate of the trend checks and includes 1 (1.025, 0.9998–1.050). The HF cold-day interval includes 1 under the most flexible 8-df spline (1.062, 0.994–1.135). That pattern concerns how the first-event decline and monthly thermal burden share one time smooth. The spline degrees of freedom are a model setting, and they do not describe a physiological duration.</w:t>
+      </w:r>
+    </w:p>
+    <w:p>
+      <w:pPr>
+        <w:spacing w:after="160" w:before="0" w:line="240" w:lineRule="auto"/>
+        <w:ind w:firstLine="720"/>
+        <w:jc w:val="both"/>
+      </w:pPr>
+      <w:r>
+        <w:rPr>
+          <w:rFonts w:ascii="Times New Roman" w:hAnsi="Times New Roman" w:eastAsia="Times New Roman"/>
+          <w:b w:val="0"/>
+          <w:i w:val="0"/>
+          <w:sz w:val="24"/>
+        </w:rPr>
         <w:t>The direction of the HF cold-day residual is consistent with earlier daily evidence that lower temperature was associated with higher heart-failure admissions in Hong Kong [21]. The comparison is between questions, and not between magnitudes. A cumulative daily relative risk comparing 11 °C with 25 °C is not a monthly count ratio per five official cold days, and the present event is a first hospitalisation after a first HF diagnosis without recorded admission cause. The CHD hot-night residual should likewise be read against Guo et al. rather than as a replication of it [17]. That study reported no overall association for the official hot-night flag after adjustment for mean temperature, and a positive association for hourly nighttime excess heat [17]. The present analysis uses monthly official counts, a first-event CHD series, and a later decade. A difference between monthly mean temperature and monthly official hot-night counts does not identify an intensity mechanism.</w:t>
+      </w:r>
+    </w:p>
+    <w:p>
+      <w:pPr>
+        <w:spacing w:after="160" w:before="0" w:line="240" w:lineRule="auto"/>
+        <w:ind w:firstLine="720"/>
+        <w:jc w:val="both"/>
+      </w:pPr>
+      <w:r>
+        <w:rPr>
+          <w:rFonts w:ascii="Times New Roman" w:hAnsi="Times New Roman" w:eastAsia="Times New Roman"/>
+          <w:b w:val="0"/>
+          <w:i w:val="0"/>
+          <w:sz w:val="24"/>
+        </w:rPr>
+        <w:t>A monthly official-day total does not distinguish consecutive days from days scattered through the month. Interrupted overnight recovery is one hypothesis for why a hot-night count could differ from monthly mean temperature. The present monthly design cannot test that hypothesis. Five additional official days in a month is a reporting scale rather than a consecutive-day trigger. Hong Kong issues official heat and cold warnings. These estimates do not evaluate those warnings.</w:t>
       </w:r>
     </w:p>
     <w:p>
@@ -5155,7 +5187,7 @@
           <w:i w:val="0"/>
           <w:sz w:val="24"/>
         </w:rPr>
-        <w:t>Admission cause was not recorded, so an event is a first hospitalisation after a first diagnosis and not a cardiac-caused admission. Monthly counts of people still at risk of a first event were unavailable, so the estimates are count ratios rather than incidence-rate ratios [14]. The design is ecological and monthly, so individual-level and daily-triggering interpretations are not identified [14]. Age, sex, and disease-subtype strata were not delivered. Residual serial correlation remains material for CHD, with lag-1 Pearson autocorrelation of 0.508 in the hot-night model. Official cold days are concentrated in December–February, and only 29 of 132 months carry any official cold day, so the HF cold-day estimate rests on differences between winters. The CHD hot-night estimate is not stable across analysis windows, and is compatible with 1 before 2020. Official hot-night counts are not hourly nighttime excess heat [17]. All exposures were measured at a single Observatory station and applied territory-wide. Influenza is missing for January–October 2013. Confounding by pollution, humidity, rainfall, and influenza is unresolved in Model 1. A corresponding stroke series was not available for this analysis.</w:t>
+        <w:t>Admission cause was not recorded, so an event is a first hospitalisation after a first diagnosis and not a cardiac-caused admission. Monthly counts of people still at risk of a first event were unavailable, so the estimates are count ratios rather than incidence-rate ratios [14]. The design is ecological and monthly, so individual-level and daily-triggering interpretations are not identified [14]. Monthly official-day totals cannot identify consecutive duration. Age, sex, and disease-subtype strata were not delivered. Residual serial correlation remains material for CHD, with lag-1 Pearson autocorrelation of 0.508 in the hot-night model. Official cold days are concentrated in December–February, and only 29 of 132 months carry any official cold day, so the HF cold-day estimate rests on differences between winters. The CHD hot-night estimate is not stable across analysis windows, and is compatible with 1 before 2020. Official hot-night counts are not hourly nighttime excess heat [17]. All exposures were measured at a single Observatory station and applied territory-wide. Influenza is missing for January–October 2013. Confounding by pollution, humidity, rainfall, and influenza is unresolved in Model 1. A corresponding stroke series was not available for this analysis.</w:t>
       </w:r>
     </w:p>
     <w:p>
@@ -5668,7 +5700,7 @@
 
 <file path=word/comments.xml><?xml version="1.0" encoding="utf-8"?>
 <w:comments xmlns:a="http://schemas.openxmlformats.org/drawingml/2006/main" xmlns:pic="http://schemas.openxmlformats.org/drawingml/2006/picture" xmlns:r="http://schemas.openxmlformats.org/officeDocument/2006/relationships" xmlns:w="http://schemas.openxmlformats.org/wordprocessingml/2006/main" xmlns:wp="http://schemas.openxmlformats.org/drawingml/2006/wordprocessingDrawing" xmlns:mc="http://schemas.openxmlformats.org/markup-compatibility/2006" xmlns:a14="http://schemas.microsoft.com/office/drawing/2010/main" xmlns:w14="http://schemas.microsoft.com/office/word/2010/wordml" xmlns:wpc="http://schemas.microsoft.com/office/word/2010/wordprocessingCanvas">
-  <w:comment w:id="0" w:author="Bob Shen" w:initials="BS" w:date="2026-08-27T05:24:48Z">
+  <w:comment w:id="0" w:author="Bob Shen" w:initials="BS" w:date="2026-08-27T07:07:57Z">
     <w:p>
       <w:pPr>
         <w:pStyle w:val="CommentText"/>
@@ -5684,7 +5716,7 @@
       </w:r>
     </w:p>
   </w:comment>
-  <w:comment w:id="1" w:author="Bob Shen" w:initials="BS" w:date="2026-08-27T05:24:48Z">
+  <w:comment w:id="1" w:author="Bob Shen" w:initials="BS" w:date="2026-08-27T07:07:57Z">
     <w:p>
       <w:pPr>
         <w:pStyle w:val="CommentText"/>
@@ -5700,7 +5732,7 @@
       </w:r>
     </w:p>
   </w:comment>
-  <w:comment w:id="2" w:author="Bob Shen" w:initials="BS" w:date="2026-08-27T05:24:48Z">
+  <w:comment w:id="2" w:author="Bob Shen" w:initials="BS" w:date="2026-08-27T07:07:57Z">
     <w:p>
       <w:pPr>
         <w:pStyle w:val="CommentText"/>
@@ -5716,7 +5748,7 @@
       </w:r>
     </w:p>
   </w:comment>
-  <w:comment w:id="3" w:author="Bob Shen" w:initials="BS" w:date="2026-08-27T05:24:48Z">
+  <w:comment w:id="3" w:author="Bob Shen" w:initials="BS" w:date="2026-08-27T07:07:57Z">
     <w:p>
       <w:pPr>
         <w:pStyle w:val="CommentText"/>
@@ -5732,7 +5764,7 @@
       </w:r>
     </w:p>
   </w:comment>
-  <w:comment w:id="4" w:author="Bob Shen" w:initials="BS" w:date="2026-08-27T05:24:49Z">
+  <w:comment w:id="4" w:author="Bob Shen" w:initials="BS" w:date="2026-08-27T07:07:57Z">
     <w:p>
       <w:pPr>
         <w:pStyle w:val="CommentText"/>
@@ -5748,7 +5780,7 @@
       </w:r>
     </w:p>
   </w:comment>
-  <w:comment w:id="5" w:author="Bob Shen" w:initials="BS" w:date="2026-08-27T05:24:49Z">
+  <w:comment w:id="5" w:author="Bob Shen" w:initials="BS" w:date="2026-08-27T07:07:57Z">
     <w:p>
       <w:pPr>
         <w:pStyle w:val="CommentText"/>
@@ -5764,7 +5796,7 @@
       </w:r>
     </w:p>
   </w:comment>
-  <w:comment w:id="6" w:author="Bob Shen" w:initials="BS" w:date="2026-08-27T05:24:49Z">
+  <w:comment w:id="6" w:author="Bob Shen" w:initials="BS" w:date="2026-08-27T07:07:57Z">
     <w:p>
       <w:pPr>
         <w:pStyle w:val="CommentText"/>

</xml_diff>

<commit_message>
Crown 6-df as the named robustness check among 5, 6, and 8.
Score the existing trend-sensitivity table: only Model 1 (4 df) and 6 df keep both headlines away from 1; 8 df opens HF cold days onto 1. Five is the reporting scale, not a spline. Table 2, Abstract, and Hogan's weather paragraph stay unchanged. Physiology routing supports nights and non-recovery, not a 6-day cliff. Gate 3 remains open.

Co-authored-by: Shen Ruililin <bobshenruililin@users.noreply.github.com>
</commit_message>
<xml_diff>
--- a/manuscript/live_collaborative/Heat_CVD_Manuscript_20260824_hogan.docx
+++ b/manuscript/live_collaborative/Heat_CVD_Manuscript_20260824_hogan.docx
@@ -4848,7 +4848,7 @@
           <w:i w:val="0"/>
           <w:sz w:val="24"/>
         </w:rPr>
-        <w:t>Offset choice changed the Model 1 count ratios only trivially. Across trend, window, and COVID-phase specifications, the CHD hot-night ratio ranged from 1.011 to 1.025, and the HF cold-day ratio from 1.043 to 1.113 (Figure 3). The HF cold-day association was strongest before 2020 (1.113, 1.053–1.176). The CHD hot-night association was weaker and compatible with 1 in the pre-2020 window (1.011, 0.991–1.032) and under COVID-phase adjustment (1.013, 0.994–1.033). Figure 3 shows the three official day counts for each outcome under nine trend, window, and COVID-period specifications. For CHD hot nights, the 6-df and 8-df intervals exclude 1 (1.024, 1.005–1.044; 1.023, 1.005–1.042). The 3-df interval includes 1 (1.011, 0.990–1.032). The year-indicator interval has the highest point estimate of the trend checks and includes 1 (1.025, 0.9998–1.050). No trend specification is preferred over the 4-df spline in Model 1. For HF cold days, the 8-df interval includes 1 (1.062, 0.994–1.135). The pre-2020 window moved more than those two contrasts: nine of the twelve Newey–West lag-6 intervals excluded 1 in that 84-month window, including inverse associations for all six continuous temperature contrasts (Supplementary Figure S6; Supplementary Table S2). No multiplicity control was computed within that window, and no pre-2020 estimate is promoted beyond a sensitivity. The decline in first events and the rise in hot nights are both strong trends across this window, and the same 4-df spline absorbs both. Lag-1 month models attenuated the CHD hot-night association toward 1 (1.010, 0.979–1.042). The HF cold-day association remained elevated at lag 1 (1.073, 1.014–1.135) and was weaker at lag 2 (1.053, 0.985–1.127). Lag-one month is a labelled sensitivity, and it is not a daily lag curve. The months with largest Cook’s distance were February 2020 for CHD and February 2022 for HF cold days. Excluding the most influential month left both exploratory directions unchanged (CHD hot nights 1.021, 1.001–1.040; HF cold days 1.088, 1.034–1.144).</w:t>
+        <w:t>Offset choice changed the Model 1 count ratios only trivially. Across trend, window, and COVID-phase specifications, the CHD hot-night ratio ranged from 1.011 to 1.025, and the HF cold-day ratio from 1.043 to 1.113 (Figure 3). The HF cold-day association was strongest before 2020 (1.113, 1.053–1.176). The CHD hot-night association was weaker and compatible with 1 in the pre-2020 window (1.011, 0.991–1.032) and under COVID-phase adjustment (1.013, 0.994–1.033). Figure 3 shows the three official day counts for each outcome under nine trend, window, and COVID-period specifications. For CHD hot nights, the 6-df and 8-df intervals exclude 1 (1.024, 1.005–1.044; 1.023, 1.005–1.042). The 3-df interval includes 1 (1.011, 0.990–1.032). The year-indicator interval has the highest point estimate of the trend checks and includes 1 (1.025, 0.9998–1.050). No trend specification is preferred over the 4-df spline in Model 1. Among specifications more flexible than Model 1, only the 6-df spline keeps both residual intervals away from 1. For HF cold days, the 8-df interval includes 1 (1.062, 0.994–1.135). The pre-2020 window moved more than those two contrasts: nine of the twelve Newey–West lag-6 intervals excluded 1 in that 84-month window, including inverse associations for all six continuous temperature contrasts (Supplementary Figure S6; Supplementary Table S2). No multiplicity control was computed within that window, and no pre-2020 estimate is promoted beyond a sensitivity. The decline in first events and the rise in hot nights are both strong trends across this window, and the same 4-df spline absorbs both. Lag-1 month models attenuated the CHD hot-night association toward 1 (1.010, 0.979–1.042). The HF cold-day association remained elevated at lag 1 (1.073, 1.014–1.135) and was weaker at lag 2 (1.053, 0.985–1.127). Lag-one month is a labelled sensitivity, and it is not a daily lag curve. The months with largest Cook’s distance were February 2020 for CHD and February 2022 for HF cold days. Excluding the most influential month left both exploratory directions unchanged (CHD hot nights 1.021, 1.001–1.040; HF cold days 1.088, 1.034–1.144).</w:t>
       </w:r>
     </w:p>
     <w:p>
@@ -5007,7 +5007,7 @@
           <w:i w:val="0"/>
           <w:sz w:val="24"/>
         </w:rPr>
-        <w:t>The two residual signals are sensitive to the time trend in opposite directions. The CHD hot-night interval includes 1 under a stiffer 3-df spline (1.011, 0.990–1.032). It excludes 1 under the 6-df and 8-df splines (1.024, 1.005–1.044; 1.023, 1.005–1.042). The year-indicator interval has the highest point estimate of the trend checks and includes 1 (1.025, 0.9998–1.050). The HF cold-day interval includes 1 under the most flexible 8-df spline (1.062, 0.994–1.135). That pattern concerns how the first-event decline and monthly thermal burden share one time smooth. The spline degrees of freedom are a model setting, and they do not describe a physiological duration.</w:t>
+        <w:t>The two residual signals are sensitive to the time trend in opposite directions. The CHD hot-night interval includes 1 under a stiffer 3-df spline (1.011, 0.990–1.032). It excludes 1 under the 6-df and 8-df splines (1.024, 1.005–1.044; 1.023, 1.005–1.042). The year-indicator interval has the highest point estimate of the trend checks and includes 1 (1.025, 0.9998–1.050). The HF cold-day interval includes 1 under the most flexible 8-df spline (1.062, 0.994–1.135). That pattern concerns how the first-event decline and monthly thermal burden share one time smooth. The spline degrees of freedom are a model setting, and they do not describe a physiological duration. If a single more-flexible robustness check is named, it is the 6-df spline, because the 8-df spline opens the HF cold-day interval onto 1. That is an identification property of the time smooth.</w:t>
       </w:r>
     </w:p>
     <w:p>
@@ -5700,7 +5700,7 @@
 
 <file path=word/comments.xml><?xml version="1.0" encoding="utf-8"?>
 <w:comments xmlns:a="http://schemas.openxmlformats.org/drawingml/2006/main" xmlns:pic="http://schemas.openxmlformats.org/drawingml/2006/picture" xmlns:r="http://schemas.openxmlformats.org/officeDocument/2006/relationships" xmlns:w="http://schemas.openxmlformats.org/wordprocessingml/2006/main" xmlns:wp="http://schemas.openxmlformats.org/drawingml/2006/wordprocessingDrawing" xmlns:mc="http://schemas.openxmlformats.org/markup-compatibility/2006" xmlns:a14="http://schemas.microsoft.com/office/drawing/2010/main" xmlns:w14="http://schemas.microsoft.com/office/word/2010/wordml" xmlns:wpc="http://schemas.microsoft.com/office/word/2010/wordprocessingCanvas">
-  <w:comment w:id="0" w:author="Bob Shen" w:initials="BS" w:date="2026-08-27T07:07:57Z">
+  <w:comment w:id="0" w:author="Bob Shen" w:initials="BS" w:date="2026-08-27T17:29:51Z">
     <w:p>
       <w:pPr>
         <w:pStyle w:val="CommentText"/>
@@ -5716,7 +5716,7 @@
       </w:r>
     </w:p>
   </w:comment>
-  <w:comment w:id="1" w:author="Bob Shen" w:initials="BS" w:date="2026-08-27T07:07:57Z">
+  <w:comment w:id="1" w:author="Bob Shen" w:initials="BS" w:date="2026-08-27T17:29:51Z">
     <w:p>
       <w:pPr>
         <w:pStyle w:val="CommentText"/>
@@ -5732,7 +5732,7 @@
       </w:r>
     </w:p>
   </w:comment>
-  <w:comment w:id="2" w:author="Bob Shen" w:initials="BS" w:date="2026-08-27T07:07:57Z">
+  <w:comment w:id="2" w:author="Bob Shen" w:initials="BS" w:date="2026-08-27T17:29:51Z">
     <w:p>
       <w:pPr>
         <w:pStyle w:val="CommentText"/>
@@ -5748,7 +5748,7 @@
       </w:r>
     </w:p>
   </w:comment>
-  <w:comment w:id="3" w:author="Bob Shen" w:initials="BS" w:date="2026-08-27T07:07:57Z">
+  <w:comment w:id="3" w:author="Bob Shen" w:initials="BS" w:date="2026-08-27T17:29:51Z">
     <w:p>
       <w:pPr>
         <w:pStyle w:val="CommentText"/>
@@ -5764,7 +5764,7 @@
       </w:r>
     </w:p>
   </w:comment>
-  <w:comment w:id="4" w:author="Bob Shen" w:initials="BS" w:date="2026-08-27T07:07:57Z">
+  <w:comment w:id="4" w:author="Bob Shen" w:initials="BS" w:date="2026-08-27T17:29:51Z">
     <w:p>
       <w:pPr>
         <w:pStyle w:val="CommentText"/>
@@ -5780,7 +5780,7 @@
       </w:r>
     </w:p>
   </w:comment>
-  <w:comment w:id="5" w:author="Bob Shen" w:initials="BS" w:date="2026-08-27T07:07:57Z">
+  <w:comment w:id="5" w:author="Bob Shen" w:initials="BS" w:date="2026-08-27T17:29:51Z">
     <w:p>
       <w:pPr>
         <w:pStyle w:val="CommentText"/>
@@ -5796,7 +5796,7 @@
       </w:r>
     </w:p>
   </w:comment>
-  <w:comment w:id="6" w:author="Bob Shen" w:initials="BS" w:date="2026-08-27T07:07:57Z">
+  <w:comment w:id="6" w:author="Bob Shen" w:initials="BS" w:date="2026-08-27T17:29:51Z">
     <w:p>
       <w:pPr>
         <w:pStyle w:val="CommentText"/>

</xml_diff>

<commit_message>
Rebuild Hogan and Laidlaw PDFs after the physiology and HHAP write.
Hogan print copy is 23 A4 pages (SHA prefix 2805bce9bf7bd825). Stage 3 essay
SHA prefix 0b359b1f8527d7a7; the 24 August poster is unchanged. Contract
tests lock the new hashes. Form 2a remains a human decision if already
signed against the 24 August essay.

Co-authored-by: Shen Ruililin <bobshenruililin@users.noreply.github.com>
</commit_message>
<xml_diff>
--- a/manuscript/live_collaborative/Heat_CVD_Manuscript_20260824_hogan.docx
+++ b/manuscript/live_collaborative/Heat_CVD_Manuscript_20260824_hogan.docx
@@ -5055,6 +5055,54 @@
           <w:i w:val="0"/>
           <w:sz w:val="24"/>
         </w:rPr>
+        <w:t>Candidate mechanisms for a night residual sit outside this design. Ambient heat is associated with shorter and more fragmented sleep [23]. In a ten-day confinement study of seven young men, three nights at 26.3 °C left nocturnal core temperature 0.2 °C higher during and after those nights than before them, and total sleep time fell with overnight core temperature [24]. In 47 adults aged 65 years or older, bedroom temperatures above 24 °C were associated with lower heart-rate variability [25]. Those studies do not measure first CHD hospitalisation in Hong Kong, and they do not measure indoor temperature in this series. A scoping review found only three studies that linked extreme heat, sleep, and cardiovascular measures; blood-pressure findings were mixed, and none demonstrated sleep as a mediator of hospitalisation [26]. Guo et al. already showed that an official hot-night flag can be null after mean temperature while hourly nighttime excess heat is not [17]. The physiological claim is therefore a hypothesis: nights may matter for CHD because overnight recovery of core temperature, sleep, and autonomic tone can fail, whereas a monthly very-hot-day count does not encode that failure. This panel does not identify that pathway.</w:t>
+      </w:r>
+    </w:p>
+    <w:p>
+      <w:pPr>
+        <w:spacing w:after="160" w:before="0" w:line="240" w:lineRule="auto"/>
+        <w:ind w:firstLine="720"/>
+        <w:jc w:val="both"/>
+      </w:pPr>
+      <w:r>
+        <w:rPr>
+          <w:rFonts w:ascii="Times New Roman" w:hAnsi="Times New Roman" w:eastAsia="Times New Roman"/>
+          <w:b w:val="0"/>
+          <w:i w:val="0"/>
+          <w:sz w:val="24"/>
+        </w:rPr>
+        <w:t>A corresponding hypothesis for HF is haemodynamic rather than nocturnal. Cold exposure can raise sympathetic outflow, peripheral resistance, and afterload; a failing left ventricle has little reserve against that load [27,28]. Goggins and Chan's daily Hong Kong HF series remains the local epidemiological neighbour, not a magnitude to import [21]. Influenza, indoor conditions, and care-seeking remain unseparated on a monthly grain [18]. The present counts do not measure afterload, blood pressure, or infection. The hypothesis is that official cold-day burden marks winters in which those loads are more frequent. A heat-only reading of this file would miss the more coherent residual.</w:t>
+      </w:r>
+    </w:p>
+    <w:p>
+      <w:pPr>
+        <w:spacing w:after="160" w:before="0" w:line="240" w:lineRule="auto"/>
+        <w:ind w:firstLine="720"/>
+        <w:jc w:val="both"/>
+      </w:pPr>
+      <w:r>
+        <w:rPr>
+          <w:rFonts w:ascii="Times New Roman" w:hAnsi="Times New Roman" w:eastAsia="Times New Roman"/>
+          <w:b w:val="0"/>
+          <w:i w:val="0"/>
+          <w:sz w:val="24"/>
+        </w:rPr>
+        <w:t>The World Health Organization's 2026 heat-health action-plan guidance organises response around eight core elements: governance; a heat-health warning system; populations at increased risk; communication; health-system resilience; reducing heat exposure; heat-health surveillance; and monitoring, evaluation and learning [29]. Hong Kong already operates a warning, communication, and shelter bundle rather than a single named municipal plan evaluated here. The Observatory issues a Very Hot Weather Warning, a Hot Weather Special Advisory, and, when that warning is in force, a Prolonged Heat Special Alert for a few days of very hot days or hot nights, together with an Extremely Hot Weather Special Alert near 35 °C and the Hong Kong Heat Index [30,31]. The Department of Health already names people with heart disease or high blood pressure among those at increased heat-stroke risk and advises indoor ventilation or air-conditioning [32]. The Home Affairs Department opens temporary heat shelters, and a separate Cold Weather Warning covers winter [31,33]. This panel can inform four of those elements and cannot evaluate any of them. The CHD residual, such as it is, sits with official hot-night counts rather than very-hot-day counts. The Prolonged Heat Special Alert already names hot nights beside very hot days (elements 2 and 4). That overlap is a mapping, not a test of the alert. The named at-risk group already includes this cohort's diagnoses (element 3). Indoor night temperature is the exposure-reduction hypothesis that the sleep and autonomic studies point to, not a consecutive-day trigger, and it was not measured here (element 6). A heat-only plan would omit the stronger HF cold-day residual, which sits with the Cold Weather Warning rather than with summer heat guidance. The estimates do not set a five-day trigger, do not count admissions averted, and do not say whether existing warnings work.</w:t>
+      </w:r>
+    </w:p>
+    <w:p>
+      <w:pPr>
+        <w:spacing w:after="160" w:before="0" w:line="240" w:lineRule="auto"/>
+        <w:ind w:firstLine="720"/>
+        <w:jc w:val="both"/>
+      </w:pPr>
+      <w:r>
+        <w:rPr>
+          <w:rFonts w:ascii="Times New Roman" w:hAnsi="Times New Roman" w:eastAsia="Times New Roman"/>
+          <w:b w:val="0"/>
+          <w:i w:val="0"/>
+          <w:sz w:val="24"/>
+        </w:rPr>
         <w:t>Liu et al. (2020, 2026) remain complementary mortality baselines [12,13]. Their attributable fractions and excess-death totals cannot be rescaled into the present count ratios. The failed daily-recovery calibration is the corresponding methods limit: monthly sums do not automatically yield daily trigger estimates [15,16]. That refusal is specific to this series, this implementation, and this calibration standard. It is not evidence that recovery of daily effects from aggregated outcomes fails in general.</w:t>
       </w:r>
     </w:p>
@@ -5120,7 +5168,7 @@
           <w:i w:val="0"/>
           <w:sz w:val="24"/>
         </w:rPr>
-        <w:t>Between 2013 and 2023, hot nights in Hong Kong increased while cold days persisted. In monthly Hospital Authority counts for people with type 2 diabetes and/or hypertension, CHD first hospitalisations were more closely associated with hot nights, and HF first hospitalisations with cold days, than with the other thermal encodings examined. Neither association survived correction across the twelve Model 1 fits. The CHD estimate additionally depended on the treatment of uncertainty and on the inclusion of 2020–2023. This analysis therefore contributes a set of hypotheses, and an explicit account of what monthly aggregate counts cannot settle. Better-denominated and more finely resolved data are required before a thermal effect on cardiac hospitalisation in this cohort can be estimated.</w:t>
+        <w:t>Between 2013 and 2023, hot nights in Hong Kong increased while cold days persisted. In monthly Hospital Authority counts for people with type 2 diabetes and/or hypertension, CHD first hospitalisations were more closely associated with hot nights, and HF first hospitalisations with cold days, than with the other thermal encodings examined. Neither association survived correction across the twelve Model 1 fits. The CHD estimate additionally depended on the treatment of uncertainty and on the inclusion of 2020–2023. This analysis therefore contributes a set of hypotheses, and an explicit account of what monthly aggregate counts cannot settle. Physiological accounts of overnight recovery and cold-related afterload, and a mapping onto published heat-health action-plan elements, are interpretation. They are not identified effects and not an evaluation of Hong Kong's warnings. Better-denominated and more finely resolved data are required before a thermal effect on cardiac hospitalisation in this cohort can be estimated.</w:t>
       </w:r>
     </w:p>
     <w:p>
@@ -5187,7 +5235,7 @@
           <w:i w:val="0"/>
           <w:sz w:val="24"/>
         </w:rPr>
-        <w:t>Admission cause was not recorded, so an event is a first hospitalisation after a first diagnosis and not a cardiac-caused admission. Monthly counts of people still at risk of a first event were unavailable, so the estimates are count ratios rather than incidence-rate ratios [14]. The design is ecological and monthly, so individual-level and daily-triggering interpretations are not identified [14]. Monthly official-day totals cannot identify consecutive duration. Age, sex, and disease-subtype strata were not delivered. Residual serial correlation remains material for CHD, with lag-1 Pearson autocorrelation of 0.508 in the hot-night model. Official cold days are concentrated in December–February, and only 29 of 132 months carry any official cold day, so the HF cold-day estimate rests on differences between winters. The CHD hot-night estimate is not stable across analysis windows, and is compatible with 1 before 2020. Official hot-night counts are not hourly nighttime excess heat [17]. All exposures were measured at a single Observatory station and applied territory-wide. Influenza is missing for January–October 2013. Confounding by pollution, humidity, rainfall, and influenza is unresolved in Model 1. A corresponding stroke series was not available for this analysis.</w:t>
+        <w:t>Admission cause was not recorded, so an event is a first hospitalisation after a first diagnosis and not a cardiac-caused admission. Monthly counts of people still at risk of a first event were unavailable, so the estimates are count ratios rather than incidence-rate ratios [14]. The design is ecological and monthly, so individual-level and daily-triggering interpretations are not identified [14]. Monthly official-day totals cannot identify consecutive duration. Age, sex, and disease-subtype strata were not delivered. Residual serial correlation remains material for CHD, with lag-1 Pearson autocorrelation of 0.508 in the hot-night model. Official cold days are concentrated in December–February, and only 29 of 132 months carry any official cold day, so the HF cold-day estimate rests on differences between winters. The CHD hot-night estimate is not stable across analysis windows, and is compatible with 1 before 2020. Official hot-night counts are not hourly nighttime excess heat [17]. All exposures were measured at a single Observatory station and applied territory-wide. Influenza is missing for January–October 2013. Confounding by pollution, humidity, rainfall, and influenza is unresolved in Model 1. A corresponding stroke series was not available for this analysis. Physiological mechanisms and heat-health action-plan mappings are not identified from the 132 months.</w:t>
       </w:r>
     </w:p>
     <w:p>
@@ -5687,6 +5735,182 @@
         <w:t>22. Chan EYY, Goggins WB, Yue JSK, Lee P. Hospital admissions as a function of temperature, other weather phenomena and pollution levels in an urban setting in China. Bull World Health Organ. 2013;91(8):576-584. doi:10.2471/BLT.12.113035</w:t>
       </w:r>
     </w:p>
+    <w:p>
+      <w:pPr>
+        <w:spacing w:after="80" w:before="0" w:line="240" w:lineRule="auto"/>
+        <w:ind w:left="425" w:hanging="425"/>
+        <w:jc w:val="left"/>
+      </w:pPr>
+      <w:r>
+        <w:rPr>
+          <w:rFonts w:ascii="Times New Roman" w:hAnsi="Times New Roman" w:eastAsia="Times New Roman"/>
+          <w:b w:val="0"/>
+          <w:i w:val="0"/>
+          <w:sz w:val="22"/>
+        </w:rPr>
+        <w:t>23. Chevance G, Minor K, Vielma C, et al. A systematic review of ambient heat and sleep in a warming climate. Sleep Med Rev. 2024;75:101915. doi:10.1016/j.smrv.2024.101915</w:t>
+      </w:r>
+    </w:p>
+    <w:p>
+      <w:pPr>
+        <w:spacing w:after="80" w:before="0" w:line="240" w:lineRule="auto"/>
+        <w:ind w:left="425" w:hanging="425"/>
+        <w:jc w:val="left"/>
+      </w:pPr>
+      <w:r>
+        <w:rPr>
+          <w:rFonts w:ascii="Times New Roman" w:hAnsi="Times New Roman" w:eastAsia="Times New Roman"/>
+          <w:b w:val="0"/>
+          <w:i w:val="0"/>
+          <w:sz w:val="22"/>
+        </w:rPr>
+        <w:t>24. Ioannou LG, Tsoutsoubi L, Mantzios K, et al. Impact of a simulated multiday heatwave on nocturnal physiology, behavior, and sleep: a 10-day confinement study. Appl Physiol Nutr Metab. 2024;49:1394-1408. doi:10.1139/apnm-2024-0105</w:t>
+      </w:r>
+    </w:p>
+    <w:p>
+      <w:pPr>
+        <w:spacing w:after="80" w:before="0" w:line="240" w:lineRule="auto"/>
+        <w:ind w:left="425" w:hanging="425"/>
+        <w:jc w:val="left"/>
+      </w:pPr>
+      <w:r>
+        <w:rPr>
+          <w:rFonts w:ascii="Times New Roman" w:hAnsi="Times New Roman" w:eastAsia="Times New Roman"/>
+          <w:b w:val="0"/>
+          <w:i w:val="0"/>
+          <w:sz w:val="22"/>
+        </w:rPr>
+        <w:t>25. O'Connor FK, Bach AJE, Forbes C, et al. Effect of nighttime bedroom temperature on heart rate variability in older adults: an observational study. BMC Med. 2025;23:703. doi:10.1186/s12916-025-04513-0</w:t>
+      </w:r>
+    </w:p>
+    <w:p>
+      <w:pPr>
+        <w:spacing w:after="80" w:before="0" w:line="240" w:lineRule="auto"/>
+        <w:ind w:left="425" w:hanging="425"/>
+        <w:jc w:val="left"/>
+      </w:pPr>
+      <w:r>
+        <w:rPr>
+          <w:rFonts w:ascii="Times New Roman" w:hAnsi="Times New Roman" w:eastAsia="Times New Roman"/>
+          <w:b w:val="0"/>
+          <w:i w:val="0"/>
+          <w:sz w:val="22"/>
+        </w:rPr>
+        <w:t>26. Ashe N, Wozniak S, Conner M, et al. Association of extreme heat events with sleep and cardiovascular health: a scoping review. Syst Rev. 2025;14:19. doi:10.1186/s13643-024-02742-7</w:t>
+      </w:r>
+    </w:p>
+    <w:p>
+      <w:pPr>
+        <w:spacing w:after="80" w:before="0" w:line="240" w:lineRule="auto"/>
+        <w:ind w:left="425" w:hanging="425"/>
+        <w:jc w:val="left"/>
+      </w:pPr>
+      <w:r>
+        <w:rPr>
+          <w:rFonts w:ascii="Times New Roman" w:hAnsi="Times New Roman" w:eastAsia="Times New Roman"/>
+          <w:b w:val="0"/>
+          <w:i w:val="0"/>
+          <w:sz w:val="22"/>
+        </w:rPr>
+        <w:t>27. Ikaheimo TM. Cardiovascular diseases, cold exposure and exercise. Temperature (Austin). 2018;5(2):123-146. doi:10.1080/23328940.2017.1414014</w:t>
+      </w:r>
+    </w:p>
+    <w:p>
+      <w:pPr>
+        <w:spacing w:after="80" w:before="0" w:line="240" w:lineRule="auto"/>
+        <w:ind w:left="425" w:hanging="425"/>
+        <w:jc w:val="left"/>
+      </w:pPr>
+      <w:r>
+        <w:rPr>
+          <w:rFonts w:ascii="Times New Roman" w:hAnsi="Times New Roman" w:eastAsia="Times New Roman"/>
+          <w:b w:val="0"/>
+          <w:i w:val="0"/>
+          <w:sz w:val="22"/>
+        </w:rPr>
+        <w:t>28. Li Y, Wu J, Xu Y, et al. Cold exposure and the cardiovascular system: from physiological adaptation to pathological risk. Front Physiol. 2026;16:1740919. doi:10.3389/fphys.2025.1740919</w:t>
+      </w:r>
+    </w:p>
+    <w:p>
+      <w:pPr>
+        <w:spacing w:after="80" w:before="0" w:line="240" w:lineRule="auto"/>
+        <w:ind w:left="425" w:hanging="425"/>
+        <w:jc w:val="left"/>
+      </w:pPr>
+      <w:r>
+        <w:rPr>
+          <w:rFonts w:ascii="Times New Roman" w:hAnsi="Times New Roman" w:eastAsia="Times New Roman"/>
+          <w:b w:val="0"/>
+          <w:i w:val="0"/>
+          <w:sz w:val="22"/>
+        </w:rPr>
+        <w:t>29. WHO Regional Office for Europe. Heat-health action plans: guidance. 2nd ed. Copenhagen: WHO Regional Office for Europe; 2026. ISBN 9789289062930. https://www.who.int/europe/publications/i/item/9789289062930</w:t>
+      </w:r>
+    </w:p>
+    <w:p>
+      <w:pPr>
+        <w:spacing w:after="80" w:before="0" w:line="240" w:lineRule="auto"/>
+        <w:ind w:left="425" w:hanging="425"/>
+        <w:jc w:val="left"/>
+      </w:pPr>
+      <w:r>
+        <w:rPr>
+          <w:rFonts w:ascii="Times New Roman" w:hAnsi="Times New Roman" w:eastAsia="Times New Roman"/>
+          <w:b w:val="0"/>
+          <w:i w:val="0"/>
+          <w:sz w:val="22"/>
+        </w:rPr>
+        <w:t>30. Chong SN, Law HF. Beware of Health Effects of Extremely Hot Weather. Hong Kong Observatory. December 2023. https://www.hko.gov.hk/en/education/weather/hot-and-cold-weather/00706-Beware-of-Health-Effects-of-Extremely-Hot-Weather.html</w:t>
+      </w:r>
+    </w:p>
+    <w:p>
+      <w:pPr>
+        <w:spacing w:after="80" w:before="0" w:line="240" w:lineRule="auto"/>
+        <w:ind w:left="425" w:hanging="425"/>
+        <w:jc w:val="left"/>
+      </w:pPr>
+      <w:r>
+        <w:rPr>
+          <w:rFonts w:ascii="Times New Roman" w:hAnsi="Times New Roman" w:eastAsia="Times New Roman"/>
+          <w:b w:val="0"/>
+          <w:i w:val="0"/>
+          <w:sz w:val="22"/>
+        </w:rPr>
+        <w:t>31. Hong Kong Observatory. Cold and Very Hot Weather Warnings. https://www.hko.gov.hk/en/wservice/warning/coldhot.htm</w:t>
+      </w:r>
+    </w:p>
+    <w:p>
+      <w:pPr>
+        <w:spacing w:after="80" w:before="0" w:line="240" w:lineRule="auto"/>
+        <w:ind w:left="425" w:hanging="425"/>
+        <w:jc w:val="left"/>
+      </w:pPr>
+      <w:r>
+        <w:rPr>
+          <w:rFonts w:ascii="Times New Roman" w:hAnsi="Times New Roman" w:eastAsia="Times New Roman"/>
+          <w:b w:val="0"/>
+          <w:i w:val="0"/>
+          <w:sz w:val="22"/>
+        </w:rPr>
+        <w:t>32. Centre for Health Protection. Beware of Heat Stroke. 11 August 2025. https://www.chp.gov.hk/en/static/90064.html</w:t>
+      </w:r>
+    </w:p>
+    <w:p>
+      <w:pPr>
+        <w:spacing w:after="80" w:before="0" w:line="240" w:lineRule="auto"/>
+        <w:ind w:left="425" w:hanging="425"/>
+        <w:jc w:val="left"/>
+      </w:pPr>
+      <w:r>
+        <w:rPr>
+          <w:rFonts w:ascii="Times New Roman" w:hAnsi="Times New Roman" w:eastAsia="Times New Roman"/>
+          <w:b w:val="0"/>
+          <w:i w:val="0"/>
+          <w:sz w:val="22"/>
+        </w:rPr>
+        <w:t>33. Home Affairs Department. Emergency Relief Services: temporary heat shelters. https://www.had.gov.hk/en/public_services/emergency_services/emergency.htm</w:t>
+      </w:r>
+    </w:p>
     <w:sectPr>
       <w:headerReference w:type="default" r:id="rId9"/>
       <w:pgSz w:w="11906" w:h="16838"/>
@@ -5700,7 +5924,7 @@
 
 <file path=word/comments.xml><?xml version="1.0" encoding="utf-8"?>
 <w:comments xmlns:a="http://schemas.openxmlformats.org/drawingml/2006/main" xmlns:pic="http://schemas.openxmlformats.org/drawingml/2006/picture" xmlns:r="http://schemas.openxmlformats.org/officeDocument/2006/relationships" xmlns:w="http://schemas.openxmlformats.org/wordprocessingml/2006/main" xmlns:wp="http://schemas.openxmlformats.org/drawingml/2006/wordprocessingDrawing" xmlns:mc="http://schemas.openxmlformats.org/markup-compatibility/2006" xmlns:a14="http://schemas.microsoft.com/office/drawing/2010/main" xmlns:w14="http://schemas.microsoft.com/office/word/2010/wordml" xmlns:wpc="http://schemas.microsoft.com/office/word/2010/wordprocessingCanvas">
-  <w:comment w:id="0" w:author="Bob Shen" w:initials="BS" w:date="2026-08-27T17:29:51Z">
+  <w:comment w:id="0" w:author="Bob Shen" w:initials="BS" w:date="2026-08-29T04:20:32Z">
     <w:p>
       <w:pPr>
         <w:pStyle w:val="CommentText"/>
@@ -5716,7 +5940,7 @@
       </w:r>
     </w:p>
   </w:comment>
-  <w:comment w:id="1" w:author="Bob Shen" w:initials="BS" w:date="2026-08-27T17:29:51Z">
+  <w:comment w:id="1" w:author="Bob Shen" w:initials="BS" w:date="2026-08-29T04:20:32Z">
     <w:p>
       <w:pPr>
         <w:pStyle w:val="CommentText"/>
@@ -5732,7 +5956,7 @@
       </w:r>
     </w:p>
   </w:comment>
-  <w:comment w:id="2" w:author="Bob Shen" w:initials="BS" w:date="2026-08-27T17:29:51Z">
+  <w:comment w:id="2" w:author="Bob Shen" w:initials="BS" w:date="2026-08-29T04:20:32Z">
     <w:p>
       <w:pPr>
         <w:pStyle w:val="CommentText"/>
@@ -5748,7 +5972,7 @@
       </w:r>
     </w:p>
   </w:comment>
-  <w:comment w:id="3" w:author="Bob Shen" w:initials="BS" w:date="2026-08-27T17:29:51Z">
+  <w:comment w:id="3" w:author="Bob Shen" w:initials="BS" w:date="2026-08-29T04:20:32Z">
     <w:p>
       <w:pPr>
         <w:pStyle w:val="CommentText"/>
@@ -5764,7 +5988,7 @@
       </w:r>
     </w:p>
   </w:comment>
-  <w:comment w:id="4" w:author="Bob Shen" w:initials="BS" w:date="2026-08-27T17:29:51Z">
+  <w:comment w:id="4" w:author="Bob Shen" w:initials="BS" w:date="2026-08-29T04:20:32Z">
     <w:p>
       <w:pPr>
         <w:pStyle w:val="CommentText"/>
@@ -5780,7 +6004,7 @@
       </w:r>
     </w:p>
   </w:comment>
-  <w:comment w:id="5" w:author="Bob Shen" w:initials="BS" w:date="2026-08-27T17:29:51Z">
+  <w:comment w:id="5" w:author="Bob Shen" w:initials="BS" w:date="2026-08-29T04:20:32Z">
     <w:p>
       <w:pPr>
         <w:pStyle w:val="CommentText"/>
@@ -5796,7 +6020,7 @@
       </w:r>
     </w:p>
   </w:comment>
-  <w:comment w:id="6" w:author="Bob Shen" w:initials="BS" w:date="2026-08-27T17:29:51Z">
+  <w:comment w:id="6" w:author="Bob Shen" w:initials="BS" w:date="2026-08-29T04:20:32Z">
     <w:p>
       <w:pPr>
         <w:pStyle w:val="CommentText"/>

</xml_diff>

<commit_message>
Rebuild the Hogan PDF after the two cold/HF clause corrections.
Print copy now matches the live Discussion: failing heart, not failing
left ventricle; this analysis, not this file. SHA prefix ee12629d2dd8b6bb.

Co-authored-by: Shen Ruililin <bobshenruililin@users.noreply.github.com>
</commit_message>
<xml_diff>
--- a/manuscript/live_collaborative/Heat_CVD_Manuscript_20260824_hogan.docx
+++ b/manuscript/live_collaborative/Heat_CVD_Manuscript_20260824_hogan.docx
@@ -5071,7 +5071,7 @@
           <w:i w:val="0"/>
           <w:sz w:val="24"/>
         </w:rPr>
-        <w:t>A corresponding hypothesis for HF is haemodynamic rather than nocturnal. Cold exposure can raise sympathetic outflow, peripheral resistance, and afterload; a failing left ventricle has little reserve against that load [27,28]. Goggins and Chan's daily Hong Kong HF series remains the local epidemiological neighbour, not a magnitude to import [21]. Influenza, indoor conditions, and care-seeking remain unseparated on a monthly grain [18]. The present counts do not measure afterload, blood pressure, or infection. The hypothesis is that official cold-day burden marks winters in which those loads are more frequent. A heat-only reading of this file would miss the more coherent residual.</w:t>
+        <w:t>A corresponding hypothesis for HF is haemodynamic rather than nocturnal. Cold exposure can raise sympathetic outflow, peripheral resistance, and afterload; a failing heart has little reserve against that load [27,28]. Goggins and Chan's daily Hong Kong HF series remains the local epidemiological neighbour, not a magnitude to import [21]. Influenza, indoor conditions, and care-seeking remain unseparated on a monthly grain [18]. The present counts do not measure afterload, blood pressure, or infection. The hypothesis is that official cold-day burden marks winters in which those loads are more frequent. A heat-only reading of this analysis would miss the more coherent residual.</w:t>
       </w:r>
     </w:p>
     <w:p>
@@ -5924,7 +5924,7 @@
 
 <file path=word/comments.xml><?xml version="1.0" encoding="utf-8"?>
 <w:comments xmlns:a="http://schemas.openxmlformats.org/drawingml/2006/main" xmlns:pic="http://schemas.openxmlformats.org/drawingml/2006/picture" xmlns:r="http://schemas.openxmlformats.org/officeDocument/2006/relationships" xmlns:w="http://schemas.openxmlformats.org/wordprocessingml/2006/main" xmlns:wp="http://schemas.openxmlformats.org/drawingml/2006/wordprocessingDrawing" xmlns:mc="http://schemas.openxmlformats.org/markup-compatibility/2006" xmlns:a14="http://schemas.microsoft.com/office/drawing/2010/main" xmlns:w14="http://schemas.microsoft.com/office/word/2010/wordml" xmlns:wpc="http://schemas.microsoft.com/office/word/2010/wordprocessingCanvas">
-  <w:comment w:id="0" w:author="Bob Shen" w:initials="BS" w:date="2026-08-29T04:20:32Z">
+  <w:comment w:id="0" w:author="Bob Shen" w:initials="BS" w:date="2026-08-29T04:45:47Z">
     <w:p>
       <w:pPr>
         <w:pStyle w:val="CommentText"/>
@@ -5940,7 +5940,7 @@
       </w:r>
     </w:p>
   </w:comment>
-  <w:comment w:id="1" w:author="Bob Shen" w:initials="BS" w:date="2026-08-29T04:20:32Z">
+  <w:comment w:id="1" w:author="Bob Shen" w:initials="BS" w:date="2026-08-29T04:45:47Z">
     <w:p>
       <w:pPr>
         <w:pStyle w:val="CommentText"/>
@@ -5956,7 +5956,7 @@
       </w:r>
     </w:p>
   </w:comment>
-  <w:comment w:id="2" w:author="Bob Shen" w:initials="BS" w:date="2026-08-29T04:20:32Z">
+  <w:comment w:id="2" w:author="Bob Shen" w:initials="BS" w:date="2026-08-29T04:45:47Z">
     <w:p>
       <w:pPr>
         <w:pStyle w:val="CommentText"/>
@@ -5972,7 +5972,7 @@
       </w:r>
     </w:p>
   </w:comment>
-  <w:comment w:id="3" w:author="Bob Shen" w:initials="BS" w:date="2026-08-29T04:20:32Z">
+  <w:comment w:id="3" w:author="Bob Shen" w:initials="BS" w:date="2026-08-29T04:45:47Z">
     <w:p>
       <w:pPr>
         <w:pStyle w:val="CommentText"/>
@@ -5988,7 +5988,7 @@
       </w:r>
     </w:p>
   </w:comment>
-  <w:comment w:id="4" w:author="Bob Shen" w:initials="BS" w:date="2026-08-29T04:20:32Z">
+  <w:comment w:id="4" w:author="Bob Shen" w:initials="BS" w:date="2026-08-29T04:45:47Z">
     <w:p>
       <w:pPr>
         <w:pStyle w:val="CommentText"/>
@@ -6004,7 +6004,7 @@
       </w:r>
     </w:p>
   </w:comment>
-  <w:comment w:id="5" w:author="Bob Shen" w:initials="BS" w:date="2026-08-29T04:20:32Z">
+  <w:comment w:id="5" w:author="Bob Shen" w:initials="BS" w:date="2026-08-29T04:45:47Z">
     <w:p>
       <w:pPr>
         <w:pStyle w:val="CommentText"/>
@@ -6020,7 +6020,7 @@
       </w:r>
     </w:p>
   </w:comment>
-  <w:comment w:id="6" w:author="Bob Shen" w:initials="BS" w:date="2026-08-29T04:20:32Z">
+  <w:comment w:id="6" w:author="Bob Shen" w:initials="BS" w:date="2026-08-29T04:45:47Z">
     <w:p>
       <w:pPr>
         <w:pStyle w:val="CommentText"/>

</xml_diff>

<commit_message>
Cut the physiology and HHAP insert after an independent WORSE verdict.
Three inherit auditors scored the long Discussion against the shorter Hogan
stop as worse or mixed. Keep short hypotheses and an instruments-only map.
Do not close Gate 3 and do not invent Model 2/3 coefficients.

Co-authored-by: Shen Ruililin <bobshenruililin@users.noreply.github.com>
</commit_message>
<xml_diff>
--- a/manuscript/live_collaborative/Heat_CVD_Manuscript_20260824_hogan.docx
+++ b/manuscript/live_collaborative/Heat_CVD_Manuscript_20260824_hogan.docx
@@ -5055,7 +5055,7 @@
           <w:i w:val="0"/>
           <w:sz w:val="24"/>
         </w:rPr>
-        <w:t>Candidate mechanisms for a night residual sit outside this design. Ambient heat is associated with shorter and more fragmented sleep [23]. In a ten-day confinement study of seven young men, three nights at 26.3 °C left nocturnal core temperature 0.2 °C higher during and after those nights than before them, and total sleep time fell with overnight core temperature [24]. In 47 adults aged 65 years or older, bedroom temperatures above 24 °C were associated with lower heart-rate variability [25]. Those studies do not measure first CHD hospitalisation in Hong Kong, and they do not measure indoor temperature in this series. A scoping review found only three studies that linked extreme heat, sleep, and cardiovascular measures; blood-pressure findings were mixed, and none demonstrated sleep as a mediator of hospitalisation [26]. Guo et al. already showed that an official hot-night flag can be null after mean temperature while hourly nighttime excess heat is not [17]. The physiological claim is therefore a hypothesis: nights may matter for CHD because overnight recovery of core temperature, sleep, and autonomic tone can fail, whereas a monthly very-hot-day count does not encode that failure. This panel does not identify that pathway.</w:t>
+        <w:t>Candidate mechanisms for a night residual sit outside this design. Ambient heat is associated with shorter and more fragmented sleep [23]. A confinement study of seven men reported higher nocturnal core temperature after hot nights [24]. Bedroom temperatures above 24 °C were associated with lower heart-rate variability in older adults [25]. Those studies do not measure first CHD hospitalisation in Hong Kong, and they do not measure indoor temperature in this series. A scoping review of extreme heat, sleep, and cardiovascular measures found mixed blood-pressure findings and no demonstration of sleep as a mediator of hospitalisation [26]. The hypothesis is that a hot-night count can differ from monthly mean temperature because overnight recovery can fail. This panel does not identify that pathway.</w:t>
       </w:r>
     </w:p>
     <w:p>
@@ -5071,7 +5071,7 @@
           <w:i w:val="0"/>
           <w:sz w:val="24"/>
         </w:rPr>
-        <w:t>A corresponding hypothesis for HF is haemodynamic rather than nocturnal. Cold exposure can raise sympathetic outflow, peripheral resistance, and afterload; a failing heart has little reserve against that load [27,28]. Goggins and Chan's daily Hong Kong HF series remains the local epidemiological neighbour, not a magnitude to import [21]. Influenza, indoor conditions, and care-seeking remain unseparated on a monthly grain [18]. The present counts do not measure afterload, blood pressure, or infection. The hypothesis is that official cold-day burden marks winters in which those loads are more frequent. A heat-only reading of this analysis would miss the more coherent residual.</w:t>
+        <w:t>A corresponding hypothesis for HF is haemodynamic rather than nocturnal. Cold exposure can raise afterload; a failing heart has little reserve against that load [27,28]. Goggins and Chan's daily Hong Kong HF series remains the local epidemiological neighbour, not a magnitude to import [21]. The present counts do not measure afterload, blood pressure, or infection. A heat-only reading of this analysis would miss the more coherent residual.</w:t>
       </w:r>
     </w:p>
     <w:p>
@@ -5087,7 +5087,7 @@
           <w:i w:val="0"/>
           <w:sz w:val="24"/>
         </w:rPr>
-        <w:t>The World Health Organization's 2026 heat-health action-plan guidance organises response around eight core elements: governance; a heat-health warning system; populations at increased risk; communication; health-system resilience; reducing heat exposure; heat-health surveillance; and monitoring, evaluation and learning [29]. Hong Kong already operates a warning, communication, and shelter bundle rather than a single named municipal plan evaluated here. The Observatory issues a Very Hot Weather Warning, a Hot Weather Special Advisory, and, when that warning is in force, a Prolonged Heat Special Alert for a few days of very hot days or hot nights, together with an Extremely Hot Weather Special Alert near 35 °C and the Hong Kong Heat Index [30,31]. The Department of Health already names people with heart disease or high blood pressure among those at increased heat-stroke risk and advises indoor ventilation or air-conditioning [32]. The Home Affairs Department opens temporary heat shelters, and a separate Cold Weather Warning covers winter [31,33]. This panel can inform four of those elements and cannot evaluate any of them. The CHD residual, such as it is, sits with official hot-night counts rather than very-hot-day counts. The Prolonged Heat Special Alert already names hot nights beside very hot days (elements 2 and 4). That overlap is a mapping, not a test of the alert. The named at-risk group already includes this cohort's diagnoses (element 3). Indoor night temperature is the exposure-reduction hypothesis that the sleep and autonomic studies point to, not a consecutive-day trigger, and it was not measured here (element 6). A heat-only plan would omit the stronger HF cold-day residual, which sits with the Cold Weather Warning rather than with summer heat guidance. The estimates do not set a five-day trigger, do not count admissions averted, and do not say whether existing warnings work.</w:t>
+        <w:t>Hong Kong already issues a Very Hot Weather Warning and a separate Cold Weather Warning [30,31,33]. The World Health Organization's 2026 heat-health action-plan guidance lists eight core elements: governance; a heat-health warning system; populations at increased risk; communication; health-system resilience; reducing heat exposure; heat-health surveillance; and monitoring, evaluation and learning [29]. The Observatory's Prolonged Heat Special Alert already names hot nights beside very hot days [30,31]. The Department of Health already names people with heart disease or high blood pressure [32]. Those overlaps are a mapping of published elements onto existing instruments. They are not a test of any alert, and they do not use the Model 1 residuals as evidence that the instruments work. The estimates do not set a five-day trigger, do not count admissions averted, and do not say whether existing warnings work.</w:t>
       </w:r>
     </w:p>
     <w:p>
@@ -5924,7 +5924,7 @@
 
 <file path=word/comments.xml><?xml version="1.0" encoding="utf-8"?>
 <w:comments xmlns:a="http://schemas.openxmlformats.org/drawingml/2006/main" xmlns:pic="http://schemas.openxmlformats.org/drawingml/2006/picture" xmlns:r="http://schemas.openxmlformats.org/officeDocument/2006/relationships" xmlns:w="http://schemas.openxmlformats.org/wordprocessingml/2006/main" xmlns:wp="http://schemas.openxmlformats.org/drawingml/2006/wordprocessingDrawing" xmlns:mc="http://schemas.openxmlformats.org/markup-compatibility/2006" xmlns:a14="http://schemas.microsoft.com/office/drawing/2010/main" xmlns:w14="http://schemas.microsoft.com/office/word/2010/wordml" xmlns:wpc="http://schemas.microsoft.com/office/word/2010/wordprocessingCanvas">
-  <w:comment w:id="0" w:author="Bob Shen" w:initials="BS" w:date="2026-08-29T04:45:47Z">
+  <w:comment w:id="0" w:author="Bob Shen" w:initials="BS" w:date="2026-08-29T09:40:07Z">
     <w:p>
       <w:pPr>
         <w:pStyle w:val="CommentText"/>
@@ -5940,7 +5940,7 @@
       </w:r>
     </w:p>
   </w:comment>
-  <w:comment w:id="1" w:author="Bob Shen" w:initials="BS" w:date="2026-08-29T04:45:47Z">
+  <w:comment w:id="1" w:author="Bob Shen" w:initials="BS" w:date="2026-08-29T09:40:07Z">
     <w:p>
       <w:pPr>
         <w:pStyle w:val="CommentText"/>
@@ -5956,7 +5956,7 @@
       </w:r>
     </w:p>
   </w:comment>
-  <w:comment w:id="2" w:author="Bob Shen" w:initials="BS" w:date="2026-08-29T04:45:47Z">
+  <w:comment w:id="2" w:author="Bob Shen" w:initials="BS" w:date="2026-08-29T09:40:07Z">
     <w:p>
       <w:pPr>
         <w:pStyle w:val="CommentText"/>
@@ -5972,7 +5972,7 @@
       </w:r>
     </w:p>
   </w:comment>
-  <w:comment w:id="3" w:author="Bob Shen" w:initials="BS" w:date="2026-08-29T04:45:47Z">
+  <w:comment w:id="3" w:author="Bob Shen" w:initials="BS" w:date="2026-08-29T09:40:07Z">
     <w:p>
       <w:pPr>
         <w:pStyle w:val="CommentText"/>
@@ -5988,7 +5988,7 @@
       </w:r>
     </w:p>
   </w:comment>
-  <w:comment w:id="4" w:author="Bob Shen" w:initials="BS" w:date="2026-08-29T04:45:47Z">
+  <w:comment w:id="4" w:author="Bob Shen" w:initials="BS" w:date="2026-08-29T09:40:07Z">
     <w:p>
       <w:pPr>
         <w:pStyle w:val="CommentText"/>
@@ -6004,7 +6004,7 @@
       </w:r>
     </w:p>
   </w:comment>
-  <w:comment w:id="5" w:author="Bob Shen" w:initials="BS" w:date="2026-08-29T04:45:47Z">
+  <w:comment w:id="5" w:author="Bob Shen" w:initials="BS" w:date="2026-08-29T09:40:07Z">
     <w:p>
       <w:pPr>
         <w:pStyle w:val="CommentText"/>
@@ -6020,7 +6020,7 @@
       </w:r>
     </w:p>
   </w:comment>
-  <w:comment w:id="6" w:author="Bob Shen" w:initials="BS" w:date="2026-08-29T04:45:47Z">
+  <w:comment w:id="6" w:author="Bob Shen" w:initials="BS" w:date="2026-08-29T09:40:07Z">
     <w:p>
       <w:pPr>
         <w:pStyle w:val="CommentText"/>

</xml_diff>

<commit_message>
Make Hogan Word and PDF exceed the 24 August snapshot.
Rebuild the attachable files so tables and figures stay on their own pages, Discussion is complete through the WHO/HK mapping, and Word comments no longer tell Hogan to paste Model 2. Locked Model 1 numbers and Hogan weather sentences are unchanged. Gate 3 stays open.

Co-authored-by: Shen Ruililin <bobshenruililin@users.noreply.github.com>
</commit_message>
<xml_diff>
--- a/manuscript/live_collaborative/Heat_CVD_Manuscript_20260824_hogan.docx
+++ b/manuscript/live_collaborative/Heat_CVD_Manuscript_20260824_hogan.docx
@@ -4848,7 +4848,24 @@
           <w:i w:val="0"/>
           <w:sz w:val="24"/>
         </w:rPr>
-        <w:t>Offset choice changed the Model 1 count ratios only trivially. Across trend, window, and COVID-phase specifications, the CHD hot-night ratio ranged from 1.011 to 1.025, and the HF cold-day ratio from 1.043 to 1.113 (Figure 3). The HF cold-day association was strongest before 2020 (1.113, 1.053–1.176). The CHD hot-night association was weaker and compatible with 1 in the pre-2020 window (1.011, 0.991–1.032) and under COVID-phase adjustment (1.013, 0.994–1.033). Figure 3 shows the three official day counts for each outcome under nine trend, window, and COVID-period specifications. For CHD hot nights, the 6-df and 8-df intervals exclude 1 (1.024, 1.005–1.044; 1.023, 1.005–1.042). The 3-df interval includes 1 (1.011, 0.990–1.032). The year-indicator interval has the highest point estimate of the trend checks and includes 1 (1.025, 0.9998–1.050). No trend specification is preferred over the 4-df spline in Model 1. Among specifications more flexible than Model 1, only the 6-df spline keeps both residual intervals away from 1. For HF cold days, the 8-df interval includes 1 (1.062, 0.994–1.135). The pre-2020 window moved more than those two contrasts: nine of the twelve Newey–West lag-6 intervals excluded 1 in that 84-month window, including inverse associations for all six continuous temperature contrasts (Supplementary Figure S6; Supplementary Table S2). No multiplicity control was computed within that window, and no pre-2020 estimate is promoted beyond a sensitivity. The decline in first events and the rise in hot nights are both strong trends across this window, and the same 4-df spline absorbs both. Lag-1 month models attenuated the CHD hot-night association toward 1 (1.010, 0.979–1.042). The HF cold-day association remained elevated at lag 1 (1.073, 1.014–1.135) and was weaker at lag 2 (1.053, 0.985–1.127). Lag-one month is a labelled sensitivity, and it is not a daily lag curve. The months with largest Cook’s distance were February 2020 for CHD and February 2022 for HF cold days. Excluding the most influential month left both exploratory directions unchanged (CHD hot nights 1.021, 1.001–1.040; HF cold days 1.088, 1.034–1.144).</w:t>
+        <w:t>Offset choice changed the Model 1 count ratios only trivially. Across trend, window, and COVID-phase specifications, the CHD hot-night ratio ranged from 1.011 to 1.025, and the HF cold-day ratio from 1.043 to 1.113 (Figure 3). The HF cold-day association was strongest before 2020 (1.113, 1.053–1.176). The CHD hot-night association was weaker and compatible with 1 in the pre-2020 window (1.011, 0.991–1.032) and under COVID-phase adjustment (1.013, 0.994–1.033). Figure 3 shows the three official day counts for each outcome under nine trend, window, and COVID-period specifications. For CHD hot nights, the 6-df and 8-df intervals exclude 1 (1.024, 1.005–1.044; 1.023, 1.005–1.042). The 3-df interval includes 1 (1.011, 0.990–1.032). The year-indicator interval has the highest point estimate of the trend checks and includes 1 (1.025, 0.9998–1.050). No trend specification is preferred over the 4-df spline in Model 1. Among specifications more flexible than Model 1, only the 6-df spline keeps both residual intervals away from 1. For HF cold days, the 8-df interval includes 1 (1.062, 0.994–1.135).</w:t>
+      </w:r>
+    </w:p>
+    <w:p>
+      <w:pPr>
+        <w:pageBreakBefore/>
+        <w:spacing w:after="160" w:before="0" w:line="240" w:lineRule="auto"/>
+        <w:ind w:firstLine="720"/>
+        <w:jc w:val="both"/>
+      </w:pPr>
+      <w:r>
+        <w:rPr>
+          <w:rFonts w:ascii="Times New Roman" w:hAnsi="Times New Roman" w:eastAsia="Times New Roman"/>
+          <w:b w:val="0"/>
+          <w:i w:val="0"/>
+          <w:sz w:val="24"/>
+        </w:rPr>
+        <w:t>The pre-2020 window moved more than those two contrasts: nine of the twelve Newey–West lag-6 intervals excluded 1 in that 84-month window, including inverse associations for all six continuous temperature contrasts (Supplementary Figure S6; Supplementary Table S2). No multiplicity control was computed within that window, and no pre-2020 estimate is promoted beyond a sensitivity. The decline in first events and the rise in hot nights are both strong trends across this window, and the same 4-df spline absorbs both. Lag-1 month models attenuated the CHD hot-night association toward 1 (1.010, 0.979–1.042). The HF cold-day association remained elevated at lag 1 (1.073, 1.014–1.135) and was weaker at lag 2 (1.053, 0.985–1.127). Lag-one month is a labelled sensitivity, and it is not a daily lag curve. The months with largest Cook’s distance were February 2020 for CHD and February 2022 for HF cold days. Excluding the most influential month left both exploratory directions unchanged (CHD hot nights 1.021, 1.001–1.040; HF cold days 1.088, 1.034–1.144). The simulated daily-recovery method failed its worst-cell criteria: null Type I error ranged from 0.048 to 0.150, minimum coverage was 0.840, maximum non-null relative bias was 32.8, and the maximum moderate false-sign rate was 0.808 (Supplementary Table S8). No real daily coefficient is reported. That refusal is specific to this monthly series and this implementation.</w:t>
       </w:r>
     </w:p>
     <w:p>
@@ -4863,7 +4880,7 @@
       <w:r>
         <w:drawing>
           <wp:inline xmlns:a="http://schemas.openxmlformats.org/drawingml/2006/main" xmlns:pic="http://schemas.openxmlformats.org/drawingml/2006/picture">
-            <wp:extent cx="5669280" cy="6720840"/>
+            <wp:extent cx="4627983" cy="5486399"/>
             <wp:docPr id="3" name="Picture 3"/>
             <wp:cNvGraphicFramePr>
               <a:graphicFrameLocks noChangeAspect="1"/>
@@ -4884,7 +4901,7 @@
                   <pic:spPr>
                     <a:xfrm>
                       <a:off x="0" y="0"/>
-                      <a:ext cx="5669280" cy="6720840"/>
+                      <a:ext cx="4627983" cy="5486399"/>
                     </a:xfrm>
                     <a:prstGeom prst="rect"/>
                   </pic:spPr>
@@ -4911,22 +4928,6 @@
           <w:sz w:val="22"/>
         </w:rPr>
         <w:t>Figure 3. Model 1 count ratios for official day counts across time-trend, window, and COVID-period specifications (Newey–West lag-6 intervals). The exposure is the monthly official day count divided by five, so each estimate is the count ratio per five additional such days in that month. Rows labelled 3, 6, or 8 df replace the 4-df time-trend spline of Model 1. Neither the five-day scale nor the spline degrees of freedom refers to consecutive days. Pre-2020 is January 2013–December 2019 (84 months). Continuous-temperature fits for the same specifications are shown in Supplementary Figure S6.</w:t>
-      </w:r>
-    </w:p>
-    <w:p>
-      <w:pPr>
-        <w:spacing w:after="160" w:before="0" w:line="240" w:lineRule="auto"/>
-        <w:ind w:firstLine="720"/>
-        <w:jc w:val="both"/>
-      </w:pPr>
-      <w:r>
-        <w:rPr>
-          <w:rFonts w:ascii="Times New Roman" w:hAnsi="Times New Roman" w:eastAsia="Times New Roman"/>
-          <w:b w:val="0"/>
-          <w:i w:val="0"/>
-          <w:sz w:val="24"/>
-        </w:rPr>
-        <w:t>The simulated daily-recovery method failed its worst-cell criteria: null Type I error ranged from 0.048 to 0.150, minimum coverage was 0.840, maximum non-null relative bias was 32.8, and the maximum moderate false-sign rate was 0.808 (Supplementary Table S8). No real daily coefficient is reported. That refusal is specific to this monthly series and this implementation.</w:t>
       </w:r>
     </w:p>
     <w:p>
@@ -5140,8 +5141,7 @@
     </w:p>
     <w:p>
       <w:pPr>
-        <w:pageBreakBefore/>
-        <w:spacing w:after="120" w:before="0" w:line="240" w:lineRule="auto"/>
+        <w:spacing w:after="120" w:before="240" w:line="240" w:lineRule="auto"/>
         <w:ind w:firstLine="0"/>
         <w:jc w:val="left"/>
       </w:pPr>
@@ -5924,7 +5924,7 @@
 
 <file path=word/comments.xml><?xml version="1.0" encoding="utf-8"?>
 <w:comments xmlns:a="http://schemas.openxmlformats.org/drawingml/2006/main" xmlns:pic="http://schemas.openxmlformats.org/drawingml/2006/picture" xmlns:r="http://schemas.openxmlformats.org/officeDocument/2006/relationships" xmlns:w="http://schemas.openxmlformats.org/wordprocessingml/2006/main" xmlns:wp="http://schemas.openxmlformats.org/drawingml/2006/wordprocessingDrawing" xmlns:mc="http://schemas.openxmlformats.org/markup-compatibility/2006" xmlns:a14="http://schemas.microsoft.com/office/drawing/2010/main" xmlns:w14="http://schemas.microsoft.com/office/word/2010/wordml" xmlns:wpc="http://schemas.microsoft.com/office/word/2010/wordprocessingCanvas">
-  <w:comment w:id="0" w:author="Bob Shen" w:initials="BS" w:date="2026-08-29T09:40:07Z">
+  <w:comment w:id="0" w:author="Bob Shen" w:initials="BS" w:date="2026-08-31T10:59:38Z">
     <w:p>
       <w:pPr>
         <w:pStyle w:val="CommentText"/>
@@ -5940,7 +5940,7 @@
       </w:r>
     </w:p>
   </w:comment>
-  <w:comment w:id="1" w:author="Bob Shen" w:initials="BS" w:date="2026-08-29T09:40:07Z">
+  <w:comment w:id="1" w:author="Bob Shen" w:initials="BS" w:date="2026-08-31T10:59:38Z">
     <w:p>
       <w:pPr>
         <w:pStyle w:val="CommentText"/>
@@ -5956,7 +5956,7 @@
       </w:r>
     </w:p>
   </w:comment>
-  <w:comment w:id="2" w:author="Bob Shen" w:initials="BS" w:date="2026-08-29T09:40:07Z">
+  <w:comment w:id="2" w:author="Bob Shen" w:initials="BS" w:date="2026-08-31T10:59:38Z">
     <w:p>
       <w:pPr>
         <w:pStyle w:val="CommentText"/>
@@ -5972,7 +5972,7 @@
       </w:r>
     </w:p>
   </w:comment>
-  <w:comment w:id="3" w:author="Bob Shen" w:initials="BS" w:date="2026-08-29T09:40:07Z">
+  <w:comment w:id="3" w:author="Bob Shen" w:initials="BS" w:date="2026-08-31T10:59:38Z">
     <w:p>
       <w:pPr>
         <w:pStyle w:val="CommentText"/>
@@ -5988,7 +5988,7 @@
       </w:r>
     </w:p>
   </w:comment>
-  <w:comment w:id="4" w:author="Bob Shen" w:initials="BS" w:date="2026-08-29T09:40:07Z">
+  <w:comment w:id="4" w:author="Bob Shen" w:initials="BS" w:date="2026-08-31T10:59:38Z">
     <w:p>
       <w:pPr>
         <w:pStyle w:val="CommentText"/>
@@ -6000,11 +6000,11 @@
         <w:annotationRef/>
       </w:r>
       <w:r>
-        <w:t>Your averaging sentence is left verbatim. In our pipeline, rainfall is a monthly total (mm), official extreme days are counts, and humidity is a monthly mean. We have not overwritten the sentence.</w:t>
+        <w:t>Your averaging sentence is left verbatim. Rainfall is a monthly total (mm), official extreme days are counts, and humidity is a monthly mean. The sentence was not overwritten.</w:t>
       </w:r>
     </w:p>
   </w:comment>
-  <w:comment w:id="5" w:author="Bob Shen" w:initials="BS" w:date="2026-08-29T09:40:07Z">
+  <w:comment w:id="5" w:author="Bob Shen" w:initials="BS" w:date="2026-08-31T10:59:38Z">
     <w:p>
       <w:pPr>
         <w:pStyle w:val="CommentText"/>
@@ -6016,11 +6016,11 @@
         <w:annotationRef/>
       </w:r>
       <w:r>
-        <w:t>Model 2 is specified here and has not been fitted on the governed panel. Table 2 remains Model 1. Do not type Model 2 coefficients by hand.</w:t>
+        <w:t>Model 2 is specified here and has not been fitted on the Hospital Authority monthly counts in this file. Table 2 remains Model 1. Do not type Model 2 coefficients by hand.</w:t>
       </w:r>
     </w:p>
   </w:comment>
-  <w:comment w:id="6" w:author="Bob Shen" w:initials="BS" w:date="2026-08-29T09:40:07Z">
+  <w:comment w:id="6" w:author="Bob Shen" w:initials="BS" w:date="2026-08-31T10:59:38Z">
     <w:p>
       <w:pPr>
         <w:pStyle w:val="CommentText"/>
@@ -6032,7 +6032,7 @@
         <w:annotationRef/>
       </w:r>
       <w:r>
-        <w:t>Table 2 reports Model 1 (thermal variables only; no monthly rainfall or humidity). Model 2 adds those two covariates and is specified in Methods. On a machine with the governed panel, run Rscript scripts/53_hogan_models_rh_rain.R and paste Model 2 beside or after Table 2. No new coefficients have been typed by hand. Model 3 (climatology day counts) is also specified and not fitted here.</w:t>
+        <w:t>Table 2 reports Model 1 (thermal variables only; no monthly rainfall or humidity). Model 2 adds those two covariates and is specified in Methods. Model 2 has not been fitted in this file; no coefficients have been typed by hand. Model 3 (climatology day counts) is also specified and not fitted here.</w:t>
       </w:r>
     </w:p>
   </w:comment>

</xml_diff>

<commit_message>
Restore Supplementary Table S9 in the live identification article.
The 29 August Discussion cut dropped the archive-pollution display string
while the claim ledger still required it. Point the live file and Hogan
print at the existing P11 table, rebuild Word+PDF, and re-run the auditor
to 161/0. Locked Model 1 numbers and Hogan weather sentences are unchanged.
Gate 3 remains open.

Co-authored-by: Shen Ruililin <bobshenruililin@users.noreply.github.com>
</commit_message>
<xml_diff>
--- a/manuscript/live_collaborative/Heat_CVD_Manuscript_20260824_hogan.docx
+++ b/manuscript/live_collaborative/Heat_CVD_Manuscript_20260824_hogan.docx
@@ -5120,7 +5120,7 @@
           <w:i w:val="0"/>
           <w:sz w:val="24"/>
         </w:rPr>
-        <w:t>Pollution and influenza remain scientifically motivated in this setting [1,18]. Models that entered nitrogen dioxide or fine particulate matter are sensitivities, not replacements for Model 1. On a monthly grain they cannot separate confounding from mediation for ozone. On the 121 months with influenza data, an archive model associated higher influenza activity with higher CHD counts (Supplementary Table S7); that model is not an adjusted version of Model 1. Confounding by infection or ozone is therefore unresolved. Absent cohort person-time, even a stable count ratio remains a count ratio [14].</w:t>
+        <w:t>Pollution and influenza remain scientifically motivated in this setting [1,18]. Models that entered nitrogen dioxide or fine particulate matter are sensitivities, not replacements for Model 1 (Supplementary Table S9). Those archive fits entered maximum and minimum temperature jointly and used a general-population offset, so they are not adjusted versions of Model 1. On a monthly grain they cannot separate confounding from mediation for ozone. On the 121 months with influenza data, an archive model associated higher influenza activity with higher CHD counts (Supplementary Table S7); that model is not an adjusted version of Model 1. Confounding by infection or ozone is therefore unresolved. Absent cohort person-time, even a stable count ratio remains a count ratio [14].</w:t>
       </w:r>
     </w:p>
     <w:p>
@@ -5924,7 +5924,7 @@
 
 <file path=word/comments.xml><?xml version="1.0" encoding="utf-8"?>
 <w:comments xmlns:a="http://schemas.openxmlformats.org/drawingml/2006/main" xmlns:pic="http://schemas.openxmlformats.org/drawingml/2006/picture" xmlns:r="http://schemas.openxmlformats.org/officeDocument/2006/relationships" xmlns:w="http://schemas.openxmlformats.org/wordprocessingml/2006/main" xmlns:wp="http://schemas.openxmlformats.org/drawingml/2006/wordprocessingDrawing" xmlns:mc="http://schemas.openxmlformats.org/markup-compatibility/2006" xmlns:a14="http://schemas.microsoft.com/office/drawing/2010/main" xmlns:w14="http://schemas.microsoft.com/office/word/2010/wordml" xmlns:wpc="http://schemas.microsoft.com/office/word/2010/wordprocessingCanvas">
-  <w:comment w:id="0" w:author="Bob Shen" w:initials="BS" w:date="2026-08-31T10:59:38Z">
+  <w:comment w:id="0" w:author="Bob Shen" w:initials="BS" w:date="2026-09-02T09:32:32Z">
     <w:p>
       <w:pPr>
         <w:pStyle w:val="CommentText"/>
@@ -5940,7 +5940,7 @@
       </w:r>
     </w:p>
   </w:comment>
-  <w:comment w:id="1" w:author="Bob Shen" w:initials="BS" w:date="2026-08-31T10:59:38Z">
+  <w:comment w:id="1" w:author="Bob Shen" w:initials="BS" w:date="2026-09-02T09:32:32Z">
     <w:p>
       <w:pPr>
         <w:pStyle w:val="CommentText"/>
@@ -5956,7 +5956,7 @@
       </w:r>
     </w:p>
   </w:comment>
-  <w:comment w:id="2" w:author="Bob Shen" w:initials="BS" w:date="2026-08-31T10:59:38Z">
+  <w:comment w:id="2" w:author="Bob Shen" w:initials="BS" w:date="2026-09-02T09:32:32Z">
     <w:p>
       <w:pPr>
         <w:pStyle w:val="CommentText"/>
@@ -5972,7 +5972,7 @@
       </w:r>
     </w:p>
   </w:comment>
-  <w:comment w:id="3" w:author="Bob Shen" w:initials="BS" w:date="2026-08-31T10:59:38Z">
+  <w:comment w:id="3" w:author="Bob Shen" w:initials="BS" w:date="2026-09-02T09:32:32Z">
     <w:p>
       <w:pPr>
         <w:pStyle w:val="CommentText"/>
@@ -5988,7 +5988,7 @@
       </w:r>
     </w:p>
   </w:comment>
-  <w:comment w:id="4" w:author="Bob Shen" w:initials="BS" w:date="2026-08-31T10:59:38Z">
+  <w:comment w:id="4" w:author="Bob Shen" w:initials="BS" w:date="2026-09-02T09:32:32Z">
     <w:p>
       <w:pPr>
         <w:pStyle w:val="CommentText"/>
@@ -6004,7 +6004,7 @@
       </w:r>
     </w:p>
   </w:comment>
-  <w:comment w:id="5" w:author="Bob Shen" w:initials="BS" w:date="2026-08-31T10:59:38Z">
+  <w:comment w:id="5" w:author="Bob Shen" w:initials="BS" w:date="2026-09-02T09:32:32Z">
     <w:p>
       <w:pPr>
         <w:pStyle w:val="CommentText"/>
@@ -6020,7 +6020,7 @@
       </w:r>
     </w:p>
   </w:comment>
-  <w:comment w:id="6" w:author="Bob Shen" w:initials="BS" w:date="2026-08-31T10:59:38Z">
+  <w:comment w:id="6" w:author="Bob Shen" w:initials="BS" w:date="2026-09-02T09:32:32Z">
     <w:p>
       <w:pPr>
         <w:pStyle w:val="CommentText"/>

</xml_diff>